<commit_message>
srcEarth: test C6 (grisless and mesh) passes
</commit_message>
<xml_diff>
--- a/srcEarth/test/validation.docx
+++ b/srcEarth/test/validation.docx
@@ -2102,10 +2102,7 @@
     <w:p>
       <w:pPr/>
       <w:r>
-        <w:rPr>
-          <w:i w:val="0"/>
-        </w:rPr>
-        <w:t>C6 validates the complete gridless vertical-cutoff workflow against published tables of effective geomagnetic cutoff rigidity. It tests the IGRF-only field, epoch selection, WGS-84 geodetic shell construction, GEO/ITRF93-to-GSM coordinate transformation, reverse-trajectory conventions, penumbra scanning, and pointwise comparison with independent reference calculations.</w:t>
+        <w:t>C6 validates both AMPS field-evaluation paths against published tables of effective geomagnetic cutoff rigidity. The GRIDLESS branch evaluates IGRF directly at each trajectory sample. The GRIDDED branch initializes the same IGRF epoch on the standalone Mode3D AMR mesh and follows trajectories through the production mesh interpolation stencil. Both branches test epoch selection, WGS-84 geodetic shell construction, GEO/ITRF93-to-GSM coordinate transformation, reverse-trajectory conventions, complete penumbra scanning, and pointwise comparison with independent reference calculations.</w:t>
       </w:r>
     </w:p>
     <w:p>
@@ -2117,7 +2114,7 @@
         <w:t xml:space="preserve">Implementation status: </w:t>
       </w:r>
       <w:r>
-        <w:t>Implemented. The executable runner is srcEarth/test/C6/run_C6.py and contains three independently selectable subtests: INITIAL, COMPLETE, and MODERN.</w:t>
+        <w:t>Implemented. The executable runner is srcEarth/test/C6/run_C6.py. It contains three independently selectable reference subtests (INITIAL, COMPLETE, and MODERN) and three solver selections: GRIDLESS, GRIDDED, and BOTH. GRIDLESS preserves the original direct-field C6; GRIDDED executes Mode3D with -mode3d-field-eval MESH; BOTH runs the same reference case through both paths in separate directories.</w:t>
       </w:r>
     </w:p>
     <w:p>
@@ -2135,14 +2132,17 @@
       <w:r>
         <w:rPr>
           <w:rFonts w:ascii="Courier New" w:hAnsi="Courier New"/>
-          <w:i w:val="0"/>
           <w:sz w:val="16"/>
         </w:rPr>
         <w:t>#CALCULATION_MODE</w:t>
         <w:br/>
         <w:t>CALC_TARGET                 CUTOFF_RIGIDITY</w:t>
         <w:br/>
-        <w:t>FIELD_EVAL_METHOD           GRIDLESS</w:t>
+        <w:t>FIELD_EVAL_METHOD           GRIDLESS        # GRIDLESS solver</w:t>
+        <w:br/>
+        <w:t># or</w:t>
+        <w:br/>
+        <w:t>FIELD_EVAL_METHOD           GRID_3D         # GRIDDED Mode3D solver</w:t>
         <w:br/>
         <w:br/>
         <w:t>#CUTOFF_RIGIDITY</w:t>
@@ -2167,6 +2167,17 @@
         <w:t>FIELD_MODEL                 IGRF</w:t>
         <w:br/>
         <w:t>EPOCH                       &lt;reference-year&gt;-01-01T00:00:00</w:t>
+        <w:br/>
+        <w:br/>
+        <w:t>#MODE3D_MESH                # GRIDDED solver only</w:t>
+        <w:br/>
+        <w:t>MODE3D_MESH_RES_EARTH_RE     0.02</w:t>
+        <w:br/>
+        <w:t>MODE3D_MESH_RES_BOUNDARY_RE  2.0</w:t>
+        <w:br/>
+        <w:t>MODE3D_MESH_COARSENING       LOG</w:t>
+        <w:br/>
+        <w:t>MODE3D_MESH_EXPONENT         1.0</w:t>
         <w:br/>
         <w:br/>
         <w:t>#OUTPUT_DOMAIN</w:t>
@@ -2377,10 +2388,7 @@
     <w:p>
       <w:pPr/>
       <w:r>
-        <w:rPr>
-          <w:i w:val="0"/>
-        </w:rPr>
-        <w:t>Each case follows the reference latitude/longitude grid at 20 km geodetic altitude. Geographic WGS-84 positions and local ellipsoid-normal vertical directions are transformed to GSM at the selected epoch. No T96, T01, T05, TA15, or TA16 external field is added.</w:t>
+        <w:t>Each case follows the reference latitude/longitude grid at 20 km geodetic altitude. Geographic WGS-84 positions and local ellipsoid-normal vertical directions are transformed to GSM at the selected epoch. No T96, T01, T05, TA15, or TA16 external field is added. GRIDLESS calls the IGRF evaluator directly during tracing; GRIDDED initializes the identical field on the Mode3D mesh before trajectory workers start and then uses only mesh interpolation during the cutoff calculation.</w:t>
       </w:r>
     </w:p>
     <w:p>
@@ -2396,10 +2404,7 @@
     <w:p>
       <w:pPr/>
       <w:r>
-        <w:rPr>
-          <w:i w:val="0"/>
-        </w:rPr>
-        <w:t>The comparison uses Rc_effective_GV, not Rc_upper_GV. PENUMBRA_SCAN evaluates the complete allowed/forbidden rigidity sequence and computes the effective cutoff as Rc_upper minus the total allowed rigidity width within the penumbra. The default linear scan covers 0.01-20 GV with 2000 vertices (approximately 0.01-GV spacing). C6 uses the reference-compatible antiparticle convention: the outward reverse trajectory has the charge sign reversed. A finite time-, step-, or distance-limited trajectory is classified as forbidden, while invalid fields, invalid time steps, and numerical failures remain errors.</w:t>
+        <w:t>The comparison uses Rc_effective_GV, not Rc_upper_GV. PENUMBRA_SCAN evaluates the complete allowed/forbidden rigidity sequence and computes the effective cutoff as Rc_upper minus the total allowed rigidity width within the penumbra. The default linear scan covers 0.01-20 GV with 2000 vertices (approximately 0.01-GV spacing). C6 uses the reference-compatible antiparticle convention: the outward reverse trajectory has the charge sign reversed. A finite time-, step-, or distance-limited trajectory is classified as forbidden, while invalid fields, invalid time steps, and numerical failures remain errors. The same scan grid and classification rules are used by GRIDLESS and GRIDDED.</w:t>
       </w:r>
     </w:p>
     <w:p>
@@ -2639,15 +2644,30 @@
             <w:vAlign w:val="center"/>
           </w:tcPr>
           <w:p>
-            <w:pPr>
-              <w:spacing w:after="0"/>
-            </w:pPr>
-            <w:r/>
-            <w:r>
-              <w:rPr>
-                <w:b w:val="0"/>
-              </w:rPr>
-              <w:t>Archive Rc_lower, Rc_effective, Rc_upper, transition/allowed-band counts, unresolved/error flags, pointwise residuals, command line, numerical input, and JSON summary.</w:t>
+            <w:r>
+              <w:t>Archive solver name, mesh profile (GRIDDED), Rc_lower, Rc_effective, Rc_upper, transition/allowed-band counts, unresolved/error flags, pointwise residuals, command line, numerical input, and JSON summary.</w:t>
+            </w:r>
+          </w:p>
+        </w:tc>
+      </w:tr>
+      <w:tr>
+        <w:tc>
+          <w:tcPr>
+            <w:tcW w:type="dxa" w:w="2232"/>
+          </w:tcPr>
+          <w:p>
+            <w:r>
+              <w:t>Gridded mesh convergence</w:t>
+            </w:r>
+          </w:p>
+        </w:tc>
+        <w:tc>
+          <w:tcPr>
+            <w:tcW w:type="dxa" w:w="7703"/>
+          </w:tcPr>
+          <w:p>
+            <w:r>
+              <w:t>Repeat GRIDDED with at least one finer near-Earth AMR resolution; Rc_effective and external-reference metrics should converge toward stable values. Record the mesh profile in the result provenance.</w:t>
             </w:r>
           </w:p>
         </w:tc>
@@ -2666,10 +2686,7 @@
     <w:p>
       <w:pPr/>
       <w:r>
-        <w:rPr>
-          <w:i w:val="0"/>
-        </w:rPr>
-        <w:t>Pointwise effective vertical-cutoff values from Smart and Shea [R22], the CARI-7 tables [R23], and Gerontidou et al. [R24]. C6 is an independent model-to-model/table validation, not a direct spacecraft-observation test. The acceptance thresholds are validation-scale rather than bitwise regression limits because the references differ in IGRF generation, trajectory code, Earth geometry, rigidity resolution, and spatial interpolation.</w:t>
+        <w:t>Pointwise effective vertical-cutoff values from Smart and Shea [R22], the CARI-7 tables [R23], and Gerontidou et al. [R24]. C6 is an independent model-to-model/table validation, not a direct spacecraft-observation test. The acceptance thresholds are validation-scale rather than bitwise regression limits because the references differ in IGRF generation, trajectory code, Earth geometry, rigidity resolution, and spatial interpolation. GRIDDED must additionally demonstrate convergence as the Mode3D near-Earth mesh resolution is refined; reference agreement must not be obtained by loosening tolerances around an unconverged mesh.</w:t>
       </w:r>
     </w:p>
     <w:p>
@@ -2716,6 +2733,14 @@
       </w:r>
     </w:p>
     <w:p>
+      <w:pPr>
+        <w:pStyle w:val="ListBullet"/>
+      </w:pPr>
+      <w:r>
+        <w:t>The GRIDDED variant is more expensive because it builds and distributes a Mode3D AMR field mesh for every epoch. The checked-in 0.02-Re near-Earth resolution is an initial validation setting; production acceptance requires a documented mesh-refinement comparison.</w:t>
+      </w:r>
+    </w:p>
+    <w:p>
       <w:pPr/>
       <w:r>
         <w:rPr>
@@ -2726,11 +2751,7 @@
     <w:p>
       <w:pPr/>
       <w:r>
-        <w:rPr>
-          <w:i/>
-          <w:sz w:val="16"/>
-        </w:rPr>
-        <w:t>Figure C6 — Target pointwise comparison for effective vertical cutoff rigidity. Resolved AMPS values should cluster around the 1:1 line; the residual panel should show no large systematic latitude- or longitude-dependent bias.</w:t>
+        <w:t>Figure C6 — Target pointwise comparison for effective vertical cutoff rigidity. Resolved GRIDLESS and GRIDDED values should cluster around the 1:1 line. The gridded residual should approach the gridless residual under mesh refinement, without a new latitude- or longitude-dependent bias.</w:t>
       </w:r>
     </w:p>
     <w:p>

</xml_diff>

<commit_message>
srcEarth: test C7 (gridless) passes. test C7 (mesh) fails
</commit_message>
<xml_diff>
--- a/srcEarth/test/validation.docx
+++ b/srcEarth/test/validation.docx
@@ -2764,15 +2764,12 @@
     </w:p>
     <w:p>
       <w:r>
-        <w:t>Compares AMPS cutoff values against an independent backtracing implementation or GeoMag/HelMod-style reference for fixed points and times.</w:t>
-      </w:r>
-    </w:p>
-    <w:p>
-      <w:r>
-        <w:rPr>
-          <w:b/>
-        </w:rPr>
-        <w:t>Essential input parameters:</w:t>
+        <w:t>Purpose and source hierarchy. Compare AMPS vertical-cutoff results with independent online backtracing calculations for identical epochs, locations, field models, and driver states. GeoMagSphere supplies the primary T96 and T05 reference tables. IZMIRAN Cutoff2050 supplies a secondary T96 check; it is not treated as the controlled T05 source.</w:t>
+      </w:r>
+    </w:p>
+    <w:p>
+      <w:r>
+        <w:t>Implemented calculation and numerical settings:</w:t>
       </w:r>
     </w:p>
     <w:p>
@@ -2780,70 +2777,64 @@
         <w:spacing w:after="80"/>
       </w:pPr>
       <w:r>
-        <w:rPr>
-          <w:rFonts w:ascii="Courier New" w:hAnsi="Courier New" w:eastAsia="Courier New"/>
-          <w:sz w:val="16"/>
-        </w:rPr>
-        <w:t>#NUMERICAL</w:t>
-        <w:br/>
-        <w:t>MODE3D_MPI_SCHEDULER      DYNAMIC</w:t>
-        <w:br/>
-        <w:t>MODE3D_MPI_DYNAMIC_CHUNK  0</w:t>
-        <w:br/>
-        <w:t>MODE3D_PARALLEL           THREADS</w:t>
-        <w:br/>
-        <w:t>MODE3D_THREADS            8</w:t>
-        <w:br/>
-        <w:t>CUTOFF_SEARCH_ALGORITHM   UPPER_SCAN</w:t>
-        <w:br/>
-        <w:t>CUTOFF_UPPER_SCAN_N       80</w:t>
-        <w:br/>
-        <w:br/>
-        <w:t>FIELD_MODEL               T05</w:t>
-        <w:br/>
-        <w:t>TS05_DST                  -50.0</w:t>
-        <w:br/>
-        <w:t>TS05_PDYN                  2.0</w:t>
-        <w:br/>
-        <w:t>TS05_BZ                   -5.0</w:t>
-        <w:br/>
-        <w:t>TS05_BY                    0.0</w:t>
-        <w:br/>
-        <w:t>TS05_BX                    0.0</w:t>
-        <w:br/>
-        <w:t>TS05_VX                 -450.0</w:t>
-        <w:br/>
-        <w:t>TS05_NSW                   5.0</w:t>
-        <w:br/>
-        <w:t>EPOCH                     2012-03-08T12:00</w:t>
-        <w:br/>
-        <w:t>CUTOFF_SAMPLING           VERTICAL</w:t>
-        <w:br/>
-        <w:t>OUTPUT_MODE               POINTS</w:t>
-        <w:br/>
-        <w:t>POINTS_FILE               c7_fixed_points.dat</w:t>
-        <w:br/>
-      </w:r>
-    </w:p>
-    <w:p>
-      <w:r>
-        <w:rPr>
-          <w:b/>
-        </w:rPr>
-        <w:t>Calculation locations:</w:t>
-      </w:r>
-    </w:p>
-    <w:p>
-      <w:r>
-        <w:t>Fixed points at 500 km: latitudes −60, −45, −30, 0, 30, 45, 60° and longitudes 0, 90, 180, 270°.</w:t>
-      </w:r>
-    </w:p>
-    <w:p>
-      <w:r>
-        <w:rPr>
-          <w:b/>
-        </w:rPr>
-        <w:t>Expected output values / acceptance targets:</w:t>
+        <w:t>#CUTOFF_RIGIDITY</w:t>
+        <w:br/>
+        <w:t>CUTOFF_SAMPLING              VERTICAL</w:t>
+        <w:br/>
+        <w:t>CUTOFF_SEARCH_ALGORITHM       PENUMBRA_SCAN</w:t>
+        <w:br/>
+        <w:t>CUTOFF_BACKTRACE_CHARGE       REVERSED</w:t>
+        <w:br/>
+        <w:t>CUTOFF_TRACE_LIMIT_POLICY     FORBIDDEN</w:t>
+        <w:br/>
+        <w:t>CUTOFF_TRACE_POLICY           ACCURATE</w:t>
+        <w:br/>
+        <w:t>CUTOFF_UPPER_SCAN_N           400</w:t>
+        <w:br/>
+        <w:t>CUTOFF_MAX_TRAJ_TIME          600.0</w:t>
+        <w:br/>
+        <w:br/>
+        <w:t>#BACKGROUND_FIELD</w:t>
+        <w:br/>
+        <w:t>FIELD_MODEL                   T96 or T05</w:t>
+        <w:br/>
+        <w:t>EPOCH                         copied from each reference group</w:t>
+        <w:br/>
+        <w:t>DST, PDYN, IMF_BX/BY/BZ       copied from each reference group</w:t>
+        <w:br/>
+        <w:t>SW_VX, SW_N                   archived with each reference group</w:t>
+        <w:br/>
+        <w:t>T05_W1 ... T05_W6             required for controlled T05 rows</w:t>
+        <w:br/>
+        <w:br/>
+        <w:t>#OUTPUT_DOMAIN</w:t>
+        <w:br/>
+        <w:t>OUTPUT_MODE                   SHELLS</w:t>
+        <w:br/>
+        <w:t>SHELL_ALTS_KM                 500.0</w:t>
+        <w:br/>
+        <w:t>SHELL_LON_RES_DEG             90.0</w:t>
+        <w:br/>
+        <w:t>SHELL_LAT_RES_DEG             15.0</w:t>
+        <w:br/>
+        <w:t>SHELL_GEOMETRY                GEODETIC</w:t>
+        <w:br/>
+        <w:t>OUTPUT_COORDS                 GEO</w:t>
+      </w:r>
+    </w:p>
+    <w:p>
+      <w:r>
+        <w:t>Calculation locations and AMPS field paths:</w:t>
+      </w:r>
+    </w:p>
+    <w:p>
+      <w:r>
+        <w:t>Twenty-eight WGS-84 geographic locations at 500 km: latitudes -60, -45, -30, 0, 30, 45, and 60 degrees; east longitudes 0, 90, 180, and 270 degrees. The runner extracts these points from the 15-by-90-degree shell. GRIDLESS evaluates T96/T05 directly along each trajectory. GRIDDED initializes the same field on the standalone Mode3D AMR mesh and evaluates it through the production interpolation stencil. BOTH runs the two paths with identical reference and trajectory settings.</w:t>
+      </w:r>
+    </w:p>
+    <w:p>
+      <w:r>
+        <w:t>Reference acquisition, data contract, and comparison quantities:</w:t>
       </w:r>
     </w:p>
     <w:tbl>
@@ -2864,12 +2855,7 @@
             <w:shd w:fill="D9EAF7"/>
           </w:tcPr>
           <w:p>
-            <w:r/>
-            <w:r>
-              <w:rPr>
-                <w:b/>
-                <w:sz w:val="16"/>
-              </w:rPr>
+            <w:r>
               <w:t>Comparison</w:t>
             </w:r>
           </w:p>
@@ -2880,12 +2866,7 @@
             <w:shd w:fill="D9EAF7"/>
           </w:tcPr>
           <w:p>
-            <w:r/>
-            <w:r>
-              <w:rPr>
-                <w:b/>
-                <w:sz w:val="16"/>
-              </w:rPr>
+            <w:r>
               <w:t>Expected</w:t>
             </w:r>
           </w:p>
@@ -2898,13 +2879,8 @@
             <w:vAlign w:val="top"/>
           </w:tcPr>
           <w:p>
-            <w:r/>
-            <w:r>
-              <w:rPr>
-                <w:b w:val="0"/>
-                <w:sz w:val="16"/>
-              </w:rPr>
-              <w:t>AMPS vs GeoMag/HelMod-like code</w:t>
+            <w:r>
+              <w:t>GeoMagSphere T96 and T05</w:t>
             </w:r>
           </w:p>
         </w:tc>
@@ -2914,13 +2890,8 @@
             <w:vAlign w:val="top"/>
           </w:tcPr>
           <w:p>
-            <w:r/>
-            <w:r>
-              <w:rPr>
-                <w:b w:val="0"/>
-                <w:sz w:val="16"/>
-              </w:rPr>
-              <w:t>&lt;5–10% at mid-latitudes; larger differences only in penumbra or boundary-sensitive regions</w:t>
+            <w:r>
+              <w:t>Lower and upper cutoffs compared directly; reported effective cutoff compared with the AMPS lower/upper midpoint. At least 95% matched/valid, at least 85% point pass, and maximum judged RMSE &lt;= 0.50 GV by default.</w:t>
             </w:r>
           </w:p>
         </w:tc>
@@ -2932,13 +2903,8 @@
             <w:vAlign w:val="top"/>
           </w:tcPr>
           <w:p>
-            <w:r/>
-            <w:r>
-              <w:rPr>
-                <w:b w:val="0"/>
-                <w:sz w:val="16"/>
-              </w:rPr>
-              <w:t>T96 vs T05 at high rigidity</w:t>
+            <w:r>
+              <w:t>IZMIRAN Cutoff2050 T96 secondary check</w:t>
             </w:r>
           </w:p>
         </w:tc>
@@ -2948,13 +2914,8 @@
             <w:vAlign w:val="top"/>
           </w:tcPr>
           <w:p>
-            <w:r/>
-            <w:r>
-              <w:rPr>
-                <w:b w:val="0"/>
-                <w:sz w:val="16"/>
-              </w:rPr>
-              <w:t>converges as rigidity increases</w:t>
+            <w:r>
+              <w:t>Lower and upper cutoffs compared directly. Effective cutoff is judged only when the export explicitly identifies MIDPOINT or PENUMBRA_INTEGRAL; otherwise it is diagnostic only.</w:t>
             </w:r>
           </w:p>
         </w:tc>
@@ -2966,12 +2927,30 @@
             <w:vAlign w:val="top"/>
           </w:tcPr>
           <w:p>
-            <w:r/>
-            <w:r>
-              <w:rPr>
-                <w:b w:val="0"/>
-                <w:sz w:val="16"/>
-              </w:rPr>
+            <w:r>
+              <w:t>GRIDLESS versus GRIDDED</w:t>
+            </w:r>
+          </w:p>
+        </w:tc>
+        <w:tc>
+          <w:tcPr>
+            <w:tcW w:type="dxa" w:w="5112"/>
+            <w:vAlign w:val="top"/>
+          </w:tcPr>
+          <w:p>
+            <w:r>
+              <w:t>Both use the same reference rows and physical settings. The gridded residual should approach the gridless residual as the near-Earth mesh is refined.</w:t>
+            </w:r>
+          </w:p>
+        </w:tc>
+      </w:tr>
+      <w:tr>
+        <w:tc>
+          <w:tcPr>
+            <w:tcW w:type="dxa" w:w="5112"/>
+          </w:tcPr>
+          <w:p>
+            <w:r>
               <w:t>Output diagnostics</w:t>
             </w:r>
           </w:p>
@@ -2979,16 +2958,10 @@
         <w:tc>
           <w:tcPr>
             <w:tcW w:type="dxa" w:w="5112"/>
-            <w:vAlign w:val="top"/>
-          </w:tcPr>
-          <w:p>
-            <w:r/>
-            <w:r>
-              <w:rPr>
-                <w:b w:val="0"/>
-                <w:sz w:val="16"/>
-              </w:rPr>
-              <w:t>Rc_upper, Rc_effective, exit reason statistics archived</w:t>
+          </w:tcPr>
+          <w:p>
+            <w:r>
+              <w:t>Rc_lower, Rc_upper, AMPS integral and midpoint effective cutoffs, unresolved counts, exact field drivers, generated input, selected reference table, command, and log are archived.</w:t>
             </w:r>
           </w:p>
         </w:tc>
@@ -2996,15 +2969,12 @@
     </w:tbl>
     <w:p>
       <w:r>
-        <w:rPr>
-          <w:b/>
-        </w:rPr>
-        <w:t>Reference solution / comparison target:</w:t>
-      </w:r>
-    </w:p>
-    <w:p>
-      <w:r>
-        <w:t>Bobik et al. (2013), GeoMag/HelMod: Lorentz backtracing with IGRF plus T96/T05 and vertical cutoff estimates.</w:t>
+        <w:t>srcEarth/test/C7 contains three deterministic 28-case acquisition batches: GeoMagSphere T96, GeoMagSphere T05, and IZMIRAN T96. No cutoff values are fabricated or bundled as authoritative results. The import utility converts calculator exports into a strict CSV containing the epoch, full driver state, lower cutoff, upper cutoff, reported effective cutoff, its definition, scan step, calculator version, citation, and notes. GeoMagSphere effective cutoff is compared with the AMPS lower/upper midpoint. A reported IZMIRAN effective cutoff is judged only when its definition is explicitly declared; otherwise it remains diagnostic and lower/upper cutoffs are the primary comparison.</w:t>
+      </w:r>
+    </w:p>
+    <w:p>
+      <w:r>
+        <w:t>Acceptance and diagnostics:</w:t>
       </w:r>
     </w:p>
     <w:p>
@@ -3012,38 +2982,7 @@
         <w:jc w:val="center"/>
       </w:pPr>
       <w:r>
-        <w:drawing>
-          <wp:inline xmlns:a="http://schemas.openxmlformats.org/drawingml/2006/main" xmlns:pic="http://schemas.openxmlformats.org/drawingml/2006/picture">
-            <wp:extent cx="5303520" cy="3977640"/>
-            <wp:docPr id="7" name="Picture 7"/>
-            <wp:cNvGraphicFramePr>
-              <a:graphicFrameLocks noChangeAspect="1"/>
-            </wp:cNvGraphicFramePr>
-            <a:graphic>
-              <a:graphicData uri="http://schemas.openxmlformats.org/drawingml/2006/picture">
-                <pic:pic>
-                  <pic:nvPicPr>
-                    <pic:cNvPr id="0" name="C7_code_to_code.png"/>
-                    <pic:cNvPicPr/>
-                  </pic:nvPicPr>
-                  <pic:blipFill>
-                    <a:blip r:embed="rId15"/>
-                    <a:stretch>
-                      <a:fillRect/>
-                    </a:stretch>
-                  </pic:blipFill>
-                  <pic:spPr>
-                    <a:xfrm>
-                      <a:off x="0" y="0"/>
-                      <a:ext cx="5303520" cy="3977640"/>
-                    </a:xfrm>
-                    <a:prstGeom prst="rect"/>
-                  </pic:spPr>
-                </pic:pic>
-              </a:graphicData>
-            </a:graphic>
-          </wp:inline>
-        </w:drawing>
+        <w:t>For each source/model/solver group, require at least 95% matched and valid locations, at least 85% of resolved points within the source-aware tolerance, and a maximum RMSE no larger than 0.50 GV among the judged cutoff definitions. The point tolerance is max(0.20 GV, 1.5 times the reported reference scan step, and 10% of the reference value). Archive Rc_lower, Rc_upper, the AMPS penumbra-integral effective cutoff, the AMPS midpoint, unresolved-state diagnostics, the selected reference rows, the generated numerical input, and complete command/log provenance. For GRIDDED, repeat with a finer near-Earth mesh and verify that residuals approach the GRIDLESS result.</w:t>
       </w:r>
     </w:p>
     <w:p>
@@ -3051,11 +2990,7 @@
         <w:jc w:val="center"/>
       </w:pPr>
       <w:r>
-        <w:rPr>
-          <w:i/>
-          <w:sz w:val="16"/>
-        </w:rPr>
-        <w:t>Figure C7 — Reference/target behavior for T96/T05 model-to-model cutoff benchmark.</w:t>
+        <w:t>Figure C7 - Target comparison for the T96/T05 model-to-model benchmark. Primary GeoMagSphere and secondary IZMIRAN points should cluster around the 1:1 line; the gridded residual should decrease under mesh refinement.</w:t>
       </w:r>
     </w:p>
     <w:p>
@@ -12265,6 +12200,14 @@
       </w:r>
     </w:p>
     <w:p>
+      <w:pPr>
+        <w:pStyle w:val="ListBullet"/>
+      </w:pPr>
+      <w:r>
+        <w:t>[R25] Belov, A. V., Zobnin, A. V., and Yanke, V. G. (2021). Program for Calculating the Geomagnetic Cutoff Rigidity of Cosmic Rays and the Trajectories of Their Motion. Bulletin of the Russian Academy of Sciences: Physics. DOI: 10.3103/S106287382111006X. IZMIRAN Cutoff2050 methodology and secondary-code context for C7.</w:t>
+      </w:r>
+    </w:p>
+    <w:p>
       <w:pPr/>
       <w:r>
         <w:rPr>
@@ -12877,16 +12820,8 @@
             <w:vAlign w:val="top"/>
           </w:tcPr>
           <w:p>
-            <w:pPr>
-              <w:spacing w:after="0" w:before="0"/>
-            </w:pPr>
-            <w:r/>
-            <w:r>
-              <w:rPr>
-                <w:b w:val="0"/>
-                <w:sz w:val="13"/>
-              </w:rPr>
-              <w:t>cutoff-t96-shells-steadystate.in</w:t>
+            <w:r>
+              <w:t>srcEarth/test/C7/AMPS_PARAM_C7_gridless.in</w:t>
             </w:r>
           </w:p>
         </w:tc>
@@ -12896,15 +12831,7 @@
             <w:vAlign w:val="top"/>
           </w:tcPr>
           <w:p>
-            <w:pPr>
-              <w:spacing w:after="0" w:before="0"/>
-            </w:pPr>
-            <w:r/>
-            <w:r>
-              <w:rPr>
-                <w:b w:val="0"/>
-                <w:sz w:val="13"/>
-              </w:rPr>
+            <w:r>
               <w:t>gridless cutoff</w:t>
             </w:r>
           </w:p>
@@ -12915,16 +12842,8 @@
             <w:vAlign w:val="top"/>
           </w:tcPr>
           <w:p>
-            <w:pPr>
-              <w:spacing w:after="0" w:before="0"/>
-            </w:pPr>
-            <w:r/>
-            <w:r>
-              <w:rPr>
-                <w:b w:val="0"/>
-                <w:sz w:val="13"/>
-              </w:rPr>
-              <w:t>T96 / SHELLS</w:t>
+            <w:r>
+              <w:t>T96/T05 / SHELLS</w:t>
             </w:r>
           </w:p>
         </w:tc>
@@ -12934,16 +12853,8 @@
             <w:vAlign w:val="top"/>
           </w:tcPr>
           <w:p>
-            <w:pPr>
-              <w:spacing w:after="0" w:before="0"/>
-            </w:pPr>
-            <w:r/>
-            <w:r>
-              <w:rPr>
-                <w:b w:val="0"/>
-                <w:sz w:val="13"/>
-              </w:rPr>
-              <w:t>C7, C8 subset, C10 precursor, C13 load-balance with realistic field</w:t>
+            <w:r>
+              <w:t>C7 primary and secondary external-code comparison</w:t>
             </w:r>
           </w:p>
         </w:tc>
@@ -12953,16 +12864,8 @@
             <w:vAlign w:val="top"/>
           </w:tcPr>
           <w:p>
-            <w:pPr>
-              <w:spacing w:after="0" w:before="0"/>
-            </w:pPr>
-            <w:r/>
-            <w:r>
-              <w:rPr>
-                <w:b w:val="0"/>
-                <w:sz w:val="13"/>
-              </w:rPr>
-              <w:t>Add GRIDLESS_MPI_SCHEDULER matrix and UPPER_SCAN. Keep CUTOFF_SAMPLING ISOTROPIC for directional-cost stress; add explicit TS96 parameters to archive.</w:t>
+            <w:r>
+              <w:t>Implemented numerical C7 input. The runner copies the exact epoch and complete T96/T05 driver state from each strict external-reference group, runs PENUMBRA_SCAN, and extracts the planned 28 fixed locations.</w:t>
             </w:r>
           </w:p>
         </w:tc>
@@ -12974,16 +12877,8 @@
             <w:vAlign w:val="top"/>
           </w:tcPr>
           <w:p>
-            <w:pPr>
-              <w:spacing w:after="0" w:before="0"/>
-            </w:pPr>
-            <w:r/>
-            <w:r>
-              <w:rPr>
-                <w:b w:val="0"/>
-                <w:sz w:val="13"/>
-              </w:rPr>
-              <w:t>cutoff-t96-points-steadystate.in</w:t>
+            <w:r>
+              <w:t>srcEarth/test/C7/AMPS_PARAM_C7_mode3d.in</w:t>
             </w:r>
           </w:p>
         </w:tc>
@@ -12993,16 +12888,8 @@
             <w:vAlign w:val="top"/>
           </w:tcPr>
           <w:p>
-            <w:pPr>
-              <w:spacing w:after="0" w:before="0"/>
-            </w:pPr>
-            <w:r/>
-            <w:r>
-              <w:rPr>
-                <w:b w:val="0"/>
-                <w:sz w:val="13"/>
-              </w:rPr>
-              <w:t>gridless cutoff</w:t>
+            <w:r>
+              <w:t>Mode3D cutoff</w:t>
             </w:r>
           </w:p>
         </w:tc>
@@ -13012,16 +12899,8 @@
             <w:vAlign w:val="top"/>
           </w:tcPr>
           <w:p>
-            <w:pPr>
-              <w:spacing w:after="0" w:before="0"/>
-            </w:pPr>
-            <w:r/>
-            <w:r>
-              <w:rPr>
-                <w:b w:val="0"/>
-                <w:sz w:val="13"/>
-              </w:rPr>
-              <w:t>T96 / POINTS</w:t>
+            <w:r>
+              <w:t>T96/T05 / SHELLS</w:t>
             </w:r>
           </w:p>
         </w:tc>
@@ -13031,16 +12910,8 @@
             <w:vAlign w:val="top"/>
           </w:tcPr>
           <w:p>
-            <w:pPr>
-              <w:spacing w:after="0" w:before="0"/>
-            </w:pPr>
-            <w:r/>
-            <w:r>
-              <w:rPr>
-                <w:b w:val="0"/>
-                <w:sz w:val="13"/>
-              </w:rPr>
-              <w:t>C7 fixed-point code-to-code comparison; C8 directional access if expanded</w:t>
+            <w:r>
+              <w:t>C7 gridded field/interpolation comparison</w:t>
             </w:r>
           </w:p>
         </w:tc>
@@ -13050,16 +12921,8 @@
             <w:vAlign w:val="top"/>
           </w:tcPr>
           <w:p>
-            <w:pPr>
-              <w:spacing w:after="0" w:before="0"/>
-            </w:pPr>
-            <w:r/>
-            <w:r>
-              <w:rPr>
-                <w:b w:val="0"/>
-                <w:sz w:val="13"/>
-              </w:rPr>
-              <w:t>Add DIRMAP_* or rigidity-list options for C8. Use GeoMag/HelMod-style reference points and archive epoch/model parameters.</w:t>
+            <w:r>
+              <w:t>Implemented numerical C7 gridded input. Requires a documented near-Earth mesh-refinement check; use a dynamic chunk at least as large as the requested thread count to expose intra-rank parallelism.</w:t>
             </w:r>
           </w:p>
         </w:tc>
@@ -14827,15 +14690,7 @@
             <w:vAlign w:val="top"/>
           </w:tcPr>
           <w:p>
-            <w:pPr>
-              <w:spacing w:after="0" w:before="0"/>
-            </w:pPr>
-            <w:r/>
-            <w:r>
-              <w:rPr>
-                <w:b w:val="0"/>
-                <w:sz w:val="13"/>
-              </w:rPr>
+            <w:r>
               <w:t>C7</w:t>
             </w:r>
           </w:p>
@@ -14846,15 +14701,7 @@
             <w:vAlign w:val="top"/>
           </w:tcPr>
           <w:p>
-            <w:pPr>
-              <w:spacing w:after="0" w:before="0"/>
-            </w:pPr>
-            <w:r/>
-            <w:r>
-              <w:rPr>
-                <w:b w:val="0"/>
-                <w:sz w:val="13"/>
-              </w:rPr>
+            <w:r>
               <w:t>T96/T05 model-to-model cutoff</w:t>
             </w:r>
           </w:p>
@@ -14865,16 +14712,8 @@
             <w:vAlign w:val="top"/>
           </w:tcPr>
           <w:p>
-            <w:pPr>
-              <w:spacing w:after="0" w:before="0"/>
-            </w:pPr>
-            <w:r/>
-            <w:r>
-              <w:rPr>
-                <w:b w:val="0"/>
-                <w:sz w:val="13"/>
-              </w:rPr>
-              <w:t>cutoff-t96-points-steadystate.in; cutoff-t96-shells-steadystate.in</w:t>
+            <w:r>
+              <w:t>srcEarth/test/C7/AMPS_PARAM_C7_gridless.in; srcEarth/test/C7/AMPS_PARAM_C7_mode3d.in; strict GeoMagSphere/IZMIRAN CSV schema</w:t>
             </w:r>
           </w:p>
         </w:tc>
@@ -14884,16 +14723,8 @@
             <w:vAlign w:val="top"/>
           </w:tcPr>
           <w:p>
-            <w:pPr>
-              <w:spacing w:after="0" w:before="0"/>
-            </w:pPr>
-            <w:r/>
-            <w:r>
-              <w:rPr>
-                <w:b w:val="0"/>
-                <w:sz w:val="13"/>
-              </w:rPr>
-              <w:t>Use T96 files as present; create T05 copies with TS05_* parameters for T05/TS05 comparison.</w:t>
+            <w:r>
+              <w:t>Implemented runner, numerical inputs, acquisition manifest, importer, source-specific effective-cutoff handling, GRIDLESS/GRIDDED/BOTH execution, and diagnostics. Authoritative calculator result tables remain external inputs: GeoMagSphere T96/T05 primary and IZMIRAN T96 secondary.</w:t>
             </w:r>
           </w:p>
         </w:tc>
@@ -15798,16 +15629,8 @@
             <w:vAlign w:val="top"/>
           </w:tcPr>
           <w:p>
-            <w:pPr>
-              <w:spacing w:after="0" w:before="0"/>
-            </w:pPr>
-            <w:r/>
-            <w:r>
-              <w:rPr>
-                <w:b w:val="0"/>
-                <w:sz w:val="14"/>
-              </w:rPr>
-              <w:t>T05/TS05 fixed-point benchmark</w:t>
+            <w:r>
+              <w:t>C7 external calculator result tables</w:t>
             </w:r>
           </w:p>
         </w:tc>
@@ -15817,16 +15640,8 @@
             <w:vAlign w:val="top"/>
           </w:tcPr>
           <w:p>
-            <w:pPr>
-              <w:spacing w:after="0" w:before="0"/>
-            </w:pPr>
-            <w:r/>
-            <w:r>
-              <w:rPr>
-                <w:b w:val="0"/>
-                <w:sz w:val="14"/>
-              </w:rPr>
-              <w:t>Create T05 copies of cutoff-t96-points/shells using TS05_DST, TS05_PDYN, TS05_BZ/BY/BX, TS05_VX, TS05_NSW and a fixed EPOCH.</w:t>
+            <w:r>
+              <w:t>Generate GeoMagSphere T96 and T05 tables and an IZMIRAN Cutoff2050 T96 secondary table from the checked-in 28-location request manifest. Convert exports with srcEarth/test/C7/tools/import_reference.py. For T05, preserve the exact W1-W6 values used by the calculator; do not leave request-placeholder zeros unless the external calculation also used zero.</w:t>
             </w:r>
           </w:p>
         </w:tc>

</xml_diff>

<commit_message>
validation description routine is updated
</commit_message>
<xml_diff>
--- a/srcEarth/test/validation.docx
+++ b/srcEarth/test/validation.docx
@@ -2131,73 +2131,79 @@
       <w:pPr/>
       <w:r>
         <w:rPr>
-          <w:rFonts w:ascii="Courier New" w:hAnsi="Courier New"/>
+          <w:rFonts w:ascii="Liberation Mono" w:hAnsi="Liberation Mono"/>
           <w:sz w:val="16"/>
         </w:rPr>
+        <w:t>Common physics and shell controls:</w:t>
+        <w:br/>
         <w:t>#CALCULATION_MODE</w:t>
         <w:br/>
-        <w:t>CALC_TARGET                 CUTOFF_RIGIDITY</w:t>
-        <w:br/>
-        <w:t>FIELD_EVAL_METHOD           GRIDLESS        # GRIDLESS solver</w:t>
-        <w:br/>
-        <w:t># or</w:t>
-        <w:br/>
-        <w:t>FIELD_EVAL_METHOD           GRID_3D         # GRIDDED Mode3D solver</w:t>
+        <w:t>CALC_TARGET               CUTOFF_RIGIDITY</w:t>
         <w:br/>
         <w:br/>
         <w:t>#CUTOFF_RIGIDITY</w:t>
         <w:br/>
-        <w:t>CUTOFF_SEARCH_ALGORITHM     PENUMBRA_SCAN</w:t>
-        <w:br/>
-        <w:t>CUTOFF_SCAN_SPACING         LINEAR</w:t>
-        <w:br/>
-        <w:t>CUTOFF_UPPER_SCAN_N         2000</w:t>
-        <w:br/>
-        <w:t>CUTOFF_TRACE_POLICY         ACCURATE</w:t>
-        <w:br/>
-        <w:t>CUTOFF_BACKTRACE_CHARGE     REVERSED</w:t>
-        <w:br/>
-        <w:t>CUTOFF_TRACE_LIMIT_POLICY   FORBIDDEN</w:t>
-        <w:br/>
-        <w:t>CUTOFF_SAMPLING             VERTICAL</w:t>
+        <w:t>CUTOFF_SAMPLING           VERTICAL</w:t>
+        <w:br/>
+        <w:t>CUTOFF_SEARCH_ALGORITHM   PENUMBRA_SCAN</w:t>
+        <w:br/>
+        <w:t>CUTOFF_UPPER_SCAN_N       160</w:t>
+        <w:br/>
+        <w:t>CUTOFF_SCAN_SPACING       LINEAR</w:t>
+        <w:br/>
+        <w:t>CUTOFF_BACKTRACE_CHARGE   REVERSED</w:t>
+        <w:br/>
+        <w:t>CUTOFF_TRACE_LIMIT_POLICY FORBIDDEN</w:t>
+        <w:br/>
+        <w:t>CUTOFF_MAX_TRAJ_TIME      20.0</w:t>
         <w:br/>
         <w:br/>
         <w:t>#BACKGROUND_FIELD</w:t>
         <w:br/>
-        <w:t>FIELD_MODEL                 IGRF</w:t>
-        <w:br/>
-        <w:t>EPOCH                       &lt;reference-year&gt;-01-01T00:00:00</w:t>
-        <w:br/>
-        <w:br/>
-        <w:t>#MODE3D_MESH                # GRIDDED solver only</w:t>
-        <w:br/>
-        <w:t>MODE3D_MESH_RES_EARTH_RE     0.02</w:t>
-        <w:br/>
-        <w:t>MODE3D_MESH_RES_BOUNDARY_RE  2.0</w:t>
-        <w:br/>
-        <w:t>MODE3D_MESH_COARSENING       LOG</w:t>
-        <w:br/>
-        <w:t>MODE3D_MESH_EXPONENT         1.0</w:t>
+        <w:t>FIELD_MODEL               T05</w:t>
+        <w:br/>
+        <w:t>EPOCH                     &lt;Table-S1 interval sample UTC&gt;</w:t>
+        <w:br/>
+        <w:t>DRIVER_FILE               &lt;bundled C9 five-minute TS05 driver&gt;</w:t>
         <w:br/>
         <w:br/>
         <w:t>#OUTPUT_DOMAIN</w:t>
         <w:br/>
-        <w:t>OUTPUT_MODE                 SHELLS</w:t>
-        <w:br/>
-        <w:t>SHELL_ALTS_KM               20.0</w:t>
-        <w:br/>
-        <w:t>SHELL_GEOMETRY              GEODETIC</w:t>
-        <w:br/>
-        <w:t>SHELL_LON_RES_DEG           &lt;reference longitude spacing&gt;</w:t>
-        <w:br/>
-        <w:t>SHELL_LAT_RES_DEG           &lt;reference latitude spacing&gt;</w:t>
-        <w:br/>
-        <w:br/>
-        <w:t>#DOMAIN_BOUNDARY  (bare values are km)</w:t>
-        <w:br/>
-        <w:t>DOMAIN_[XYZ]_MIN/MAX        -159280.0 / 159280.0   # +/-25 Re</w:t>
-        <w:br/>
-        <w:t>R_INNER                     6371.2                 # 1 Re</w:t>
+        <w:t>OUTPUT_MODE               SHELLS</w:t>
+        <w:br/>
+        <w:t>SHELL_ALTS_KM             475.0</w:t>
+        <w:br/>
+        <w:t>SHELL_LON_RES_DEG         30.0</w:t>
+        <w:br/>
+        <w:t>SHELL_LAT_RES_DEG         2.0</w:t>
+        <w:br/>
+        <w:t>SHELL_GEOMETRY            GEODETIC</w:t>
+        <w:br/>
+        <w:br/>
+        <w:t>GRIDLESS branch:</w:t>
+        <w:br/>
+        <w:t>FIELD_EVAL_METHOD         GRIDLESS</w:t>
+        <w:br/>
+        <w:t>launch: -mode gridless</w:t>
+        <w:br/>
+        <w:t>raw output: cutoff_gridless_shells_penumbra.dat</w:t>
+        <w:br/>
+        <w:br/>
+        <w:t>GRIDDED branch:</w:t>
+        <w:br/>
+        <w:t>FIELD_EVAL_METHOD         GRID_3D</w:t>
+        <w:br/>
+        <w:t>launch: -mode 3d -mode3d-field-eval MESH -mode3d-parallel THREADS</w:t>
+        <w:br/>
+        <w:t>MODE3D_MESH_RES_EARTH_RE    0.02</w:t>
+        <w:br/>
+        <w:t>MODE3D_MESH_RES_BOUNDARY_RE 2.0</w:t>
+        <w:br/>
+        <w:t>MODE3D_MESH_COARSENING      LINEAR</w:t>
+        <w:br/>
+        <w:t>MODE3D_MESH_EXPONENT        1.0</w:t>
+        <w:br/>
+        <w:t>raw output: cutoff_3d_shells_penumbra.dat</w:t>
       </w:r>
     </w:p>
     <w:p>
@@ -3326,299 +3332,1907 @@
         <w:pStyle w:val="Heading2"/>
       </w:pPr>
       <w:r>
-        <w:t>C9. PAMELA December 2006 storm cutoff</w:t>
-      </w:r>
-    </w:p>
-    <w:p>
-      <w:r>
-        <w:t>Event-level validation of storm-time cutoff-latitude motion using PAMELA proton cutoff measurements.</w:t>
-      </w:r>
-    </w:p>
-    <w:p>
+        <w:t>C9. PAMELA public-data global-shell cutoff-latitude validation</w:t>
+      </w:r>
+    </w:p>
+    <w:p>
+      <w:pPr/>
+      <w:r>
+        <w:t>C9 is the routinely executable public-data form of the December 2006 PAMELA storm test. It validates the time-dependent AMPS IGRF+T05/TS05 vertical-access boundary against the numerical AACGM cutoff latitudes in Adriani et al. (2016) Supporting Information Table S1. The same scientific observable is evaluated through two explicit solver branches: GRIDLESS direct empirical-field evaluation and the GRIDDED standalone Mode3D AMR-mesh/interpolation path. C9 deliberately avoids dependence on nonpublic Resurs-DK1 attitude, the PAMELA mounting matrix, and event-level track directions.</w:t>
+      </w:r>
+    </w:p>
+    <w:p>
+      <w:pPr/>
       <w:r>
         <w:rPr>
           <w:b/>
         </w:rPr>
-        <w:t>Essential input parameters:</w:t>
-      </w:r>
-    </w:p>
-    <w:p>
-      <w:pPr>
-        <w:spacing w:after="80"/>
-      </w:pPr>
-      <w:r>
-        <w:rPr>
-          <w:rFonts w:ascii="Courier New" w:hAnsi="Courier New" w:eastAsia="Courier New"/>
-          <w:sz w:val="16"/>
-        </w:rPr>
-        <w:t>#NUMERICAL</w:t>
-        <w:br/>
-        <w:t>MODE3D_MPI_SCHEDULER      DYNAMIC</w:t>
-        <w:br/>
-        <w:t>MODE3D_MPI_DYNAMIC_CHUNK  0</w:t>
-        <w:br/>
-        <w:t>MODE3D_PARALLEL           THREADS</w:t>
-        <w:br/>
-        <w:t>MODE3D_THREADS            8</w:t>
-        <w:br/>
-        <w:t>CUTOFF_SEARCH_ALGORITHM   UPPER_SCAN</w:t>
-        <w:br/>
-        <w:t>CUTOFF_UPPER_SCAN_N       80</w:t>
-        <w:br/>
-        <w:br/>
-        <w:t>FIELD_MODEL               T05</w:t>
-        <w:br/>
-        <w:t>TEMPORAL_MODE             TIME_SERIES</w:t>
-        <w:br/>
-        <w:t>EVENT_START               2006-12-13T00:00</w:t>
-        <w:br/>
-        <w:t>EVENT_END                 2006-12-15T00:00</w:t>
-        <w:br/>
-        <w:t>FIELD_UPDATE_DT           5</w:t>
-        <w:br/>
-        <w:t>TS_INPUT_MODE             FILE</w:t>
-        <w:br/>
-        <w:t>TS_INPUT_FILE             omni_dec2006_t05.dat</w:t>
-        <w:br/>
-        <w:t>OUTPUT_MODE               TRAJECTORY</w:t>
-        <w:br/>
-        <w:t>TRAJ_FILE                 pamela_orbit_dec2006.dat</w:t>
-        <w:br/>
-        <w:t>CUTOFF_RIGIDITY_LIST_GV   0.4 0.6 1.0 2.0 5.0</w:t>
-        <w:br/>
-      </w:r>
-    </w:p>
-    <w:p>
+        <w:t>Scientific question:</w:t>
+      </w:r>
+      <w:r/>
+    </w:p>
+    <w:p>
+      <w:pPr/>
+      <w:r>
+        <w:t>Does the AMPS global vertical cutoff boundary at PAMELA altitude reproduce the rigidity dependence, equatorward storm displacement, time of minimum cutoff latitude, and recovery reported by PAMELA?</w:t>
+      </w:r>
+    </w:p>
+    <w:p>
+      <w:pPr/>
       <w:r>
         <w:rPr>
           <w:b/>
         </w:rPr>
-        <w:t>Calculation locations:</w:t>
-      </w:r>
-    </w:p>
-    <w:p>
-      <w:r>
-        <w:t>PAMELA LEO trajectory or an emulator with altitude and inclination close to the PAMELA orbit.</w:t>
-      </w:r>
-    </w:p>
-    <w:p>
-      <w:r>
-        <w:rPr>
-          <w:b/>
-        </w:rPr>
-        <w:t>Expected output values / acceptance targets:</w:t>
-      </w:r>
+        <w:t>Reference data and fixed defaults:</w:t>
+      </w:r>
+      <w:r/>
     </w:p>
     <w:tbl>
       <w:tblPr>
         <w:tblStyle w:val="TableGrid"/>
         <w:tblW w:type="auto" w:w="0"/>
-        <w:jc w:val="center"/>
+        <w:tblLayout w:type="fixed"/>
         <w:tblLook w:firstColumn="1" w:firstRow="1" w:lastColumn="0" w:lastRow="0" w:noHBand="0" w:noVBand="1" w:val="04A0"/>
       </w:tblPr>
       <w:tblGrid>
-        <w:gridCol w:w="5112"/>
-        <w:gridCol w:w="5112"/>
+        <w:gridCol w:w="1944"/>
+        <w:gridCol w:w="7272"/>
       </w:tblGrid>
       <w:tr>
-        <w:tc>
-          <w:tcPr>
-            <w:tcW w:type="dxa" w:w="5112"/>
-            <w:shd w:fill="D9EAF7"/>
-          </w:tcPr>
-          <w:p>
-            <w:r/>
+        <w:trPr>
+          <w:cantSplit/>
+          <w:tblHeader w:val="true"/>
+        </w:trPr>
+        <w:tc>
+          <w:tcPr>
+            <w:tcW w:type="dxa" w:w="1944"/>
+          </w:tcPr>
+          <w:p>
+            <w:pPr>
+              <w:spacing w:after="0"/>
+            </w:pPr>
             <w:r>
               <w:rPr>
                 <w:b/>
-                <w:sz w:val="16"/>
-              </w:rPr>
-              <w:t>Observed behavior</w:t>
-            </w:r>
-          </w:p>
-        </w:tc>
-        <w:tc>
-          <w:tcPr>
-            <w:tcW w:type="dxa" w:w="5112"/>
-            <w:shd w:fill="D9EAF7"/>
-          </w:tcPr>
-          <w:p>
-            <w:r/>
+                <w:sz w:val="17"/>
+              </w:rPr>
+              <w:t>Item</w:t>
+            </w:r>
+          </w:p>
+        </w:tc>
+        <w:tc>
+          <w:tcPr>
+            <w:tcW w:type="dxa" w:w="7272"/>
+          </w:tcPr>
+          <w:p>
+            <w:pPr>
+              <w:spacing w:after="0"/>
+            </w:pPr>
             <w:r>
               <w:rPr>
                 <w:b/>
-                <w:sz w:val="16"/>
-              </w:rPr>
-              <w:t>Expected</w:t>
+                <w:sz w:val="17"/>
+              </w:rPr>
+              <w:t>Implemented C9 definition</w:t>
             </w:r>
           </w:p>
         </w:tc>
       </w:tr>
       <w:tr>
-        <w:tc>
-          <w:tcPr>
-            <w:tcW w:type="dxa" w:w="5112"/>
-            <w:vAlign w:val="top"/>
-          </w:tcPr>
-          <w:p>
-            <w:r/>
-            <w:r>
-              <w:rPr>
-                <w:b w:val="0"/>
-                <w:sz w:val="16"/>
-              </w:rPr>
-              <w:t>Lowest rigidities / ~80 MeV protons</w:t>
-            </w:r>
-          </w:p>
-        </w:tc>
-        <w:tc>
-          <w:tcPr>
-            <w:tcW w:type="dxa" w:w="5112"/>
-            <w:vAlign w:val="top"/>
-          </w:tcPr>
-          <w:p>
-            <w:r/>
-            <w:r>
-              <w:rPr>
-                <w:b w:val="0"/>
-                <w:sz w:val="16"/>
-              </w:rPr>
-              <w:t>cutoff latitude suppression of order 6–7° during main phase</w:t>
+        <w:trPr>
+          <w:cantSplit/>
+        </w:trPr>
+        <w:tc>
+          <w:tcPr>
+            <w:tcW w:type="dxa" w:w="1944"/>
+          </w:tcPr>
+          <w:p>
+            <w:pPr>
+              <w:spacing w:after="0"/>
+            </w:pPr>
+            <w:r>
+              <w:rPr>
+                <w:sz w:val="17"/>
+              </w:rPr>
+              <w:t>Observational source</w:t>
+            </w:r>
+          </w:p>
+        </w:tc>
+        <w:tc>
+          <w:tcPr>
+            <w:tcW w:type="dxa" w:w="7272"/>
+          </w:tcPr>
+          <w:p>
+            <w:pPr>
+              <w:spacing w:after="0"/>
+            </w:pPr>
+            <w:r>
+              <w:rPr>
+                <w:sz w:val="17"/>
+              </w:rPr>
+              <w:t>Adriani et al. (2016), Space Weather, doi:10.1002/2016SW001364, Supporting Information Table S1.</w:t>
             </w:r>
           </w:p>
         </w:tc>
       </w:tr>
       <w:tr>
-        <w:tc>
-          <w:tcPr>
-            <w:tcW w:type="dxa" w:w="5112"/>
-            <w:vAlign w:val="top"/>
-          </w:tcPr>
-          <w:p>
-            <w:r/>
-            <w:r>
-              <w:rPr>
-                <w:b w:val="0"/>
-                <w:sz w:val="16"/>
-              </w:rPr>
-              <w:t>Timing</w:t>
-            </w:r>
-          </w:p>
-        </w:tc>
-        <w:tc>
-          <w:tcPr>
-            <w:tcW w:type="dxa" w:w="5112"/>
-            <w:vAlign w:val="top"/>
-          </w:tcPr>
-          <w:p>
-            <w:r/>
-            <w:r>
-              <w:rPr>
-                <w:b w:val="0"/>
-                <w:sz w:val="16"/>
-              </w:rPr>
-              <w:t>equatorward motion during storm main phase; partial recovery later</w:t>
+        <w:trPr>
+          <w:cantSplit/>
+        </w:trPr>
+        <w:tc>
+          <w:tcPr>
+            <w:tcW w:type="dxa" w:w="1944"/>
+          </w:tcPr>
+          <w:p>
+            <w:pPr>
+              <w:spacing w:after="0"/>
+            </w:pPr>
+            <w:r>
+              <w:rPr>
+                <w:sz w:val="17"/>
+              </w:rPr>
+              <w:t>Reference quantity</w:t>
+            </w:r>
+          </w:p>
+        </w:tc>
+        <w:tc>
+          <w:tcPr>
+            <w:tcW w:type="dxa" w:w="7272"/>
+          </w:tcPr>
+          <w:p>
+            <w:pPr>
+              <w:spacing w:after="0"/>
+            </w:pPr>
+            <w:r>
+              <w:rPr>
+                <w:sz w:val="17"/>
+              </w:rPr>
+              <w:t>Magnitude of geomagnetic cutoff AACGM latitude, with asymmetric statistical uncertainties.</w:t>
             </w:r>
           </w:p>
         </w:tc>
       </w:tr>
       <w:tr>
-        <w:tc>
-          <w:tcPr>
-            <w:tcW w:type="dxa" w:w="5112"/>
-            <w:vAlign w:val="top"/>
-          </w:tcPr>
-          <w:p>
-            <w:r/>
-            <w:r>
-              <w:rPr>
-                <w:b w:val="0"/>
-                <w:sz w:val="16"/>
-              </w:rPr>
-              <w:t>Model comparison</w:t>
-            </w:r>
-          </w:p>
-        </w:tc>
-        <w:tc>
-          <w:tcPr>
-            <w:tcW w:type="dxa" w:w="5112"/>
-            <w:vAlign w:val="top"/>
-          </w:tcPr>
-          <w:p>
-            <w:r/>
-            <w:r>
-              <w:rPr>
-                <w:b w:val="0"/>
-                <w:sz w:val="16"/>
-              </w:rPr>
-              <w:t>cutoff latitude vs rigidity and orbit time, not only single Rc values</w:t>
+        <w:trPr>
+          <w:cantSplit/>
+        </w:trPr>
+        <w:tc>
+          <w:tcPr>
+            <w:tcW w:type="dxa" w:w="1944"/>
+          </w:tcPr>
+          <w:p>
+            <w:pPr>
+              <w:spacing w:after="0"/>
+            </w:pPr>
+            <w:r>
+              <w:rPr>
+                <w:sz w:val="17"/>
+              </w:rPr>
+              <w:t>Reference inventory</w:t>
+            </w:r>
+          </w:p>
+        </w:tc>
+        <w:tc>
+          <w:tcPr>
+            <w:tcW w:type="dxa" w:w="7272"/>
+          </w:tcPr>
+          <w:p>
+            <w:pPr>
+              <w:spacing w:after="0"/>
+            </w:pPr>
+            <w:r>
+              <w:rPr>
+                <w:sz w:val="17"/>
+              </w:rPr>
+              <w:t>37 interval midpoints x 7 rigidity bins = 259 table cells; 258 numerical values and one retained missing datum.</w:t>
+            </w:r>
+          </w:p>
+        </w:tc>
+      </w:tr>
+      <w:tr>
+        <w:trPr>
+          <w:cantSplit/>
+        </w:trPr>
+        <w:tc>
+          <w:tcPr>
+            <w:tcW w:type="dxa" w:w="1944"/>
+          </w:tcPr>
+          <w:p>
+            <w:pPr>
+              <w:spacing w:after="0"/>
+            </w:pPr>
+            <w:r>
+              <w:rPr>
+                <w:sz w:val="17"/>
+              </w:rPr>
+              <w:t>Observation interval</w:t>
+            </w:r>
+          </w:p>
+        </w:tc>
+        <w:tc>
+          <w:tcPr>
+            <w:tcW w:type="dxa" w:w="7272"/>
+          </w:tcPr>
+          <w:p>
+            <w:pPr>
+              <w:spacing w:after="0"/>
+            </w:pPr>
+            <w:r>
+              <w:rPr>
+                <w:sz w:val="17"/>
+              </w:rPr>
+              <w:t>Each printed UTC is the midpoint of a 94-minute PAMELA interval; start/end metadata are midpoint +/-47 minutes.</w:t>
+            </w:r>
+          </w:p>
+        </w:tc>
+      </w:tr>
+      <w:tr>
+        <w:trPr>
+          <w:cantSplit/>
+        </w:trPr>
+        <w:tc>
+          <w:tcPr>
+            <w:tcW w:type="dxa" w:w="1944"/>
+          </w:tcPr>
+          <w:p>
+            <w:pPr>
+              <w:spacing w:after="0"/>
+            </w:pPr>
+            <w:r>
+              <w:rPr>
+                <w:sz w:val="17"/>
+              </w:rPr>
+              <w:t>Altitude and direction</w:t>
+            </w:r>
+          </w:p>
+        </w:tc>
+        <w:tc>
+          <w:tcPr>
+            <w:tcW w:type="dxa" w:w="7272"/>
+          </w:tcPr>
+          <w:p>
+            <w:pPr>
+              <w:spacing w:after="0"/>
+            </w:pPr>
+            <w:r>
+              <w:rPr>
+                <w:sz w:val="17"/>
+              </w:rPr>
+              <w:t>475-km geodetic shell; vertically incident protons.</w:t>
+            </w:r>
+          </w:p>
+        </w:tc>
+      </w:tr>
+      <w:tr>
+        <w:trPr>
+          <w:cantSplit/>
+        </w:trPr>
+        <w:tc>
+          <w:tcPr>
+            <w:tcW w:type="dxa" w:w="1944"/>
+          </w:tcPr>
+          <w:p>
+            <w:pPr>
+              <w:spacing w:after="0"/>
+            </w:pPr>
+            <w:r>
+              <w:rPr>
+                <w:sz w:val="17"/>
+              </w:rPr>
+              <w:t>Rigidity representation</w:t>
+            </w:r>
+          </w:p>
+        </w:tc>
+        <w:tc>
+          <w:tcPr>
+            <w:tcW w:type="dxa" w:w="7272"/>
+          </w:tcPr>
+          <w:p>
+            <w:pPr>
+              <w:spacing w:after="0"/>
+            </w:pPr>
+            <w:r>
+              <w:rPr>
+                <w:sz w:val="17"/>
+              </w:rPr>
+              <w:t>Geometric center of each published bin: 0.4236, 0.4984, 0.5879, 0.6928, 0.8170, 0.9621, and 1.1310 GV.</w:t>
+            </w:r>
+          </w:p>
+        </w:tc>
+      </w:tr>
+      <w:tr>
+        <w:trPr>
+          <w:cantSplit/>
+        </w:trPr>
+        <w:tc>
+          <w:tcPr>
+            <w:tcW w:type="dxa" w:w="1944"/>
+          </w:tcPr>
+          <w:p>
+            <w:pPr>
+              <w:spacing w:after="0"/>
+            </w:pPr>
+            <w:r>
+              <w:rPr>
+                <w:sz w:val="17"/>
+              </w:rPr>
+              <w:t>Magnetic field</w:t>
+            </w:r>
+          </w:p>
+        </w:tc>
+        <w:tc>
+          <w:tcPr>
+            <w:tcW w:type="dxa" w:w="7272"/>
+          </w:tcPr>
+          <w:p>
+            <w:pPr>
+              <w:spacing w:after="0"/>
+            </w:pPr>
+            <w:r>
+              <w:rPr>
+                <w:sz w:val="17"/>
+              </w:rPr>
+              <w:t>IGRF plus T05/TS05, sampled from the bundled five-minute event driver containing Pdyn, Sym-H, IMF By/Bz, tilt, and W1-W6.</w:t>
+            </w:r>
+          </w:p>
+        </w:tc>
+      </w:tr>
+      <w:tr>
+        <w:trPr>
+          <w:cantSplit/>
+        </w:trPr>
+        <w:tc>
+          <w:tcPr>
+            <w:tcW w:type="dxa" w:w="1944"/>
+          </w:tcPr>
+          <w:p>
+            <w:pPr>
+              <w:spacing w:after="0"/>
+            </w:pPr>
+            <w:r>
+              <w:rPr>
+                <w:sz w:val="17"/>
+              </w:rPr>
+              <w:t>Default shell grid</w:t>
+            </w:r>
+          </w:p>
+        </w:tc>
+        <w:tc>
+          <w:tcPr>
+            <w:tcW w:type="dxa" w:w="7272"/>
+          </w:tcPr>
+          <w:p>
+            <w:pPr>
+              <w:spacing w:after="0"/>
+            </w:pPr>
+            <w:r>
+              <w:rPr>
+                <w:sz w:val="17"/>
+              </w:rPr>
+              <w:t>30 deg geographic longitude x 2 deg geographic latitude; both AACGM hemispheres are retained.</w:t>
+            </w:r>
+          </w:p>
+        </w:tc>
+      </w:tr>
+      <w:tr>
+        <w:tc>
+          <w:tcPr>
+            <w:tcW w:type="dxa" w:w="1944"/>
+          </w:tcPr>
+          <w:p>
+            <w:r>
+              <w:t>Solver branches</w:t>
+            </w:r>
+          </w:p>
+        </w:tc>
+        <w:tc>
+          <w:tcPr>
+            <w:tcW w:type="dxa" w:w="7272"/>
+          </w:tcPr>
+          <w:p>
+            <w:r>
+              <w:t>GRIDLESS direct field evaluation and GRIDDED Mode3D mesh/interpolation; --solver BOTH is the runner default.</w:t>
+            </w:r>
+          </w:p>
+        </w:tc>
+      </w:tr>
+      <w:tr>
+        <w:tc>
+          <w:tcPr>
+            <w:tcW w:type="dxa" w:w="1944"/>
+          </w:tcPr>
+          <w:p>
+            <w:r>
+              <w:t>Mode3D default mesh</w:t>
+            </w:r>
+          </w:p>
+        </w:tc>
+        <w:tc>
+          <w:tcPr>
+            <w:tcW w:type="dxa" w:w="7272"/>
+          </w:tcPr>
+          <w:p>
+            <w:r>
+              <w:t>0.02 Re near Earth, 2.0 Re at the boundary, LINEAR coarsening, exponent 1.0.</w:t>
             </w:r>
           </w:p>
         </w:tc>
       </w:tr>
     </w:tbl>
     <w:p>
+      <w:pPr/>
+      <w:r>
+        <w:t>Implemented AMPS inputs and solver branches:</w:t>
+      </w:r>
+    </w:p>
+    <w:p>
+      <w:pPr>
+        <w:spacing w:before="60" w:after="120"/>
+        <w:ind w:left="360" w:right="216"/>
+        <w:shd w:fill="F2F2F2"/>
+      </w:pPr>
+      <w:r>
+        <w:rPr>
+          <w:rFonts w:ascii="Liberation Mono" w:hAnsi="Liberation Mono"/>
+          <w:sz w:val="16"/>
+        </w:rPr>
+        <w:t>Common physics and shell controls:</w:t>
+        <w:br/>
+        <w:t>#CALCULATION_MODE</w:t>
+        <w:br/>
+        <w:t>CALC_TARGET               CUTOFF_RIGIDITY</w:t>
+        <w:br/>
+        <w:br/>
+        <w:t>#CUTOFF_RIGIDITY</w:t>
+        <w:br/>
+        <w:t>CUTOFF_SAMPLING           VERTICAL</w:t>
+        <w:br/>
+        <w:t>CUTOFF_SEARCH_ALGORITHM   PENUMBRA_SCAN</w:t>
+        <w:br/>
+        <w:t>CUTOFF_UPPER_SCAN_N       160</w:t>
+        <w:br/>
+        <w:t>CUTOFF_SCAN_SPACING       LINEAR</w:t>
+        <w:br/>
+        <w:t>CUTOFF_BACKTRACE_CHARGE   REVERSED</w:t>
+        <w:br/>
+        <w:t>CUTOFF_TRACE_LIMIT_POLICY FORBIDDEN</w:t>
+        <w:br/>
+        <w:t>CUTOFF_MAX_TRAJ_TIME      20.0</w:t>
+        <w:br/>
+        <w:br/>
+        <w:t>#BACKGROUND_FIELD</w:t>
+        <w:br/>
+        <w:t>FIELD_MODEL               T05</w:t>
+        <w:br/>
+        <w:t>EPOCH                     &lt;Table-S1 interval sample UTC&gt;</w:t>
+        <w:br/>
+        <w:t>DRIVER_FILE               &lt;bundled C9 five-minute TS05 driver&gt;</w:t>
+        <w:br/>
+        <w:br/>
+        <w:t>#OUTPUT_DOMAIN</w:t>
+        <w:br/>
+        <w:t>OUTPUT_MODE               SHELLS</w:t>
+        <w:br/>
+        <w:t>SHELL_ALTS_KM             475.0</w:t>
+        <w:br/>
+        <w:t>SHELL_LON_RES_DEG         30.0</w:t>
+        <w:br/>
+        <w:t>SHELL_LAT_RES_DEG         2.0</w:t>
+        <w:br/>
+        <w:t>SHELL_GEOMETRY            GEODETIC</w:t>
+        <w:br/>
+        <w:br/>
+        <w:t>GRIDLESS branch:</w:t>
+        <w:br/>
+        <w:t>FIELD_EVAL_METHOD         GRIDLESS</w:t>
+        <w:br/>
+        <w:t>launch: -mode gridless</w:t>
+        <w:br/>
+        <w:t>raw output: cutoff_gridless_shells_penumbra.dat</w:t>
+        <w:br/>
+        <w:br/>
+        <w:t>GRIDDED branch:</w:t>
+        <w:br/>
+        <w:t>FIELD_EVAL_METHOD         GRID_3D</w:t>
+        <w:br/>
+        <w:t>launch: -mode 3d -mode3d-field-eval MESH -mode3d-parallel THREADS</w:t>
+        <w:br/>
+        <w:t>MODE3D_MESH_RES_EARTH_RE    0.02</w:t>
+        <w:br/>
+        <w:t>MODE3D_MESH_RES_BOUNDARY_RE 2.0</w:t>
+        <w:br/>
+        <w:t>MODE3D_MESH_COARSENING      LINEAR</w:t>
+        <w:br/>
+        <w:t>MODE3D_MESH_EXPONENT        1.0</w:t>
+        <w:br/>
+        <w:t>raw output: cutoff_3d_shells_penumbra.dat</w:t>
+      </w:r>
+    </w:p>
+    <w:p>
+      <w:pPr/>
+      <w:r>
+        <w:t>The complete numerical templates are srcEarth/test/C9/AMPS_PARAM_C9_gridless.in and srcEarth/test/C9/AMPS_PARAM_C9_mode3d.in. The runner applies identical event epochs, driver values, shell coordinates, rigidity bracket, mover, trajectory limits, AACGM conversion, contour extraction, and PAMELA acceptance metrics to both branches. It changes only named directives and archives every generated input and command. The default 0.30-1.35 GV proton bracket covers all seven reference-bin centers; 160 linear samples give a nominal rigidity spacing of approximately 0.0066 GV.</w:t>
+      </w:r>
+    </w:p>
+    <w:p>
+      <w:pPr/>
+      <w:r>
+        <w:rPr>
+          <w:b/>
+        </w:rPr>
+        <w:t>Public TS05 driver and provenance controls:</w:t>
+      </w:r>
+      <w:r/>
+    </w:p>
+    <w:p>
+      <w:pPr/>
+      <w:r>
+        <w:t>The bundled event driver is the routine C9 input. For an alternate official Tsyganenko yearly product, tools/prepare_official_ts05_driver.py copies the five-minute values without smoothing and writes the source URL, archive SHA-256, member name, and source-kind tag. The runner validates column count, monotonic UTC sequence, five-minute median cadence, maximum gap, requested-time coverage, and bundled-checksum or official provenance before execution.</w:t>
+      </w:r>
+    </w:p>
+    <w:p>
+      <w:pPr/>
+      <w:r>
+        <w:t>C9 bundles the supplied five-minute event driver as srcEarth/test/C9/data/ts05_driving.txt. The runner uses it by default and verifies its fixed SHA-256 digest (cb3f3f1959763660beb1e26e5a49489b132708944fb91c4e1ee37cfc3a6c4317), timestamp plus 19 numerical fields, strictly increasing UTC sequence, five-minute median cadence, maximum gap, and coverage of every requested snapshot before execution.</w:t>
+      </w:r>
+    </w:p>
+    <w:p>
+      <w:pPr/>
+      <w:r>
+        <w:rPr>
+          <w:b/>
+        </w:rPr>
+        <w:t>GEO-to-AACGM postprocessing and boundary algorithm:</w:t>
+      </w:r>
+      <w:r/>
+    </w:p>
+    <w:tbl>
+      <w:tblPr>
+        <w:tblStyle w:val="TableGrid"/>
+        <w:tblW w:type="auto" w:w="0"/>
+        <w:tblLayout w:type="fixed"/>
+        <w:tblLook w:firstColumn="1" w:firstRow="1" w:lastColumn="0" w:lastRow="0" w:noHBand="0" w:noVBand="1" w:val="04A0"/>
+      </w:tblPr>
+      <w:tblGrid>
+        <w:gridCol w:w="1800"/>
+        <w:gridCol w:w="7416"/>
+      </w:tblGrid>
+      <w:tr>
+        <w:trPr>
+          <w:cantSplit/>
+          <w:tblHeader w:val="true"/>
+        </w:trPr>
+        <w:tc>
+          <w:tcPr>
+            <w:tcW w:type="dxa" w:w="1800"/>
+          </w:tcPr>
+          <w:p>
+            <w:pPr>
+              <w:spacing w:after="0"/>
+            </w:pPr>
+            <w:r>
+              <w:rPr>
+                <w:b/>
+                <w:sz w:val="17"/>
+              </w:rPr>
+              <w:t>Step</w:t>
+            </w:r>
+          </w:p>
+        </w:tc>
+        <w:tc>
+          <w:tcPr>
+            <w:tcW w:type="dxa" w:w="7416"/>
+          </w:tcPr>
+          <w:p>
+            <w:pPr>
+              <w:spacing w:after="0"/>
+            </w:pPr>
+            <w:r>
+              <w:rPr>
+                <w:b/>
+                <w:sz w:val="17"/>
+              </w:rPr>
+              <w:t>Detailed implementation</w:t>
+            </w:r>
+          </w:p>
+        </w:tc>
+      </w:tr>
+      <w:tr>
+        <w:trPr>
+          <w:cantSplit/>
+        </w:trPr>
+        <w:tc>
+          <w:tcPr>
+            <w:tcW w:type="dxa" w:w="1800"/>
+          </w:tcPr>
+          <w:p>
+            <w:pPr>
+              <w:spacing w:after="0"/>
+            </w:pPr>
+            <w:r>
+              <w:rPr>
+                <w:sz w:val="17"/>
+              </w:rPr>
+              <w:t>1. Field snapshots</w:t>
+            </w:r>
+          </w:p>
+        </w:tc>
+        <w:tc>
+          <w:tcPr>
+            <w:tcW w:type="dxa" w:w="7416"/>
+          </w:tcPr>
+          <w:p>
+            <w:pPr>
+              <w:spacing w:after="0"/>
+            </w:pPr>
+            <w:r>
+              <w:rPr>
+                <w:sz w:val="17"/>
+              </w:rPr>
+              <w:t>For each selected Table-S1 interval, run one midpoint snapshot by default. --interval-samples N uses N equally spaced samples across the 94-minute interval.</w:t>
+            </w:r>
+          </w:p>
+        </w:tc>
+      </w:tr>
+      <w:tr>
+        <w:trPr>
+          <w:cantSplit/>
+        </w:trPr>
+        <w:tc>
+          <w:tcPr>
+            <w:tcW w:type="dxa" w:w="1800"/>
+          </w:tcPr>
+          <w:p>
+            <w:pPr>
+              <w:spacing w:after="0"/>
+            </w:pPr>
+            <w:r>
+              <w:rPr>
+                <w:sz w:val="17"/>
+              </w:rPr>
+              <w:t>2. AMPS shell result</w:t>
+            </w:r>
+          </w:p>
+        </w:tc>
+        <w:tc>
+          <w:tcPr>
+            <w:tcW w:type="dxa" w:w="7416"/>
+          </w:tcPr>
+          <w:p>
+            <w:r>
+              <w:t>Read cutoff_gridless_shells_penumbra.dat for GRIDLESS or cutoff_3d_shells_penumbra.dat for GRIDDED. Retain Rc_lower, Rc_effective, Rc_upper, transition counts, unresolved counts, and range/bracket flags.</w:t>
+            </w:r>
+          </w:p>
+        </w:tc>
+      </w:tr>
+      <w:tr>
+        <w:trPr>
+          <w:cantSplit/>
+        </w:trPr>
+        <w:tc>
+          <w:tcPr>
+            <w:tcW w:type="dxa" w:w="1800"/>
+          </w:tcPr>
+          <w:p>
+            <w:pPr>
+              <w:spacing w:after="0"/>
+            </w:pPr>
+            <w:r>
+              <w:rPr>
+                <w:sz w:val="17"/>
+              </w:rPr>
+              <w:t>3. AACGM conversion</w:t>
+            </w:r>
+          </w:p>
+        </w:tc>
+        <w:tc>
+          <w:tcPr>
+            <w:tcW w:type="dxa" w:w="7416"/>
+          </w:tcPr>
+          <w:p>
+            <w:pPr>
+              <w:spacing w:after="0"/>
+            </w:pPr>
+            <w:r>
+              <w:rPr>
+                <w:sz w:val="17"/>
+              </w:rPr>
+              <w:t>Convert every geographic shell point at the exact snapshot UTC and 475-km altitude with the aacgmv2 G2A transformation.</w:t>
+            </w:r>
+          </w:p>
+        </w:tc>
+      </w:tr>
+      <w:tr>
+        <w:trPr>
+          <w:cantSplit/>
+        </w:trPr>
+        <w:tc>
+          <w:tcPr>
+            <w:tcW w:type="dxa" w:w="1800"/>
+          </w:tcPr>
+          <w:p>
+            <w:pPr>
+              <w:spacing w:after="0"/>
+            </w:pPr>
+            <w:r>
+              <w:rPr>
+                <w:sz w:val="17"/>
+              </w:rPr>
+              <w:t>4. Longitude/hemisphere profiles</w:t>
+            </w:r>
+          </w:p>
+        </w:tc>
+        <w:tc>
+          <w:tcPr>
+            <w:tcW w:type="dxa" w:w="7416"/>
+          </w:tcPr>
+          <w:p>
+            <w:pPr>
+              <w:spacing w:after="0"/>
+            </w:pPr>
+            <w:r>
+              <w:rPr>
+                <w:sz w:val="17"/>
+              </w:rPr>
+              <w:t>At each geographic longitude, separate north/south AACGM hemispheres and sort points by increasing absolute AACGM latitude.</w:t>
+            </w:r>
+          </w:p>
+        </w:tc>
+      </w:tr>
+      <w:tr>
+        <w:trPr>
+          <w:cantSplit/>
+        </w:trPr>
+        <w:tc>
+          <w:tcPr>
+            <w:tcW w:type="dxa" w:w="1800"/>
+          </w:tcPr>
+          <w:p>
+            <w:pPr>
+              <w:spacing w:after="0"/>
+            </w:pPr>
+            <w:r>
+              <w:rPr>
+                <w:sz w:val="17"/>
+              </w:rPr>
+              <w:t>5. Rigidity contour</w:t>
+            </w:r>
+          </w:p>
+        </w:tc>
+        <w:tc>
+          <w:tcPr>
+            <w:tcW w:type="dxa" w:w="7416"/>
+          </w:tcPr>
+          <w:p>
+            <w:pPr>
+              <w:spacing w:after="0"/>
+            </w:pPr>
+            <w:r>
+              <w:rPr>
+                <w:sz w:val="17"/>
+              </w:rPr>
+              <w:t>For each geometric-center rigidity R, find the first poleward transition Rc_effective &gt; R to Rc_effective &lt;= R and linearly interpolate its absolute AACGM latitude.</w:t>
+            </w:r>
+          </w:p>
+        </w:tc>
+      </w:tr>
+      <w:tr>
+        <w:trPr>
+          <w:cantSplit/>
+        </w:trPr>
+        <w:tc>
+          <w:tcPr>
+            <w:tcW w:type="dxa" w:w="1800"/>
+          </w:tcPr>
+          <w:p>
+            <w:pPr>
+              <w:spacing w:after="0"/>
+            </w:pPr>
+            <w:r>
+              <w:rPr>
+                <w:sz w:val="17"/>
+              </w:rPr>
+              <w:t>6. Spatial aggregation</w:t>
+            </w:r>
+          </w:p>
+        </w:tc>
+        <w:tc>
+          <w:tcPr>
+            <w:tcW w:type="dxa" w:w="7416"/>
+          </w:tcPr>
+          <w:p>
+            <w:pPr>
+              <w:spacing w:after="0"/>
+            </w:pPr>
+            <w:r>
+              <w:rPr>
+                <w:sz w:val="17"/>
+              </w:rPr>
+              <w:t>Use the median of valid longitude/hemisphere crossings as the snapshot cutoff. Retain mean, standard deviation, range, north/south medians, and multiple-transition counts.</w:t>
+            </w:r>
+          </w:p>
+        </w:tc>
+      </w:tr>
+      <w:tr>
+        <w:trPr>
+          <w:cantSplit/>
+        </w:trPr>
+        <w:tc>
+          <w:tcPr>
+            <w:tcW w:type="dxa" w:w="1800"/>
+          </w:tcPr>
+          <w:p>
+            <w:pPr>
+              <w:spacing w:after="0"/>
+            </w:pPr>
+            <w:r>
+              <w:rPr>
+                <w:sz w:val="17"/>
+              </w:rPr>
+              <w:t>7. Temporal aggregation</w:t>
+            </w:r>
+          </w:p>
+        </w:tc>
+        <w:tc>
+          <w:tcPr>
+            <w:tcW w:type="dxa" w:w="7416"/>
+          </w:tcPr>
+          <w:p>
+            <w:pPr>
+              <w:spacing w:after="0"/>
+            </w:pPr>
+            <w:r>
+              <w:rPr>
+                <w:sz w:val="17"/>
+              </w:rPr>
+              <w:t>For N &gt; 1 snapshots, average the N snapshot medians so every field epoch has equal weight in the 94-minute interval.</w:t>
+            </w:r>
+          </w:p>
+        </w:tc>
+      </w:tr>
+      <w:tr>
+        <w:trPr>
+          <w:cantSplit/>
+        </w:trPr>
+        <w:tc>
+          <w:tcPr>
+            <w:tcW w:type="dxa" w:w="1800"/>
+          </w:tcPr>
+          <w:p>
+            <w:pPr>
+              <w:spacing w:after="0"/>
+            </w:pPr>
+            <w:r>
+              <w:rPr>
+                <w:sz w:val="17"/>
+              </w:rPr>
+              <w:t>8. Comparison</w:t>
+            </w:r>
+          </w:p>
+        </w:tc>
+        <w:tc>
+          <w:tcPr>
+            <w:tcW w:type="dxa" w:w="7416"/>
+          </w:tcPr>
+          <w:p>
+            <w:pPr>
+              <w:spacing w:after="0"/>
+            </w:pPr>
+            <w:r>
+              <w:rPr>
+                <w:sz w:val="17"/>
+              </w:rPr>
+              <w:t>Join by Table-S1 midpoint and rigidity bin; compute residuals, uncertainty-normalized residuals, RMSE, bias, correlation, storm suppression, and minimum-time error.</w:t>
+            </w:r>
+          </w:p>
+        </w:tc>
+      </w:tr>
+      <w:tr>
+        <w:tc>
+          <w:tcPr>
+            <w:tcW w:type="dxa" w:w="1800"/>
+          </w:tcPr>
+          <w:p>
+            <w:r>
+              <w:t>9. Branch comparison</w:t>
+            </w:r>
+          </w:p>
+        </w:tc>
+        <w:tc>
+          <w:tcPr>
+            <w:tcW w:type="dxa" w:w="7416"/>
+          </w:tcPr>
+          <w:p>
+            <w:r>
+              <w:t>Judge GRIDLESS and GRIDDED independently against PAMELA. When both are selected, write the GRIDDED-minus-GRIDLESS cutoff-latitude table and summary as a mesh/interpolation diagnostic.</w:t>
+            </w:r>
+          </w:p>
+        </w:tc>
+      </w:tr>
+    </w:tbl>
+    <w:p>
+      <w:pPr/>
+      <w:r>
+        <w:rPr>
+          <w:b/>
+        </w:rPr>
+        <w:t>Routine, smoke, and full profiles:</w:t>
+      </w:r>
+      <w:r/>
+    </w:p>
+    <w:tbl>
+      <w:tblPr>
+        <w:tblStyle w:val="TableGrid"/>
+        <w:tblW w:type="auto" w:w="0"/>
+        <w:tblLayout w:type="fixed"/>
+        <w:tblLook w:firstColumn="1" w:firstRow="1" w:lastColumn="0" w:lastRow="0" w:noHBand="0" w:noVBand="1" w:val="04A0"/>
+      </w:tblPr>
+      <w:tblGrid>
+        <w:gridCol w:w="1800"/>
+        <w:gridCol w:w="7416"/>
+      </w:tblGrid>
+      <w:tr>
+        <w:trPr>
+          <w:cantSplit/>
+          <w:tblHeader w:val="true"/>
+        </w:trPr>
+        <w:tc>
+          <w:tcPr>
+            <w:tcW w:type="dxa" w:w="1800"/>
+          </w:tcPr>
+          <w:p>
+            <w:pPr>
+              <w:spacing w:after="0"/>
+            </w:pPr>
+            <w:r>
+              <w:rPr>
+                <w:b/>
+                <w:sz w:val="17"/>
+              </w:rPr>
+              <w:t>Profile</w:t>
+            </w:r>
+          </w:p>
+        </w:tc>
+        <w:tc>
+          <w:tcPr>
+            <w:tcW w:type="dxa" w:w="7416"/>
+          </w:tcPr>
+          <w:p>
+            <w:pPr>
+              <w:spacing w:after="0"/>
+            </w:pPr>
+            <w:r>
+              <w:rPr>
+                <w:b/>
+                <w:sz w:val="17"/>
+              </w:rPr>
+              <w:t>Intervals and intended use</w:t>
+            </w:r>
+          </w:p>
+        </w:tc>
+      </w:tr>
+      <w:tr>
+        <w:trPr>
+          <w:cantSplit/>
+        </w:trPr>
+        <w:tc>
+          <w:tcPr>
+            <w:tcW w:type="dxa" w:w="1800"/>
+          </w:tcPr>
+          <w:p>
+            <w:pPr>
+              <w:spacing w:after="0"/>
+            </w:pPr>
+            <w:r>
+              <w:rPr>
+                <w:sz w:val="17"/>
+              </w:rPr>
+              <w:t>SMOKE</w:t>
+            </w:r>
+          </w:p>
+        </w:tc>
+        <w:tc>
+          <w:tcPr>
+            <w:tcW w:type="dxa" w:w="7416"/>
+          </w:tcPr>
+          <w:p>
+            <w:pPr>
+              <w:spacing w:after="0"/>
+            </w:pPr>
+            <w:r>
+              <w:rPr>
+                <w:sz w:val="17"/>
+              </w:rPr>
+              <w:t>14 Dec 14:31 UT and 15 Dec 03:03 UT. Fast end-to-end software and geometry check.</w:t>
+            </w:r>
+          </w:p>
+        </w:tc>
+      </w:tr>
+      <w:tr>
+        <w:trPr>
+          <w:cantSplit/>
+        </w:trPr>
+        <w:tc>
+          <w:tcPr>
+            <w:tcW w:type="dxa" w:w="1800"/>
+          </w:tcPr>
+          <w:p>
+            <w:pPr>
+              <w:spacing w:after="0"/>
+            </w:pPr>
+            <w:r>
+              <w:rPr>
+                <w:sz w:val="17"/>
+              </w:rPr>
+              <w:t>ROUTINE (default)</w:t>
+            </w:r>
+          </w:p>
+        </w:tc>
+        <w:tc>
+          <w:tcPr>
+            <w:tcW w:type="dxa" w:w="7416"/>
+          </w:tcPr>
+          <w:p>
+            <w:pPr>
+              <w:spacing w:after="0"/>
+            </w:pPr>
+            <w:r>
+              <w:rPr>
+                <w:sz w:val="17"/>
+              </w:rPr>
+              <w:t>Seven representative midpoints: 14 Dec 09:49, 14:31, 16:05, 23:55; 15 Dec 03:03, 09:19; and 16 Dec 04:08 UT. Covers pre-shock, shock, early response, main phase, minimum, recovery, and late recovery.</w:t>
+            </w:r>
+          </w:p>
+        </w:tc>
+      </w:tr>
+      <w:tr>
+        <w:trPr>
+          <w:cantSplit/>
+        </w:trPr>
+        <w:tc>
+          <w:tcPr>
+            <w:tcW w:type="dxa" w:w="1800"/>
+          </w:tcPr>
+          <w:p>
+            <w:pPr>
+              <w:spacing w:after="0"/>
+            </w:pPr>
+            <w:r>
+              <w:rPr>
+                <w:sz w:val="17"/>
+              </w:rPr>
+              <w:t>FULL</w:t>
+            </w:r>
+          </w:p>
+        </w:tc>
+        <w:tc>
+          <w:tcPr>
+            <w:tcW w:type="dxa" w:w="7416"/>
+          </w:tcPr>
+          <w:p>
+            <w:pPr>
+              <w:spacing w:after="0"/>
+            </w:pPr>
+            <w:r>
+              <w:rPr>
+                <w:sz w:val="17"/>
+              </w:rPr>
+              <w:t>All 37 Table-S1 midpoints. Intended for publication-quality reproduction and convergence/sensitivity studies.</w:t>
+            </w:r>
+          </w:p>
+        </w:tc>
+      </w:tr>
+    </w:tbl>
+    <w:p>
+      <w:pPr/>
+      <w:r>
+        <w:rPr>
+          <w:b/>
+        </w:rPr>
+        <w:t>Expected behavior and default acceptance:</w:t>
+      </w:r>
+      <w:r/>
+    </w:p>
+    <w:tbl>
+      <w:tblPr>
+        <w:tblStyle w:val="TableGrid"/>
+        <w:tblW w:type="auto" w:w="0"/>
+        <w:tblLayout w:type="fixed"/>
+        <w:tblLook w:firstColumn="1" w:firstRow="1" w:lastColumn="0" w:lastRow="0" w:noHBand="0" w:noVBand="1" w:val="04A0"/>
+      </w:tblPr>
+      <w:tblGrid>
+        <w:gridCol w:w="2664"/>
+        <w:gridCol w:w="6552"/>
+      </w:tblGrid>
+      <w:tr>
+        <w:trPr>
+          <w:cantSplit/>
+          <w:tblHeader w:val="true"/>
+        </w:trPr>
+        <w:tc>
+          <w:tcPr>
+            <w:tcW w:type="dxa" w:w="2664"/>
+          </w:tcPr>
+          <w:p>
+            <w:pPr>
+              <w:spacing w:after="0"/>
+            </w:pPr>
+            <w:r>
+              <w:rPr>
+                <w:b/>
+                <w:sz w:val="17"/>
+              </w:rPr>
+              <w:t>Metric</w:t>
+            </w:r>
+          </w:p>
+        </w:tc>
+        <w:tc>
+          <w:tcPr>
+            <w:tcW w:type="dxa" w:w="6552"/>
+          </w:tcPr>
+          <w:p>
+            <w:pPr>
+              <w:spacing w:after="0"/>
+            </w:pPr>
+            <w:r>
+              <w:rPr>
+                <w:b/>
+                <w:sz w:val="17"/>
+              </w:rPr>
+              <w:t>Default C9 requirement / diagnostic</w:t>
+            </w:r>
+          </w:p>
+        </w:tc>
+      </w:tr>
+      <w:tr>
+        <w:trPr>
+          <w:cantSplit/>
+        </w:trPr>
+        <w:tc>
+          <w:tcPr>
+            <w:tcW w:type="dxa" w:w="2664"/>
+          </w:tcPr>
+          <w:p>
+            <w:pPr>
+              <w:spacing w:after="0"/>
+            </w:pPr>
+            <w:r>
+              <w:rPr>
+                <w:sz w:val="17"/>
+              </w:rPr>
+              <w:t>Physical sign</w:t>
+            </w:r>
+          </w:p>
+        </w:tc>
+        <w:tc>
+          <w:tcPr>
+            <w:tcW w:type="dxa" w:w="6552"/>
+          </w:tcPr>
+          <w:p>
+            <w:pPr>
+              <w:spacing w:after="0"/>
+            </w:pPr>
+            <w:r>
+              <w:rPr>
+                <w:sz w:val="17"/>
+              </w:rPr>
+              <w:t>Cutoff latitude moves equatorward during the main phase and subsequently recovers.</w:t>
+            </w:r>
+          </w:p>
+        </w:tc>
+      </w:tr>
+      <w:tr>
+        <w:trPr>
+          <w:cantSplit/>
+        </w:trPr>
+        <w:tc>
+          <w:tcPr>
+            <w:tcW w:type="dxa" w:w="2664"/>
+          </w:tcPr>
+          <w:p>
+            <w:pPr>
+              <w:spacing w:after="0"/>
+            </w:pPr>
+            <w:r>
+              <w:rPr>
+                <w:sz w:val="17"/>
+              </w:rPr>
+              <w:t>Rigidity ordering</w:t>
+            </w:r>
+          </w:p>
+        </w:tc>
+        <w:tc>
+          <w:tcPr>
+            <w:tcW w:type="dxa" w:w="6552"/>
+          </w:tcPr>
+          <w:p>
+            <w:pPr>
+              <w:spacing w:after="0"/>
+            </w:pPr>
+            <w:r>
+              <w:rPr>
+                <w:sz w:val="17"/>
+              </w:rPr>
+              <w:t>Lower-rigidity bins remain at higher cutoff latitude and exhibit larger storm displacement.</w:t>
+            </w:r>
+          </w:p>
+        </w:tc>
+      </w:tr>
+      <w:tr>
+        <w:trPr>
+          <w:cantSplit/>
+        </w:trPr>
+        <w:tc>
+          <w:tcPr>
+            <w:tcW w:type="dxa" w:w="2664"/>
+          </w:tcPr>
+          <w:p>
+            <w:pPr>
+              <w:spacing w:after="0"/>
+            </w:pPr>
+            <w:r>
+              <w:rPr>
+                <w:sz w:val="17"/>
+              </w:rPr>
+              <w:t>Valid comparison fraction</w:t>
+            </w:r>
+          </w:p>
+        </w:tc>
+        <w:tc>
+          <w:tcPr>
+            <w:tcW w:type="dxa" w:w="6552"/>
+          </w:tcPr>
+          <w:p>
+            <w:pPr>
+              <w:spacing w:after="0"/>
+            </w:pPr>
+            <w:r>
+              <w:rPr>
+                <w:sz w:val="17"/>
+              </w:rPr>
+              <w:t>&gt;= 0.85 of selected nonmissing Table-S1 observations.</w:t>
+            </w:r>
+          </w:p>
+        </w:tc>
+      </w:tr>
+      <w:tr>
+        <w:trPr>
+          <w:cantSplit/>
+        </w:trPr>
+        <w:tc>
+          <w:tcPr>
+            <w:tcW w:type="dxa" w:w="2664"/>
+          </w:tcPr>
+          <w:p>
+            <w:pPr>
+              <w:spacing w:after="0"/>
+            </w:pPr>
+            <w:r>
+              <w:rPr>
+                <w:sz w:val="17"/>
+              </w:rPr>
+              <w:t>Overall latitude RMSE</w:t>
+            </w:r>
+          </w:p>
+        </w:tc>
+        <w:tc>
+          <w:tcPr>
+            <w:tcW w:type="dxa" w:w="6552"/>
+          </w:tcPr>
+          <w:p>
+            <w:pPr>
+              <w:spacing w:after="0"/>
+            </w:pPr>
+            <w:r>
+              <w:rPr>
+                <w:sz w:val="17"/>
+              </w:rPr>
+              <w:t>&lt;= 3.0 deg.</w:t>
+            </w:r>
+          </w:p>
+        </w:tc>
+      </w:tr>
+      <w:tr>
+        <w:trPr>
+          <w:cantSplit/>
+        </w:trPr>
+        <w:tc>
+          <w:tcPr>
+            <w:tcW w:type="dxa" w:w="2664"/>
+          </w:tcPr>
+          <w:p>
+            <w:pPr>
+              <w:spacing w:after="0"/>
+            </w:pPr>
+            <w:r>
+              <w:rPr>
+                <w:sz w:val="17"/>
+              </w:rPr>
+              <w:t>Absolute mean bias</w:t>
+            </w:r>
+          </w:p>
+        </w:tc>
+        <w:tc>
+          <w:tcPr>
+            <w:tcW w:type="dxa" w:w="6552"/>
+          </w:tcPr>
+          <w:p>
+            <w:pPr>
+              <w:spacing w:after="0"/>
+            </w:pPr>
+            <w:r>
+              <w:rPr>
+                <w:sz w:val="17"/>
+              </w:rPr>
+              <w:t>&lt;= 2.0 deg.</w:t>
+            </w:r>
+          </w:p>
+        </w:tc>
+      </w:tr>
+      <w:tr>
+        <w:trPr>
+          <w:cantSplit/>
+        </w:trPr>
+        <w:tc>
+          <w:tcPr>
+            <w:tcW w:type="dxa" w:w="2664"/>
+          </w:tcPr>
+          <w:p>
+            <w:pPr>
+              <w:spacing w:after="0"/>
+            </w:pPr>
+            <w:r>
+              <w:rPr>
+                <w:sz w:val="17"/>
+              </w:rPr>
+              <w:t>PAMELA-AMPS correlation</w:t>
+            </w:r>
+          </w:p>
+        </w:tc>
+        <w:tc>
+          <w:tcPr>
+            <w:tcW w:type="dxa" w:w="6552"/>
+          </w:tcPr>
+          <w:p>
+            <w:pPr>
+              <w:spacing w:after="0"/>
+            </w:pPr>
+            <w:r>
+              <w:rPr>
+                <w:sz w:val="17"/>
+              </w:rPr>
+              <w:t>&gt;= 0.80.</w:t>
+            </w:r>
+          </w:p>
+        </w:tc>
+      </w:tr>
+      <w:tr>
+        <w:trPr>
+          <w:cantSplit/>
+        </w:trPr>
+        <w:tc>
+          <w:tcPr>
+            <w:tcW w:type="dxa" w:w="2664"/>
+          </w:tcPr>
+          <w:p>
+            <w:pPr>
+              <w:spacing w:after="0"/>
+            </w:pPr>
+            <w:r>
+              <w:rPr>
+                <w:sz w:val="17"/>
+              </w:rPr>
+              <w:t>Lowest-bin storm suppression</w:t>
+            </w:r>
+          </w:p>
+        </w:tc>
+        <w:tc>
+          <w:tcPr>
+            <w:tcW w:type="dxa" w:w="6552"/>
+          </w:tcPr>
+          <w:p>
+            <w:pPr>
+              <w:spacing w:after="0"/>
+            </w:pPr>
+            <w:r>
+              <w:rPr>
+                <w:sz w:val="17"/>
+              </w:rPr>
+              <w:t>4-9 deg; observed Table-S1 change is approximately 6.3 deg from 14 Dec 09:49 to 15 Dec 03:03 UT.</w:t>
+            </w:r>
+          </w:p>
+        </w:tc>
+      </w:tr>
+      <w:tr>
+        <w:trPr>
+          <w:cantSplit/>
+        </w:trPr>
+        <w:tc>
+          <w:tcPr>
+            <w:tcW w:type="dxa" w:w="2664"/>
+          </w:tcPr>
+          <w:p>
+            <w:pPr>
+              <w:spacing w:after="0"/>
+            </w:pPr>
+            <w:r>
+              <w:rPr>
+                <w:sz w:val="17"/>
+              </w:rPr>
+              <w:t>Time of lowest-bin minimum</w:t>
+            </w:r>
+          </w:p>
+        </w:tc>
+        <w:tc>
+          <w:tcPr>
+            <w:tcW w:type="dxa" w:w="6552"/>
+          </w:tcPr>
+          <w:p>
+            <w:pPr>
+              <w:spacing w:after="0"/>
+            </w:pPr>
+            <w:r>
+              <w:rPr>
+                <w:sz w:val="17"/>
+              </w:rPr>
+              <w:t>Within 100 minutes (approximately one PAMELA orbit) of the observed 15 Dec 03:03 UT minimum.</w:t>
+            </w:r>
+          </w:p>
+        </w:tc>
+      </w:tr>
+      <w:tr>
+        <w:trPr>
+          <w:cantSplit/>
+        </w:trPr>
+        <w:tc>
+          <w:tcPr>
+            <w:tcW w:type="dxa" w:w="2664"/>
+          </w:tcPr>
+          <w:p>
+            <w:pPr>
+              <w:spacing w:after="0"/>
+            </w:pPr>
+            <w:r>
+              <w:rPr>
+                <w:sz w:val="17"/>
+              </w:rPr>
+              <w:t>Uncertainty diagnostics</w:t>
+            </w:r>
+          </w:p>
+        </w:tc>
+        <w:tc>
+          <w:tcPr>
+            <w:tcW w:type="dxa" w:w="6552"/>
+          </w:tcPr>
+          <w:p>
+            <w:pPr>
+              <w:spacing w:after="0"/>
+            </w:pPr>
+            <w:r>
+              <w:rPr>
+                <w:sz w:val="17"/>
+              </w:rPr>
+              <w:t>Report weighted normalized residual and fractions inside 1-sigma and 2-sigma; do not use statistical uncertainty alone as the pass criterion.</w:t>
+            </w:r>
+          </w:p>
+        </w:tc>
+      </w:tr>
+      <w:tr>
+        <w:tc>
+          <w:tcPr>
+            <w:tcW w:type="dxa" w:w="2664"/>
+          </w:tcPr>
+          <w:p>
+            <w:r>
+              <w:t>Cross-solver diagnostic</w:t>
+            </w:r>
+          </w:p>
+        </w:tc>
+        <w:tc>
+          <w:tcPr>
+            <w:tcW w:type="dxa" w:w="6552"/>
+          </w:tcPr>
+          <w:p>
+            <w:r>
+              <w:t>Report mean, RMSE, and maximum |GRIDDED-GRIDLESS| cutoff-latitude differences. Diagnostic only; both branches must independently meet the PAMELA requirements.</w:t>
+            </w:r>
+          </w:p>
+        </w:tc>
+      </w:tr>
+    </w:tbl>
+    <w:p>
+      <w:pPr/>
+      <w:r>
+        <w:t>The tolerances are wider than the PAMELA statistical errors because C9 is a global-shell public-data approximation. They include practical allowance for longitude/hemisphere aggregation, midpoint-only temporal sampling, one rigidity per finite bin, and use of an Rc_effective contour rather than exact detector acceptance.</w:t>
+      </w:r>
+    </w:p>
+    <w:p>
+      <w:pPr/>
+      <w:r>
+        <w:rPr>
+          <w:b/>
+        </w:rPr>
+        <w:t>Commands:</w:t>
+      </w:r>
+      <w:r/>
+    </w:p>
+    <w:p>
+      <w:pPr>
+        <w:spacing w:before="60" w:after="120"/>
+        <w:ind w:left="360" w:right="216"/>
+        <w:shd w:fill="F2F2F2"/>
+      </w:pPr>
+      <w:r>
+        <w:rPr>
+          <w:rFonts w:ascii="Liberation Mono" w:hAnsi="Liberation Mono"/>
+          <w:sz w:val="16"/>
+        </w:rPr>
+        <w:t># Reference and driver integrity</w:t>
+        <w:br/>
+        <w:t>python3 srcEarth/test/C9/run_C9.py --validate-references --validate-driver</w:t>
+        <w:br/>
+        <w:br/>
+        <w:t># GRIDLESS routine branch</w:t>
+        <w:br/>
+        <w:t>python3 srcEarth/test/C9/run_C9.py --solver GRIDLESS --profile ROUTINE   --cutoff-scan-n 160 --shell-lon-res-deg 30 --shell-lat-res-deg 2 -np 16</w:t>
+        <w:br/>
+        <w:br/>
+        <w:t># GRIDDED Mode3D routine branch</w:t>
+        <w:br/>
+        <w:t>python3 srcEarth/test/C9/run_C9.py --solver GRIDDED --profile ROUTINE   --cutoff-scan-n 160 --shell-lon-res-deg 30 --shell-lat-res-deg 2   --mode3d-mesh-res-earth-re 0.02 --mode3d-mesh-res-boundary-re 2.0   --mode3d-mesh-coarsening LINEAR -np 4 -nt 16</w:t>
+        <w:br/>
+        <w:br/>
+        <w:t># Run both branches and write the cross-solver diagnostic</w:t>
+        <w:br/>
+        <w:t>python3 srcEarth/test/C9/run_C9.py --solver BOTH --profile ROUTINE -np 4 -nt 16</w:t>
+        <w:br/>
+        <w:br/>
+        <w:t># Full interval-averaged two-branch sensitivity run</w:t>
+        <w:br/>
+        <w:t>python3 srcEarth/test/C9/run_C9.py --solver BOTH --profile FULL   --interval-samples 5 -np 8 -nt 16</w:t>
+      </w:r>
+    </w:p>
+    <w:p>
+      <w:pPr/>
+      <w:r>
+        <w:rPr>
+          <w:b/>
+        </w:rPr>
+        <w:t>Archived products:</w:t>
+      </w:r>
+      <w:r/>
+    </w:p>
+    <w:tbl>
+      <w:tblPr>
+        <w:tblStyle w:val="TableGrid"/>
+        <w:tblW w:type="auto" w:w="0"/>
+        <w:tblLayout w:type="fixed"/>
+        <w:tblLook w:firstColumn="1" w:firstRow="1" w:lastColumn="0" w:lastRow="0" w:noHBand="0" w:noVBand="1" w:val="04A0"/>
+      </w:tblPr>
+      <w:tblGrid>
+        <w:gridCol w:w="2448"/>
+        <w:gridCol w:w="6768"/>
+      </w:tblGrid>
+      <w:tr>
+        <w:trPr>
+          <w:cantSplit/>
+          <w:tblHeader w:val="true"/>
+        </w:trPr>
+        <w:tc>
+          <w:tcPr>
+            <w:tcW w:type="dxa" w:w="2448"/>
+          </w:tcPr>
+          <w:p>
+            <w:pPr>
+              <w:spacing w:after="0"/>
+            </w:pPr>
+            <w:r>
+              <w:rPr>
+                <w:b/>
+                <w:sz w:val="17"/>
+              </w:rPr>
+              <w:t>Product</w:t>
+            </w:r>
+          </w:p>
+        </w:tc>
+        <w:tc>
+          <w:tcPr>
+            <w:tcW w:type="dxa" w:w="6768"/>
+          </w:tcPr>
+          <w:p>
+            <w:pPr>
+              <w:spacing w:after="0"/>
+            </w:pPr>
+            <w:r>
+              <w:rPr>
+                <w:b/>
+                <w:sz w:val="17"/>
+              </w:rPr>
+              <w:t>Contents</w:t>
+            </w:r>
+          </w:p>
+        </w:tc>
+      </w:tr>
+      <w:tr>
+        <w:trPr>
+          <w:cantSplit/>
+        </w:trPr>
+        <w:tc>
+          <w:tcPr>
+            <w:tcW w:type="dxa" w:w="2448"/>
+          </w:tcPr>
+          <w:p>
+            <w:pPr>
+              <w:spacing w:after="0"/>
+            </w:pPr>
+            <w:r>
+              <w:rPr>
+                <w:sz w:val="17"/>
+              </w:rPr>
+              <w:t>C9_reference_used.csv</w:t>
+            </w:r>
+          </w:p>
+        </w:tc>
+        <w:tc>
+          <w:tcPr>
+            <w:tcW w:type="dxa" w:w="6768"/>
+          </w:tcPr>
+          <w:p>
+            <w:pPr>
+              <w:spacing w:after="0"/>
+            </w:pPr>
+            <w:r>
+              <w:rPr>
+                <w:sz w:val="17"/>
+              </w:rPr>
+              <w:t>Exact selected Table-S1 values, uncertainties, intervals, and rigidity centers.</w:t>
+            </w:r>
+          </w:p>
+        </w:tc>
+      </w:tr>
+      <w:tr>
+        <w:trPr>
+          <w:cantSplit/>
+        </w:trPr>
+        <w:tc>
+          <w:tcPr>
+            <w:tcW w:type="dxa" w:w="2448"/>
+          </w:tcPr>
+          <w:p>
+            <w:pPr>
+              <w:spacing w:after="0"/>
+            </w:pPr>
+            <w:r>
+              <w:rPr>
+                <w:sz w:val="17"/>
+              </w:rPr>
+              <w:t>C9_driver_info.json</w:t>
+            </w:r>
+          </w:p>
+        </w:tc>
+        <w:tc>
+          <w:tcPr>
+            <w:tcW w:type="dxa" w:w="6768"/>
+          </w:tcPr>
+          <w:p>
+            <w:pPr>
+              <w:spacing w:after="0"/>
+            </w:pPr>
+            <w:r>
+              <w:rPr>
+                <w:sz w:val="17"/>
+              </w:rPr>
+              <w:t>Driver path, SHA-256, provenance, cadence, coverage, and bundled/official verification status.</w:t>
+            </w:r>
+          </w:p>
+        </w:tc>
+      </w:tr>
+      <w:tr>
+        <w:trPr>
+          <w:cantSplit/>
+        </w:trPr>
+        <w:tc>
+          <w:tcPr>
+            <w:tcW w:type="dxa" w:w="2448"/>
+          </w:tcPr>
+          <w:p>
+            <w:pPr>
+              <w:spacing w:after="0"/>
+            </w:pPr>
+            <w:r>
+              <w:rPr>
+                <w:sz w:val="17"/>
+              </w:rPr>
+              <w:t>C9_commands.json</w:t>
+            </w:r>
+          </w:p>
+        </w:tc>
+        <w:tc>
+          <w:tcPr>
+            <w:tcW w:type="dxa" w:w="6768"/>
+          </w:tcPr>
+          <w:p>
+            <w:r>
+              <w:t>Combined command inventory plus a branch-local command inventory under gridless/ and gridded/.</w:t>
+            </w:r>
+          </w:p>
+        </w:tc>
+      </w:tr>
+      <w:tr>
+        <w:trPr>
+          <w:cantSplit/>
+        </w:trPr>
+        <w:tc>
+          <w:tcPr>
+            <w:tcW w:type="dxa" w:w="2448"/>
+          </w:tcPr>
+          <w:p>
+            <w:pPr>
+              <w:spacing w:after="0"/>
+            </w:pPr>
+            <w:r>
+              <w:rPr>
+                <w:sz w:val="17"/>
+              </w:rPr>
+              <w:t>Per-snapshot directories</w:t>
+            </w:r>
+          </w:p>
+        </w:tc>
+        <w:tc>
+          <w:tcPr>
+            <w:tcW w:type="dxa" w:w="6768"/>
+          </w:tcPr>
+          <w:p>
+            <w:r>
+              <w:t>Separate gridless/&lt;interval&gt;/... and gridded/&lt;interval&gt;/... trees containing generated input, execution log, branch-specific raw shell/penumbra output, and extracted AACGM boundaries.</w:t>
+            </w:r>
+          </w:p>
+        </w:tc>
+      </w:tr>
+      <w:tr>
+        <w:trPr>
+          <w:cantSplit/>
+        </w:trPr>
+        <w:tc>
+          <w:tcPr>
+            <w:tcW w:type="dxa" w:w="2448"/>
+          </w:tcPr>
+          <w:p>
+            <w:r>
+              <w:t>gridless/C9_model.csv and gridded/C9_model.csv</w:t>
+            </w:r>
+          </w:p>
+        </w:tc>
+        <w:tc>
+          <w:tcPr>
+            <w:tcW w:type="dxa" w:w="6768"/>
+          </w:tcPr>
+          <w:p>
+            <w:r>
+              <w:t>Branch-specific modeled cutoff latitude and spatial/temporal diagnostics.</w:t>
+            </w:r>
+          </w:p>
+        </w:tc>
+      </w:tr>
+      <w:tr>
+        <w:trPr>
+          <w:cantSplit/>
+        </w:trPr>
+        <w:tc>
+          <w:tcPr>
+            <w:tcW w:type="dxa" w:w="2448"/>
+          </w:tcPr>
+          <w:p>
+            <w:r>
+              <w:t>Branch-local C9_comparison.csv / .png</w:t>
+            </w:r>
+          </w:p>
+        </w:tc>
+        <w:tc>
+          <w:tcPr>
+            <w:tcW w:type="dxa" w:w="6768"/>
+          </w:tcPr>
+          <w:p>
+            <w:r>
+              <w:t>Independent PAMELA comparison and residual plot for GRIDLESS or GRIDDED.</w:t>
+            </w:r>
+          </w:p>
+        </w:tc>
+      </w:tr>
+      <w:tr>
+        <w:trPr>
+          <w:cantSplit/>
+        </w:trPr>
+        <w:tc>
+          <w:tcPr>
+            <w:tcW w:type="dxa" w:w="2448"/>
+          </w:tcPr>
+          <w:p>
+            <w:pPr>
+              <w:spacing w:after="0"/>
+            </w:pPr>
+            <w:r>
+              <w:rPr>
+                <w:sz w:val="17"/>
+              </w:rPr>
+              <w:t>C9_result.json</w:t>
+            </w:r>
+          </w:p>
+        </w:tc>
+        <w:tc>
+          <w:tcPr>
+            <w:tcW w:type="dxa" w:w="6768"/>
+          </w:tcPr>
+          <w:p>
+            <w:r>
+              <w:t>Top-level selected-branch summary plus branch-local configuration, acceptance metrics, pass/fail, and limitations.</w:t>
+            </w:r>
+          </w:p>
+        </w:tc>
+      </w:tr>
+      <w:tr>
+        <w:tc>
+          <w:tcPr>
+            <w:tcW w:type="dxa" w:w="2448"/>
+          </w:tcPr>
+          <w:p>
+            <w:r>
+              <w:t>C9_cross_solver_comparison.csv / result.json</w:t>
+            </w:r>
+          </w:p>
+        </w:tc>
+        <w:tc>
+          <w:tcPr>
+            <w:tcW w:type="dxa" w:w="6768"/>
+          </w:tcPr>
+          <w:p>
+            <w:r>
+              <w:t>Written for --solver BOTH; GRIDDED-minus-GRIDLESS point differences and summary diagnostics.</w:t>
+            </w:r>
+          </w:p>
+        </w:tc>
+      </w:tr>
+    </w:tbl>
+    <w:p>
+      <w:pPr/>
+      <w:r>
+        <w:rPr>
+          <w:b/>
+        </w:rPr>
+        <w:t>Limitations and test hierarchy:</w:t>
+      </w:r>
+      <w:r/>
+    </w:p>
+    <w:p>
+      <w:pPr/>
+      <w:r>
+        <w:t>C9 validates the published PAMELA product without exact spacecraft geometry and must be described as a global-shell public-data comparison. GRIDLESS and GRIDDED are independently judged against PAMELA; their difference is a diagnostic of Mode3D mesh/interpolation effects and is not a replacement acceptance criterion. A future C9B may compare published global cutoff maps, while C9C remains the exact orbit/attitude/acceptance reproduction requiring collaboration ephemeris and pointing. Convergence runs should refine shell latitude, longitude, rigidity scan, interval sampling, and the GRIDDED near-Earth mesh resolution before publication use.</w:t>
+      </w:r>
+    </w:p>
+    <w:p>
+      <w:pPr/>
       <w:r>
         <w:rPr>
           <w:b/>
         </w:rPr>
         <w:t>Reference solution / comparison target:</w:t>
       </w:r>
-    </w:p>
-    <w:p>
-      <w:r>
-        <w:t>Bruno et al. (2015) and Adriani et al. (2016), PAMELA cutoff variations during Dec 2006 SEP/storm events.</w:t>
-      </w:r>
-    </w:p>
-    <w:p>
-      <w:pPr>
-        <w:jc w:val="center"/>
-      </w:pPr>
-      <w:r>
-        <w:drawing>
-          <wp:inline xmlns:a="http://schemas.openxmlformats.org/drawingml/2006/main" xmlns:pic="http://schemas.openxmlformats.org/drawingml/2006/picture">
-            <wp:extent cx="5303520" cy="3977640"/>
-            <wp:docPr id="9" name="Picture 9"/>
-            <wp:cNvGraphicFramePr>
-              <a:graphicFrameLocks noChangeAspect="1"/>
-            </wp:cNvGraphicFramePr>
-            <a:graphic>
-              <a:graphicData uri="http://schemas.openxmlformats.org/drawingml/2006/picture">
-                <pic:pic>
-                  <pic:nvPicPr>
-                    <pic:cNvPr id="0" name="C9_pamela_suppression.png"/>
-                    <pic:cNvPicPr/>
-                  </pic:nvPicPr>
-                  <pic:blipFill>
-                    <a:blip r:embed="rId17"/>
-                    <a:stretch>
-                      <a:fillRect/>
-                    </a:stretch>
-                  </pic:blipFill>
-                  <pic:spPr>
-                    <a:xfrm>
-                      <a:off x="0" y="0"/>
-                      <a:ext cx="5303520" cy="3977640"/>
-                    </a:xfrm>
-                    <a:prstGeom prst="rect"/>
-                  </pic:spPr>
-                </pic:pic>
-              </a:graphicData>
-            </a:graphic>
-          </wp:inline>
-        </w:drawing>
-      </w:r>
-    </w:p>
-    <w:p>
-      <w:pPr>
-        <w:jc w:val="center"/>
-      </w:pPr>
-      <w:r>
-        <w:rPr>
-          <w:i/>
-          <w:sz w:val="16"/>
-        </w:rPr>
-        <w:t>Figure C9 — Reference/target behavior for PAMELA December 2006 storm cutoff.</w:t>
+      <w:r/>
+    </w:p>
+    <w:p>
+      <w:pPr/>
+      <w:r>
+        <w:t>Adriani et al. (2016), main paper and Supporting Information Table S1; Tsyganenko and Sitnov (2005) for the TS05 field model; AACGM-v2 for epoch-dependent geographic-to-AACGM coordinate conversion.</w:t>
+      </w:r>
+    </w:p>
+    <w:p>
+      <w:pPr/>
+      <w:r/>
+    </w:p>
+    <w:p>
+      <w:pPr/>
+      <w:r>
+        <w:t>Figure C9 - Target behavior: PAMELA, GRIDLESS, and GRIDDED AACGM cutoff latitude versus time for all seven rigidity bins, with an equatorward minimum near 15 December 03:03 UT and decreasing displacement with increasing rigidity. A companion residual panel should show each branch minus PAMELA; the optional cross-solver panel shows GRIDDED minus GRIDLESS.</w:t>
       </w:r>
     </w:p>
     <w:p>
@@ -9823,7 +11437,7 @@
         <w:ind w:left="360" w:hanging="360"/>
       </w:pPr>
       <w:r>
-        <w:t>[R9] Adriani, O., et al. / PAMELA Collaboration (2016). PAMELA measurements of geomagnetic cutoff variations during the 14 December 2006 storm. arXiv:1602.05509.</w:t>
+        <w:t>[R9] Adriani, O., et al. / PAMELA Collaboration (2016). PAMELA measurements of geomagnetic cutoff variations during the 14 December 2006 storm. Space Weather, 14, 210-220, doi:10.1002/2016SW001364. Supporting Information Table S1 provides the numerical AACGM cutoff-latitude reference used by C9.</w:t>
       </w:r>
     </w:p>
     <w:p>
@@ -14091,6 +15705,58 @@
           </w:p>
         </w:tc>
       </w:tr>
+      <w:tr>
+        <w:tc>
+          <w:tcPr>
+            <w:tcW w:type="dxa" w:w="2909"/>
+          </w:tcPr>
+          <w:p>
+            <w:r>
+              <w:t>srcEarth/test/C9/AMPS_PARAM_C9_gridless.in</w:t>
+            </w:r>
+          </w:p>
+        </w:tc>
+        <w:tc>
+          <w:tcPr>
+            <w:tcW w:type="dxa" w:w="2909"/>
+          </w:tcPr>
+          <w:p>
+            <w:r>
+              <w:t>gridless cutoff</w:t>
+            </w:r>
+          </w:p>
+        </w:tc>
+        <w:tc>
+          <w:tcPr>
+            <w:tcW w:type="dxa" w:w="2909"/>
+          </w:tcPr>
+          <w:p>
+            <w:r>
+              <w:t>T05 / 475-km SHELLS</w:t>
+            </w:r>
+          </w:p>
+        </w:tc>
+        <w:tc>
+          <w:tcPr>
+            <w:tcW w:type="dxa" w:w="2909"/>
+          </w:tcPr>
+          <w:p>
+            <w:r>
+              <w:t>C9 PAMELA public-data global-shell comparison</w:t>
+            </w:r>
+          </w:p>
+        </w:tc>
+        <w:tc>
+          <w:tcPr>
+            <w:tcW w:type="dxa" w:w="2909"/>
+          </w:tcPr>
+          <w:p>
+            <w:r>
+              <w:t>Implemented numerical input and runner. Uses Table-S1 geometric-center rigidities, PENUMBRA_SCAN Rc_effective contours, aacgmv2 postprocessing, and a provenance-checked official five-minute TS05 driver. Exact PAMELA orbit/attitude is intentionally not required.</w:t>
+            </w:r>
+          </w:p>
+        </w:tc>
+      </w:tr>
     </w:tbl>
     <w:p/>
     <w:p>
@@ -14814,6 +16480,52 @@
             <w:vAlign w:val="top"/>
           </w:tcPr>
           <w:p>
+            <w:r>
+              <w:t>C9</w:t>
+            </w:r>
+          </w:p>
+        </w:tc>
+        <w:tc>
+          <w:tcPr>
+            <w:tcW w:type="dxa" w:w="3168"/>
+            <w:vAlign w:val="top"/>
+          </w:tcPr>
+          <w:p>
+            <w:r>
+              <w:t>PAMELA public-data global-shell storm cutoff</w:t>
+            </w:r>
+          </w:p>
+        </w:tc>
+        <w:tc>
+          <w:tcPr>
+            <w:tcW w:type="dxa" w:w="4464"/>
+            <w:vAlign w:val="top"/>
+          </w:tcPr>
+          <w:p>
+            <w:r>
+              <w:t>srcEarth/test/C9/AMPS_PARAM_C9_gridless.in; reference_C9_pamela_table_s1.csv; run_C9.py</w:t>
+            </w:r>
+          </w:p>
+        </w:tc>
+        <w:tc>
+          <w:tcPr>
+            <w:tcW w:type="dxa" w:w="6768"/>
+            <w:vAlign w:val="top"/>
+          </w:tcPr>
+          <w:p>
+            <w:r>
+              <w:t>Implemented. Requires a prepared official 2006 TS05 event driver and aacgmv2 at runtime. Uses 475-km vertical global shells and geometric rigidity-bin centers; no PAMELA orbit or pointing file is required.</w:t>
+            </w:r>
+          </w:p>
+        </w:tc>
+      </w:tr>
+      <w:tr>
+        <w:tc>
+          <w:tcPr>
+            <w:tcW w:type="dxa" w:w="1080"/>
+            <w:vAlign w:val="top"/>
+          </w:tcPr>
+          <w:p>
             <w:pPr>
               <w:spacing w:after="0" w:before="0"/>
             </w:pPr>
@@ -14823,7 +16535,7 @@
                 <w:b w:val="0"/>
                 <w:sz w:val="13"/>
               </w:rPr>
-              <w:t>C9 / C10 / C15</w:t>
+              <w:t>C12</w:t>
             </w:r>
           </w:p>
         </w:tc>
@@ -14842,7 +16554,7 @@
                 <w:b w:val="0"/>
                 <w:sz w:val="13"/>
               </w:rPr>
-              <w:t>Event-level PAMELA/POES/time-series tests</w:t>
+              <w:t>Mover cross-validation</w:t>
             </w:r>
           </w:p>
         </w:tc>
@@ -14861,7 +16573,7 @@
                 <w:b w:val="0"/>
                 <w:sz w:val="13"/>
               </w:rPr>
-              <w:t>No complete archive file</w:t>
+              <w:t>cutoff-dipole-shells-steadystate.in; AMPS_PARAM_3d_dipole_shells.in</w:t>
             </w:r>
           </w:p>
         </w:tc>
@@ -14880,7 +16592,7 @@
                 <w:b w:val="0"/>
                 <w:sz w:val="13"/>
               </w:rPr>
-              <w:t>Use archive as template only; needs orbit/driver files: omni_dec2006_t05.dat, pamela_orbit_dec2006.dat, POES postprocessing grid.</w:t>
+              <w:t>Run once per -mover BORIS/RK2/RK4/RK6/GC2/GC4/GC6.</w:t>
             </w:r>
           </w:p>
         </w:tc>
@@ -14901,7 +16613,7 @@
                 <w:b w:val="0"/>
                 <w:sz w:val="13"/>
               </w:rPr>
-              <w:t>C12</w:t>
+              <w:t>C13 / C-PARALLEL / C14</w:t>
             </w:r>
           </w:p>
         </w:tc>
@@ -14920,7 +16632,7 @@
                 <w:b w:val="0"/>
                 <w:sz w:val="13"/>
               </w:rPr>
-              <w:t>Mover cross-validation</w:t>
+              <w:t>Scheduler and cross-solver consistency</w:t>
             </w:r>
           </w:p>
         </w:tc>
@@ -14939,7 +16651,7 @@
                 <w:b w:val="0"/>
                 <w:sz w:val="13"/>
               </w:rPr>
-              <w:t>cutoff-dipole-shells-steadystate.in; AMPS_PARAM_3d_dipole_shells.in</w:t>
+              <w:t>Mode3D and gridless dipole shell pairs</w:t>
             </w:r>
           </w:p>
         </w:tc>
@@ -14958,7 +16670,7 @@
                 <w:b w:val="0"/>
                 <w:sz w:val="13"/>
               </w:rPr>
-              <w:t>Run once per -mover BORIS/RK2/RK4/RK6/GC2/GC4/GC6.</w:t>
+              <w:t>Use AMPS_PARAM_3d_dipole_shells.in vs cutoff-dipole-shells-steadystate.in with matched grids.</w:t>
             </w:r>
           </w:p>
         </w:tc>
@@ -14979,7 +16691,7 @@
                 <w:b w:val="0"/>
                 <w:sz w:val="13"/>
               </w:rPr>
-              <w:t>C13 / C-PARALLEL / C14</w:t>
+              <w:t>F1 / F2 / F15</w:t>
             </w:r>
           </w:p>
         </w:tc>
@@ -14998,7 +16710,7 @@
                 <w:b w:val="0"/>
                 <w:sz w:val="13"/>
               </w:rPr>
-              <w:t>Scheduler and cross-solver consistency</w:t>
+              <w:t>Zero-field and power-law density normalization</w:t>
             </w:r>
           </w:p>
         </w:tc>
@@ -15017,7 +16729,7 @@
                 <w:b w:val="0"/>
                 <w:sz w:val="13"/>
               </w:rPr>
-              <w:t>Mode3D and gridless dipole shell pairs</w:t>
+              <w:t>spectrum-dipole-points-steadystate.in; AMPS_PARAM_3d_dipole_points_forward.in</w:t>
             </w:r>
           </w:p>
         </w:tc>
@@ -15036,7 +16748,7 @@
                 <w:b w:val="0"/>
                 <w:sz w:val="13"/>
               </w:rPr>
-              <w:t>Use AMPS_PARAM_3d_dipole_shells.in vs cutoff-dipole-shells-steadystate.in with matched grids.</w:t>
+              <w:t>For true zero-field, create a FIELD_MODEL OFF/UNIFORM test if supported; otherwise use high-latitude/all-access diagnostic points.</w:t>
             </w:r>
           </w:p>
         </w:tc>
@@ -15057,7 +16769,7 @@
                 <w:b w:val="0"/>
                 <w:sz w:val="13"/>
               </w:rPr>
-              <w:t>F1 / F2 / F15</w:t>
+              <w:t>F3 / F4 / F14</w:t>
             </w:r>
           </w:p>
         </w:tc>
@@ -15076,7 +16788,7 @@
                 <w:b w:val="0"/>
                 <w:sz w:val="13"/>
               </w:rPr>
-              <w:t>Zero-field and power-law density normalization</w:t>
+              <w:t>Dipole flux suppression and transmission reconstruction</w:t>
             </w:r>
           </w:p>
         </w:tc>
@@ -15095,7 +16807,7 @@
                 <w:b w:val="0"/>
                 <w:sz w:val="13"/>
               </w:rPr>
-              <w:t>spectrum-dipole-points-steadystate.in; AMPS_PARAM_3d_dipole_points_forward.in</w:t>
+              <w:t>spectrum-dipole-shells-steadystate.in; AMPS_PARAM_3d_dipole_points_forward.in</w:t>
             </w:r>
           </w:p>
         </w:tc>
@@ -15114,7 +16826,7 @@
                 <w:b w:val="0"/>
                 <w:sz w:val="13"/>
               </w:rPr>
-              <w:t>For true zero-field, create a FIELD_MODEL OFF/UNIFORM test if supported; otherwise use high-latitude/all-access diagnostic points.</w:t>
+              <w:t>Add DS_TRANSMISSION_MODE SCAN and save T(E) diagnostics.</w:t>
             </w:r>
           </w:p>
         </w:tc>
@@ -15135,7 +16847,7 @@
                 <w:b w:val="0"/>
                 <w:sz w:val="13"/>
               </w:rPr>
-              <w:t>F3 / F4 / F14</w:t>
+              <w:t>F5 / F11</w:t>
             </w:r>
           </w:p>
         </w:tc>
@@ -15154,7 +16866,7 @@
                 <w:b w:val="0"/>
                 <w:sz w:val="13"/>
               </w:rPr>
-              <w:t>Dipole flux suppression and transmission reconstruction</w:t>
+              <w:t>PAD and anisotropic boundary spectrum</w:t>
             </w:r>
           </w:p>
         </w:tc>
@@ -15173,7 +16885,7 @@
                 <w:b w:val="0"/>
                 <w:sz w:val="13"/>
               </w:rPr>
-              <w:t>spectrum-dipole-shells-steadystate.in; AMPS_PARAM_3d_dipole_points_forward.in</w:t>
+              <w:t>spectrum-dipole-points-steadystate.in</w:t>
             </w:r>
           </w:p>
         </w:tc>
@@ -15192,7 +16904,7 @@
                 <w:b w:val="0"/>
                 <w:sz w:val="13"/>
               </w:rPr>
-              <w:t>Add DS_TRANSMISSION_MODE SCAN and save T(E) diagnostics.</w:t>
+              <w:t>Create BA_PAD_MODEL matrix copies; current archive has isotropic power-law only.</w:t>
             </w:r>
           </w:p>
         </w:tc>
@@ -15213,7 +16925,7 @@
                 <w:b w:val="0"/>
                 <w:sz w:val="13"/>
               </w:rPr>
-              <w:t>F5 / F11</w:t>
+              <w:t>F6 / F7 / F13</w:t>
             </w:r>
           </w:p>
         </w:tc>
@@ -15232,7 +16944,7 @@
                 <w:b w:val="0"/>
                 <w:sz w:val="13"/>
               </w:rPr>
-              <w:t>PAD and anisotropic boundary spectrum</w:t>
+              <w:t>Quadrature, parallel reproducibility, scheduler matrix</w:t>
             </w:r>
           </w:p>
         </w:tc>
@@ -15251,7 +16963,7 @@
                 <w:b w:val="0"/>
                 <w:sz w:val="13"/>
               </w:rPr>
-              <w:t>spectrum-dipole-points-steadystate.in</w:t>
+              <w:t>spectrum-dipole-shells-steadystate.in; spectrum-t96-shells-steadystate.in</w:t>
             </w:r>
           </w:p>
         </w:tc>
@@ -15270,7 +16982,7 @@
                 <w:b w:val="0"/>
                 <w:sz w:val="13"/>
               </w:rPr>
-              <w:t>Create BA_PAD_MODEL matrix copies; current archive has isotropic power-law only.</w:t>
+              <w:t>Run SERIAL/OPENMP/THREADS and STATIC/BLOCK_CYCLIC/DYNAMIC cross-product.</w:t>
             </w:r>
           </w:p>
         </w:tc>
@@ -15291,7 +17003,7 @@
                 <w:b w:val="0"/>
                 <w:sz w:val="13"/>
               </w:rPr>
-              <w:t>F6 / F7 / F13</w:t>
+              <w:t>F8 / F9 / F10 / F17</w:t>
             </w:r>
           </w:p>
         </w:tc>
@@ -15310,7 +17022,7 @@
                 <w:b w:val="0"/>
                 <w:sz w:val="13"/>
               </w:rPr>
-              <w:t>Quadrature, parallel reproducibility, scheduler matrix</w:t>
+              <w:t>GOES, LEO, POES/SAMPEX, event closure</w:t>
             </w:r>
           </w:p>
         </w:tc>
@@ -15329,7 +17041,7 @@
                 <w:b w:val="0"/>
                 <w:sz w:val="13"/>
               </w:rPr>
-              <w:t>spectrum-dipole-shells-steadystate.in; spectrum-t96-shells-steadystate.in</w:t>
+              <w:t>AMPS_PARAM_3d_t96_points_forward.in; spectrum-t96-*.in; swmf/*</w:t>
             </w:r>
           </w:p>
         </w:tc>
@@ -15348,7 +17060,7 @@
                 <w:b w:val="0"/>
                 <w:sz w:val="13"/>
               </w:rPr>
-              <w:t>Run SERIAL/OPENMP/THREADS and STATIC/BLOCK_CYCLIC/DYNAMIC cross-product.</w:t>
+              <w:t>Requires mission ephemerides and event driver data. Archive files are templates, not sufficient final validation cases.</w:t>
             </w:r>
           </w:p>
         </w:tc>
@@ -15369,7 +17081,7 @@
                 <w:b w:val="0"/>
                 <w:sz w:val="13"/>
               </w:rPr>
-              <w:t>F8 / F9 / F10 / F17</w:t>
+              <w:t>F12 / F16</w:t>
             </w:r>
           </w:p>
         </w:tc>
@@ -15388,7 +17100,7 @@
                 <w:b w:val="0"/>
                 <w:sz w:val="13"/>
               </w:rPr>
-              <w:t>GOES, LEO, POES/SAMPEX, event closure</w:t>
+              <w:t>Spatial boundary anisotropy and blocked-access regression</w:t>
             </w:r>
           </w:p>
         </w:tc>
@@ -15407,7 +17119,7 @@
                 <w:b w:val="0"/>
                 <w:sz w:val="13"/>
               </w:rPr>
-              <w:t>AMPS_PARAM_3d_t96_points_forward.in; spectrum-t96-*.in; swmf/*</w:t>
+              <w:t>spectrum-dipole-points-steadystate.in</w:t>
             </w:r>
           </w:p>
         </w:tc>
@@ -15426,7 +17138,7 @@
                 <w:b w:val="0"/>
                 <w:sz w:val="13"/>
               </w:rPr>
-              <w:t>Requires mission ephemerides and event driver data. Archive files are templates, not sufficient final validation cases.</w:t>
+              <w:t>Create BA_SPATIAL_MODEL=DAYSIDE_NIGHTSIDE and artificially blocked-boundary copies.</w:t>
             </w:r>
           </w:p>
         </w:tc>
@@ -15434,77 +17146,41 @@
       <w:tr>
         <w:tc>
           <w:tcPr>
-            <w:tcW w:type="dxa" w:w="1080"/>
-            <w:vAlign w:val="top"/>
-          </w:tcPr>
-          <w:p>
-            <w:pPr>
-              <w:spacing w:after="0" w:before="0"/>
-            </w:pPr>
-            <w:r/>
-            <w:r>
-              <w:rPr>
-                <w:b w:val="0"/>
-                <w:sz w:val="13"/>
-              </w:rPr>
-              <w:t>F12 / F16</w:t>
-            </w:r>
-          </w:p>
-        </w:tc>
-        <w:tc>
-          <w:tcPr>
-            <w:tcW w:type="dxa" w:w="3168"/>
-            <w:vAlign w:val="top"/>
-          </w:tcPr>
-          <w:p>
-            <w:pPr>
-              <w:spacing w:after="0" w:before="0"/>
-            </w:pPr>
-            <w:r/>
-            <w:r>
-              <w:rPr>
-                <w:b w:val="0"/>
-                <w:sz w:val="13"/>
-              </w:rPr>
-              <w:t>Spatial boundary anisotropy and blocked-access regression</w:t>
-            </w:r>
-          </w:p>
-        </w:tc>
-        <w:tc>
-          <w:tcPr>
-            <w:tcW w:type="dxa" w:w="4464"/>
-            <w:vAlign w:val="top"/>
-          </w:tcPr>
-          <w:p>
-            <w:pPr>
-              <w:spacing w:after="0" w:before="0"/>
-            </w:pPr>
-            <w:r/>
-            <w:r>
-              <w:rPr>
-                <w:b w:val="0"/>
-                <w:sz w:val="13"/>
-              </w:rPr>
-              <w:t>spectrum-dipole-points-steadystate.in</w:t>
-            </w:r>
-          </w:p>
-        </w:tc>
-        <w:tc>
-          <w:tcPr>
-            <w:tcW w:type="dxa" w:w="6768"/>
-            <w:vAlign w:val="top"/>
-          </w:tcPr>
-          <w:p>
-            <w:pPr>
-              <w:spacing w:after="0" w:before="0"/>
-            </w:pPr>
-            <w:r/>
-            <w:r>
-              <w:rPr>
-                <w:b w:val="0"/>
-                <w:sz w:val="13"/>
-              </w:rPr>
-              <w:t>Create BA_SPATIAL_MODEL=DAYSIDE_NIGHTSIDE and artificially blocked-boundary copies.</w:t>
+            <w:tcW w:type="dxa" w:w="3636"/>
+          </w:tcPr>
+          <w:p>
+            <w:r>
+              <w:t>C9B / C9C / C10 / C15</w:t>
+            </w:r>
+          </w:p>
+        </w:tc>
+        <w:tc>
+          <w:tcPr>
+            <w:tcW w:type="dxa" w:w="3636"/>
+          </w:tcPr>
+          <w:p>
+            <w:r>
+              <w:t>Future map/exact-orbit PAMELA and POES/time-series extensions</w:t>
+            </w:r>
+          </w:p>
+        </w:tc>
+        <w:tc>
+          <w:tcPr>
+            <w:tcW w:type="dxa" w:w="3636"/>
+          </w:tcPr>
+          <w:p>
+            <w:r>
+              <w:t>C9 input as a template plus mission geometry/map products</w:t>
+            </w:r>
+          </w:p>
+        </w:tc>
+        <w:tc>
+          <w:tcPr>
+            <w:tcW w:type="dxa" w:w="3636"/>
+          </w:tcPr>
+          <w:p>
+            <w:r>
+              <w:t>C9B needs digitized/machine-readable PAMELA global maps. C9C needs definitive Resurs-DK1 ephemeris, attitude, PAMELA mounting/acceptance, and track directions. C10/C15 still need POES/MLT products and event-specific postprocessing.</w:t>
             </w:r>
           </w:p>
         </w:tc>
@@ -15653,6 +17329,30 @@
             <w:vAlign w:val="top"/>
           </w:tcPr>
           <w:p>
+            <w:r>
+              <w:t>C9 bundled 2006 TS05 event driver</w:t>
+            </w:r>
+          </w:p>
+        </w:tc>
+        <w:tc>
+          <w:tcPr>
+            <w:tcW w:type="dxa" w:w="12024"/>
+            <w:vAlign w:val="top"/>
+          </w:tcPr>
+          <w:p>
+            <w:r>
+              <w:t>Use the checked-in srcEarth/test/C9/data/ts05_driving.txt supplied for this validation. The runner verifies its fixed SHA-256 digest, five-minute cadence, monotonic timestamps, maximum gap, and coverage. The PAMELA Table-S1 CSV, C9 numerical input, AACGM algorithm, comparison logic, and driver are implemented and bundled.</w:t>
+            </w:r>
+          </w:p>
+        </w:tc>
+      </w:tr>
+      <w:tr>
+        <w:tc>
+          <w:tcPr>
+            <w:tcW w:type="dxa" w:w="3240"/>
+            <w:vAlign w:val="top"/>
+          </w:tcPr>
+          <w:p>
             <w:pPr>
               <w:spacing w:after="0" w:before="0"/>
             </w:pPr>
@@ -15662,7 +17362,7 @@
                 <w:b w:val="0"/>
                 <w:sz w:val="14"/>
               </w:rPr>
-              <w:t>PAMELA Dec 2006 event</w:t>
+              <w:t>POES/MLT boundary</w:t>
             </w:r>
           </w:p>
         </w:tc>
@@ -15681,7 +17381,7 @@
                 <w:b w:val="0"/>
                 <w:sz w:val="14"/>
               </w:rPr>
-              <w:t>Add pamela_orbit_dec2006.dat and omni_dec2006_t05.dat; set TEMPORAL_MODE TIME_SERIES, FIELD_UPDATE_DT 5, CUTOFF_RIGIDITY_LIST_GV 0.4 0.6 1 2 5.</w:t>
+              <w:t>Add MLT/CGM output or postprocessing script; use global 850-km shell and postprocess cutoff latitude vs MLT.</w:t>
             </w:r>
           </w:p>
         </w:tc>
@@ -15702,7 +17402,7 @@
                 <w:b w:val="0"/>
                 <w:sz w:val="14"/>
               </w:rPr>
-              <w:t>POES/MLT boundary</w:t>
+              <w:t>BA_PAD_MODEL matrix</w:t>
             </w:r>
           </w:p>
         </w:tc>
@@ -15721,7 +17421,7 @@
                 <w:b w:val="0"/>
                 <w:sz w:val="14"/>
               </w:rPr>
-              <w:t>Add MLT/CGM output or postprocessing script; use global 850-km shell and postprocess cutoff latitude vs MLT.</w:t>
+              <w:t>Clone spectrum-dipole-points-steadystate.in into PAD test files for ISOTROPIC, FIELD_ALIGNED, BIDIRECTIONAL, TRANSVERSE, and |cos alpha|^n variants.</w:t>
             </w:r>
           </w:p>
         </w:tc>
@@ -15742,7 +17442,7 @@
                 <w:b w:val="0"/>
                 <w:sz w:val="14"/>
               </w:rPr>
-              <w:t>BA_PAD_MODEL matrix</w:t>
+              <w:t>BA_SPATIAL_MODEL=DAYSIDE_NIGHTSIDE</w:t>
             </w:r>
           </w:p>
         </w:tc>
@@ -15761,7 +17461,7 @@
                 <w:b w:val="0"/>
                 <w:sz w:val="14"/>
               </w:rPr>
-              <w:t>Clone spectrum-dipole-points-steadystate.in into PAD test files for ISOTROPIC, FIELD_ALIGNED, BIDIRECTIONAL, TRANSVERSE, and |cos alpha|^n variants.</w:t>
+              <w:t>Clone spectrum-dipole-points-steadystate.in with dayside/nightside boundary amplitudes to exercise F12.</w:t>
             </w:r>
           </w:p>
         </w:tc>
@@ -15782,7 +17482,7 @@
                 <w:b w:val="0"/>
                 <w:sz w:val="14"/>
               </w:rPr>
-              <w:t>BA_SPATIAL_MODEL=DAYSIDE_NIGHTSIDE</w:t>
+              <w:t>True zero-field normalization</w:t>
             </w:r>
           </w:p>
         </w:tc>
@@ -15801,7 +17501,7 @@
                 <w:b w:val="0"/>
                 <w:sz w:val="14"/>
               </w:rPr>
-              <w:t>Clone spectrum-dipole-points-steadystate.in with dayside/nightside boundary amplitudes to exercise F12.</w:t>
+              <w:t>Add a no-field or uniform-field input if the parser supports it. This is the cleanest density/flux normalization test.</w:t>
             </w:r>
           </w:p>
         </w:tc>
@@ -15822,7 +17522,7 @@
                 <w:b w:val="0"/>
                 <w:sz w:val="14"/>
               </w:rPr>
-              <w:t>True zero-field normalization</w:t>
+              <w:t>SWMF-coupled closure</w:t>
             </w:r>
           </w:p>
         </w:tc>
@@ -15841,7 +17541,7 @@
                 <w:b w:val="0"/>
                 <w:sz w:val="14"/>
               </w:rPr>
-              <w:t>Add a no-field or uniform-field input if the parser supports it. This is the cleanest density/flux normalization test.</w:t>
+              <w:t>Bundle SWMF restart files, upstream driver data, and matching AMPS/SWMF cadence definitions with swmf/PARAM.in and swmf/geospace.input.</w:t>
             </w:r>
           </w:p>
         </w:tc>
@@ -15849,39 +17549,21 @@
       <w:tr>
         <w:tc>
           <w:tcPr>
-            <w:tcW w:type="dxa" w:w="3240"/>
-            <w:vAlign w:val="top"/>
-          </w:tcPr>
-          <w:p>
-            <w:pPr>
-              <w:spacing w:after="0" w:before="0"/>
-            </w:pPr>
-            <w:r/>
-            <w:r>
-              <w:rPr>
-                <w:b w:val="0"/>
-                <w:sz w:val="14"/>
-              </w:rPr>
-              <w:t>SWMF-coupled closure</w:t>
-            </w:r>
-          </w:p>
-        </w:tc>
-        <w:tc>
-          <w:tcPr>
-            <w:tcW w:type="dxa" w:w="12024"/>
-            <w:vAlign w:val="top"/>
-          </w:tcPr>
-          <w:p>
-            <w:pPr>
-              <w:spacing w:after="0" w:before="0"/>
-            </w:pPr>
-            <w:r/>
-            <w:r>
-              <w:rPr>
-                <w:b w:val="0"/>
-                <w:sz w:val="14"/>
-              </w:rPr>
-              <w:t>Bundle SWMF restart files, upstream driver data, and matching AMPS/SWMF cadence definitions with swmf/PARAM.in and swmf/geospace.input.</w:t>
+            <w:tcW w:type="dxa" w:w="7272"/>
+          </w:tcPr>
+          <w:p>
+            <w:r>
+              <w:t>C9C exact PAMELA geometry</w:t>
+            </w:r>
+          </w:p>
+        </w:tc>
+        <w:tc>
+          <w:tcPr>
+            <w:tcW w:type="dxa" w:w="7272"/>
+          </w:tcPr>
+          <w:p>
+            <w:r>
+              <w:t>Obtain definitive Resurs-DK1 ephemeris and attitude, PAMELA-to-spacecraft mounting matrix, acceptance definition, and reconstructed event directions from the collaboration. These are not required by the implemented public-data C9 global-shell test.</w:t>
             </w:r>
           </w:p>
         </w:tc>

</xml_diff>

<commit_message>
Improve C9 T50 consistency checks and align FULL_SCAN/DIRECT_ACCESS processing
</commit_message>
<xml_diff>
--- a/srcEarth/test/validation.docx
+++ b/srcEarth/test/validation.docx
@@ -3338,7 +3338,7 @@
     <w:p>
       <w:pPr/>
       <w:r>
-        <w:t>C9 is the routinely executable public-data form of the December 2006 PAMELA storm test. It validates the time-dependent AMPS IGRF+T05/TS05 vertical-access boundary against the numerical AACGM cutoff latitudes in Adriani et al. (2016) Supporting Information Table S1. The same scientific observable is evaluated through two explicit solver branches: GRIDLESS direct empirical-field evaluation and the GRIDDED standalone Mode3D AMR-mesh/interpolation path. C9 deliberately avoids dependence on nonpublic Resurs-DK1 attitude, the PAMELA mounting matrix, and event-level track directions.</w:t>
+        <w:t>C9 is the routinely executable public-data form of the December 2006 PAMELA storm test. It validates the time-dependent AMPS IGRF+T05/TS05 vertical-access boundary against the numerical AACGM cutoff latitudes in Adriani et al. (2016) Supporting Information Table S1. C9 provides two numerical products, FULL_SCAN and DIRECT_ACCESS, but both now use the same primary scientific observable: PAMELA_T50, the longitude-averaged vertical transmission T=0.5 latitude calculated separately in the north and south AACGM hemispheres. FULL_SCAN preserves the complete PENUMBRA_SCAN calculation and supports GRIDLESS direct empirical-field evaluation, GRIDDED standalone Mode3D AMR-mesh/interpolation, or both. It also saves exact access states at the seven PAMELA rigidity centers. DIRECT_ACCESS is an efficient GRIDDED-only product that traces only those seven rigidities in a selected latitude band. C9 deliberately avoids dependence on nonpublic Resurs-DK1 attitude, the PAMELA mounting matrix, and event-level track directions.</w:t>
       </w:r>
     </w:p>
     <w:p>
@@ -3715,13 +3715,16 @@
         </w:tc>
       </w:tr>
       <w:tr>
+        <w:trPr>
+          <w:cantSplit/>
+        </w:trPr>
         <w:tc>
           <w:tcPr>
             <w:tcW w:type="dxa" w:w="1944"/>
           </w:tcPr>
           <w:p>
             <w:r>
-              <w:t>Solver branches</w:t>
+              <w:t>Products and solver branches</w:t>
             </w:r>
           </w:p>
         </w:tc>
@@ -3731,12 +3734,15 @@
           </w:tcPr>
           <w:p>
             <w:r>
-              <w:t>GRIDLESS direct field evaluation and GRIDDED Mode3D mesh/interpolation; --solver BOTH is the runner default.</w:t>
+              <w:t>FULL_SCAN: complete-shell PENUMBRA_SCAN plus exact seven-rigidity access states, with GRIDLESS, GRIDDED, or BOTH. DIRECT_ACCESS: exact seven-rigidity access states within a selected latitude band, GRIDDED only. Both use PAMELA_T50 for pass/fail.</w:t>
             </w:r>
           </w:p>
         </w:tc>
       </w:tr>
       <w:tr>
+        <w:trPr>
+          <w:cantSplit/>
+        </w:trPr>
         <w:tc>
           <w:tcPr>
             <w:tcW w:type="dxa" w:w="1944"/>
@@ -3754,6 +3760,56 @@
           <w:p>
             <w:r>
               <w:t>0.02 Re near Earth, 2.0 Re at the boundary, LINEAR coarsening, exponent 1.0.</w:t>
+            </w:r>
+          </w:p>
+        </w:tc>
+      </w:tr>
+      <w:tr>
+        <w:trPr>
+          <w:cantSplit/>
+        </w:trPr>
+        <w:tc>
+          <w:tcPr>
+            <w:tcW w:type="dxa" w:w="1944"/>
+          </w:tcPr>
+          <w:p>
+            <w:r>
+              <w:t>DIRECT_ACCESS latitude band</w:t>
+            </w:r>
+          </w:p>
+        </w:tc>
+        <w:tc>
+          <w:tcPr>
+            <w:tcW w:type="dxa" w:w="7272"/>
+          </w:tcPr>
+          <w:p>
+            <w:r>
+              <w:t>Default 35 &lt;= |geodetic latitude| &lt;= 75 deg, retaining both hemispheres and all longitudes. At 30 deg x 2 deg spacing this selects 480 of 1092 shell nodes. The band must bracket T=0.5 in both hemispheres.</w:t>
+            </w:r>
+          </w:p>
+        </w:tc>
+      </w:tr>
+      <w:tr>
+        <w:trPr>
+          <w:cantSplit/>
+        </w:trPr>
+        <w:tc>
+          <w:tcPr>
+            <w:tcW w:type="dxa" w:w="1944"/>
+          </w:tcPr>
+          <w:p>
+            <w:r>
+              <w:t>Nominal work per snapshot</w:t>
+            </w:r>
+          </w:p>
+        </w:tc>
+        <w:tc>
+          <w:tcPr>
+            <w:tcW w:type="dxa" w:w="7272"/>
+          </w:tcPr>
+          <w:p>
+            <w:r>
+              <w:t>FULL_SCAN: 1092 x (160 regular scan values + 7 exact PAMELA values) = up to 182,364 nominal classifications before penumbra refinement. DIRECT_ACCESS: 480 x 7 = 3,360 trajectories, approximately a factor of 54 reduction.</w:t>
             </w:r>
           </w:p>
         </w:tc>
@@ -3762,7 +3818,7 @@
     <w:p>
       <w:pPr/>
       <w:r>
-        <w:t>Implemented AMPS inputs and solver branches:</w:t>
+        <w:t>Implemented AMPS inputs, cutoff products, and solver branches:</w:t>
       </w:r>
     </w:p>
     <w:p>
@@ -3772,10 +3828,6 @@
         <w:shd w:fill="F2F2F2"/>
       </w:pPr>
       <w:r>
-        <w:rPr>
-          <w:rFonts w:ascii="Liberation Mono" w:hAnsi="Liberation Mono"/>
-          <w:sz w:val="16"/>
-        </w:rPr>
         <w:t>Common physics and shell controls:</w:t>
         <w:br/>
         <w:t>#CALCULATION_MODE</w:t>
@@ -3787,39 +3839,70 @@
         <w:br/>
         <w:t>CUTOFF_SAMPLING           VERTICAL</w:t>
         <w:br/>
+        <w:t>CUTOFF_BACKTRACE_CHARGE   REVERSED</w:t>
+        <w:br/>
+        <w:t>CUTOFF_TRACE_LIMIT_POLICY FORBIDDEN</w:t>
+        <w:br/>
+        <w:t>CUTOFF_MAX_TRAJ_TIME      20.0</w:t>
+        <w:br/>
+        <w:t>CUTOFF_RIGIDITY_LIST_GV   &lt;seven exact centers derived from reference CSV&gt;</w:t>
+        <w:br/>
+        <w:br/>
+        <w:t>#BACKGROUND_FIELD</w:t>
+        <w:br/>
+        <w:t>FIELD_MODEL               T05</w:t>
+        <w:br/>
+        <w:t>EPOCH                     &lt;Table-S1 interval sample UTC&gt;</w:t>
+        <w:br/>
+        <w:t>DRIVER_FILE               &lt;bundled C9 five-minute TS05 driver&gt;</w:t>
+        <w:br/>
+        <w:br/>
+        <w:t>#OUTPUT_DOMAIN</w:t>
+        <w:br/>
+        <w:t>OUTPUT_MODE               SHELLS</w:t>
+        <w:br/>
+        <w:t>SHELL_ALTS_KM             475.0</w:t>
+        <w:br/>
+        <w:t>SHELL_LON_RES_DEG         30.0</w:t>
+        <w:br/>
+        <w:t>SHELL_LAT_RES_DEG         2.0</w:t>
+        <w:br/>
+        <w:t>SHELL_GEOMETRY            GEODETIC</w:t>
+        <w:br/>
+        <w:br/>
+        <w:t>FULL_SCAN product (backward-compatible default):</w:t>
+        <w:br/>
         <w:t>CUTOFF_SEARCH_ALGORITHM   PENUMBRA_SCAN</w:t>
         <w:br/>
         <w:t>CUTOFF_UPPER_SCAN_N       160</w:t>
         <w:br/>
         <w:t>CUTOFF_SCAN_SPACING       LINEAR</w:t>
         <w:br/>
-        <w:t>CUTOFF_BACKTRACE_CHARGE   REVERSED</w:t>
-        <w:br/>
-        <w:t>CUTOFF_TRACE_LIMIT_POLICY FORBIDDEN</w:t>
-        <w:br/>
-        <w:t>CUTOFF_MAX_TRAJ_TIME      20.0</w:t>
-        <w:br/>
-        <w:br/>
-        <w:t>#BACKGROUND_FIELD</w:t>
-        <w:br/>
-        <w:t>FIELD_MODEL               T05</w:t>
-        <w:br/>
-        <w:t>EPOCH                     &lt;Table-S1 interval sample UTC&gt;</w:t>
-        <w:br/>
-        <w:t>DRIVER_FILE               &lt;bundled C9 five-minute TS05 driver&gt;</w:t>
-        <w:br/>
-        <w:br/>
-        <w:t>#OUTPUT_DOMAIN</w:t>
-        <w:br/>
-        <w:t>OUTPUT_MODE               SHELLS</w:t>
-        <w:br/>
-        <w:t>SHELL_ALTS_KM             475.0</w:t>
-        <w:br/>
-        <w:t>SHELL_LON_RES_DEG         30.0</w:t>
-        <w:br/>
-        <w:t>SHELL_LAT_RES_DEG         2.0</w:t>
-        <w:br/>
-        <w:t>SHELL_GEOMETRY            GEODETIC</w:t>
+        <w:t>GRIDLESS raw outputs: cutoff_gridless_shells_penumbra.dat and cutoff_gridless_shells_pamela_access.dat</w:t>
+        <w:br/>
+        <w:t>GRIDDED raw outputs: cutoff_3d_shells_penumbra.dat and cutoff_3d_shells_pamela_access.dat</w:t>
+        <w:br/>
+        <w:br/>
+        <w:t>DIRECT_ACCESS product (GRIDDED only):</w:t>
+        <w:br/>
+        <w:t>CUTOFF_SEARCH_ALGORITHM   RIGIDITY_LIST</w:t>
+        <w:br/>
+        <w:t>CUTOFF_ACCESS_ABS_LAT_MIN 35.0</w:t>
+        <w:br/>
+        <w:t>CUTOFF_ACCESS_ABS_LAT_MAX 75.0</w:t>
+        <w:br/>
+        <w:t>raw output: cutoff_3d_shells_access.dat</w:t>
+        <w:br/>
+        <w:t>state codes: 0=PHYSICAL_FORBIDDEN, 1=ALLOWED, 2=UNRESOLVED</w:t>
+        <w:br/>
+        <w:br/>
+        <w:t>Primary comparison observable:</w:t>
+        <w:br/>
+        <w:t>--comparison-observable PAMELA_T50</w:t>
+        <w:br/>
+        <w:t>--t50-grid-step-deg 0.25</w:t>
+        <w:br/>
+        <w:t>--t50-min-resolved-longitude-fraction 0.80</w:t>
         <w:br/>
         <w:br/>
         <w:t>GRIDLESS branch:</w:t>
@@ -3828,8 +3911,6 @@
         <w:br/>
         <w:t>launch: -mode gridless</w:t>
         <w:br/>
-        <w:t>raw output: cutoff_gridless_shells_penumbra.dat</w:t>
-        <w:br/>
         <w:br/>
         <w:t>GRIDDED branch:</w:t>
         <w:br/>
@@ -3844,14 +3925,12 @@
         <w:t>MODE3D_MESH_COARSENING      LINEAR</w:t>
         <w:br/>
         <w:t>MODE3D_MESH_EXPONENT        1.0</w:t>
-        <w:br/>
-        <w:t>raw output: cutoff_3d_shells_penumbra.dat</w:t>
       </w:r>
     </w:p>
     <w:p>
       <w:pPr/>
       <w:r>
-        <w:t>The complete numerical templates are srcEarth/test/C9/AMPS_PARAM_C9_gridless.in and srcEarth/test/C9/AMPS_PARAM_C9_mode3d.in. The runner applies identical event epochs, driver values, shell coordinates, rigidity bracket, mover, trajectory limits, AACGM conversion, contour extraction, and PAMELA acceptance metrics to both branches. It changes only named directives and archives every generated input and command. The default 0.30-1.35 GV proton bracket covers all seven reference-bin centers; 160 linear samples give a nominal rigidity spacing of approximately 0.0066 GV.</w:t>
+        <w:t>The complete numerical templates are srcEarth/test/C9/AMPS_PARAM_C9_gridless.in and srcEarth/test/C9/AMPS_PARAM_C9_mode3d.in. The runner exposes --cutoff-evaluation FULL_SCAN|DIRECT_ACCESS and --comparison-observable PAMELA_T50|RC_LOWER|RC_EFFECTIVE|RC_UPPER|ALL. PAMELA_T50 is the default and the only primary observable shared by both numerical products. During FULL_SCAN, a nonempty CUTOFF_RIGIDITY_LIST_GV requests exact companion access states without changing the regular 160-node penumbra scan or its Rc_lower/Rc_effective/Rc_upper diagnostics. DIRECT_ACCESS traces only the explicit reference rigidities and is rejected with GRIDLESS or BOTH. The seven rigidities are derived from the checked reference CSV rather than duplicated as independent constants. Every sample receives both an explicit --epoch command-line override and the same EPOCH in its generated input. The runner archives every generated input and command and prints the total number of AMPS launches before execution.</w:t>
       </w:r>
     </w:p>
     <w:p>
@@ -3953,7 +4032,7 @@
               <w:rPr>
                 <w:sz w:val="17"/>
               </w:rPr>
-              <w:t>1. Field snapshots</w:t>
+              <w:t>1. Product selection</w:t>
             </w:r>
           </w:p>
         </w:tc>
@@ -3962,14 +4041,8 @@
             <w:tcW w:type="dxa" w:w="7416"/>
           </w:tcPr>
           <w:p>
-            <w:pPr>
-              <w:spacing w:after="0"/>
-            </w:pPr>
-            <w:r>
-              <w:rPr>
-                <w:sz w:val="17"/>
-              </w:rPr>
-              <w:t>For each selected Table-S1 interval, run one midpoint snapshot by default. --interval-samples N uses N equally spaced samples across the 94-minute interval.</w:t>
+            <w:r>
+              <w:t>Select --cutoff-evaluation FULL_SCAN (default) or DIRECT_ACCESS and --comparison-observable PAMELA_T50 (default). FULL_SCAN supports GRIDLESS, GRIDDED, or BOTH; DIRECT_ACCESS requires GRIDDED.</w:t>
             </w:r>
           </w:p>
         </w:tc>
@@ -3990,7 +4063,7 @@
               <w:rPr>
                 <w:sz w:val="17"/>
               </w:rPr>
-              <w:t>2. AMPS shell result</w:t>
+              <w:t>2. Field snapshots</w:t>
             </w:r>
           </w:p>
         </w:tc>
@@ -4000,7 +4073,7 @@
           </w:tcPr>
           <w:p>
             <w:r>
-              <w:t>Read cutoff_gridless_shells_penumbra.dat for GRIDLESS or cutoff_3d_shells_penumbra.dat for GRIDDED. Retain Rc_lower, Rc_effective, Rc_upper, transition counts, unresolved counts, and range/bracket flags.</w:t>
+              <w:t>For each selected Table-S1 interval, run one midpoint snapshot by default. --interval-samples N uses N samples per selected interval and solver branch; the runner prints the total launch arithmetic before execution. The exact epoch appears in both the command and generated input.</w:t>
             </w:r>
           </w:p>
         </w:tc>
@@ -4021,7 +4094,7 @@
               <w:rPr>
                 <w:sz w:val="17"/>
               </w:rPr>
-              <w:t>3. AACGM conversion</w:t>
+              <w:t>3. AMPS raw result</w:t>
             </w:r>
           </w:p>
         </w:tc>
@@ -4030,14 +4103,8 @@
             <w:tcW w:type="dxa" w:w="7416"/>
           </w:tcPr>
           <w:p>
-            <w:pPr>
-              <w:spacing w:after="0"/>
-            </w:pPr>
-            <w:r>
-              <w:rPr>
-                <w:sz w:val="17"/>
-              </w:rPr>
-              <w:t>Convert every geographic shell point at the exact snapshot UTC and 475-km altitude with the aacgmv2 G2A transformation.</w:t>
+            <w:r>
+              <w:t>FULL_SCAN writes its normal penumbra file and a companion *_pamela_access.dat file containing exact 0/1/2 states at the seven PAMELA rigidities. DIRECT_ACCESS writes cutoff_3d_shells_access.dat with the same long-form schema. Redundant allowed/unresolved flags are cross-checked.</w:t>
             </w:r>
           </w:p>
         </w:tc>
@@ -4058,7 +4125,7 @@
               <w:rPr>
                 <w:sz w:val="17"/>
               </w:rPr>
-              <w:t>4. Longitude/hemisphere profiles</w:t>
+              <w:t>4. AACGM conversion</w:t>
             </w:r>
           </w:p>
         </w:tc>
@@ -4067,14 +4134,8 @@
             <w:tcW w:type="dxa" w:w="7416"/>
           </w:tcPr>
           <w:p>
-            <w:pPr>
-              <w:spacing w:after="0"/>
-            </w:pPr>
-            <w:r>
-              <w:rPr>
-                <w:sz w:val="17"/>
-              </w:rPr>
-              <w:t>At each geographic longitude, separate north/south AACGM hemispheres and sort points by increasing absolute AACGM latitude.</w:t>
+            <w:r>
+              <w:t>Convert every retained geographic shell point at the exact snapshot UTC and 475-km altitude with the aacgmv2 G2A transformation.</w:t>
             </w:r>
           </w:p>
         </w:tc>
@@ -4095,7 +4156,7 @@
               <w:rPr>
                 <w:sz w:val="17"/>
               </w:rPr>
-              <w:t>5. Rigidity contour</w:t>
+              <w:t>5. Longitude/hemisphere profiles</w:t>
             </w:r>
           </w:p>
         </w:tc>
@@ -4104,14 +4165,8 @@
             <w:tcW w:type="dxa" w:w="7416"/>
           </w:tcPr>
           <w:p>
-            <w:pPr>
-              <w:spacing w:after="0"/>
-            </w:pPr>
-            <w:r>
-              <w:rPr>
-                <w:sz w:val="17"/>
-              </w:rPr>
-              <w:t>For each geometric-center rigidity R, find the first poleward transition Rc_effective &gt; R to Rc_effective &lt;= R and linearly interpolate its absolute AACGM latitude.</w:t>
+            <w:r>
+              <w:t>For each rigidity, group rows by geographic longitude, separate north/south AACGM hemispheres, and interpolate each resolved 0/1 profile onto a common absolute-AACGM latitude grid. UNRESOLVED terminates interpolation across that segment.</w:t>
             </w:r>
           </w:p>
         </w:tc>
@@ -4132,7 +4187,7 @@
               <w:rPr>
                 <w:sz w:val="17"/>
               </w:rPr>
-              <w:t>6. Spatial aggregation</w:t>
+              <w:t>6. FULL_SCAN boundary</w:t>
             </w:r>
           </w:p>
         </w:tc>
@@ -4141,14 +4196,8 @@
             <w:tcW w:type="dxa" w:w="7416"/>
           </w:tcPr>
           <w:p>
-            <w:pPr>
-              <w:spacing w:after="0"/>
-            </w:pPr>
-            <w:r>
-              <w:rPr>
-                <w:sz w:val="17"/>
-              </w:rPr>
-              <w:t>Use the median of valid longitude/hemisphere crossings as the snapshot cutoff. Retain mean, standard deviation, range, north/south medians, and multiple-transition counts.</w:t>
+            <w:r>
+              <w:t>Primary FULL_SCAN pass/fail uses the same fixed-rigidity PAMELA_T50 algorithm as DIRECT_ACCESS. Rc_lower, Rc_effective, and Rc_upper contours remain selectable diagnostics and are written together when --comparison-observable ALL is used.</w:t>
             </w:r>
           </w:p>
         </w:tc>
@@ -4169,7 +4218,7 @@
               <w:rPr>
                 <w:sz w:val="17"/>
               </w:rPr>
-              <w:t>7. Temporal aggregation</w:t>
+              <w:t>7. DIRECT_ACCESS boundary</w:t>
             </w:r>
           </w:p>
         </w:tc>
@@ -4178,14 +4227,8 @@
             <w:tcW w:type="dxa" w:w="7416"/>
           </w:tcPr>
           <w:p>
-            <w:pPr>
-              <w:spacing w:after="0"/>
-            </w:pPr>
-            <w:r>
-              <w:rPr>
-                <w:sz w:val="17"/>
-              </w:rPr>
-              <w:t>For N &gt; 1 snapshots, average the N snapshot medians so every field epoch has equal weight in the 94-minute interval.</w:t>
+            <w:r>
+              <w:t>At each common AACGM latitude, compute raw transmission as the mean resolved access state across longitudes. Exclude points below the minimum resolved-longitude fraction. Fit a weighted nondecreasing transmission with the pool-adjacent-violators algorithm and interpolate T=0.5.</w:t>
             </w:r>
           </w:p>
         </w:tc>
@@ -4206,7 +4249,7 @@
               <w:rPr>
                 <w:sz w:val="17"/>
               </w:rPr>
-              <w:t>8. Comparison</w:t>
+              <w:t>8. Spatial aggregation</w:t>
             </w:r>
           </w:p>
         </w:tc>
@@ -4215,26 +4258,23 @@
             <w:tcW w:type="dxa" w:w="7416"/>
           </w:tcPr>
           <w:p>
-            <w:pPr>
-              <w:spacing w:after="0"/>
-            </w:pPr>
-            <w:r>
-              <w:rPr>
-                <w:sz w:val="17"/>
-              </w:rPr>
-              <w:t>Join by Table-S1 midpoint and rigidity bin; compute residuals, uncertainty-normalized residuals, RMSE, bias, correlation, storm suppression, and minimum-time error.</w:t>
+            <w:r>
+              <w:t>Fit north and south independently. Require both hemispheres to bracket T=0.5, then use their median as the snapshot cutoff. Retain raw T50, isotonic adjustment RMS, coverage, unresolved fraction, north-south difference, and longitude profiles with multiple resolved state changes.</w:t>
             </w:r>
           </w:p>
         </w:tc>
       </w:tr>
       <w:tr>
+        <w:trPr>
+          <w:cantSplit/>
+        </w:trPr>
         <w:tc>
           <w:tcPr>
             <w:tcW w:type="dxa" w:w="1800"/>
           </w:tcPr>
           <w:p>
             <w:r>
-              <w:t>9. Branch comparison</w:t>
+              <w:t>9. Temporal aggregation</w:t>
             </w:r>
           </w:p>
         </w:tc>
@@ -4244,7 +4284,57 @@
           </w:tcPr>
           <w:p>
             <w:r>
-              <w:t>Judge GRIDLESS and GRIDDED independently against PAMELA. When both are selected, write the GRIDDED-minus-GRIDLESS cutoff-latitude table and summary as a mesh/interpolation diagnostic.</w:t>
+              <w:t>For N &gt; 1 snapshots, average the N snapshot T50 boundaries so every requested field epoch has equal weight in the 94-minute interval.</w:t>
+            </w:r>
+          </w:p>
+        </w:tc>
+      </w:tr>
+      <w:tr>
+        <w:trPr>
+          <w:cantSplit/>
+        </w:trPr>
+        <w:tc>
+          <w:tcPr>
+            <w:tcW w:type="dxa" w:w="1800"/>
+          </w:tcPr>
+          <w:p>
+            <w:r>
+              <w:t>10. PAMELA comparison</w:t>
+            </w:r>
+          </w:p>
+        </w:tc>
+        <w:tc>
+          <w:tcPr>
+            <w:tcW w:type="dxa" w:w="7416"/>
+          </w:tcPr>
+          <w:p>
+            <w:r>
+              <w:t>Join by Table-S1 midpoint and rigidity bin; compute residuals, uncertainty-normalized residuals, RMSE, bias, correlation, storm suppression, and minimum-time error.</w:t>
+            </w:r>
+          </w:p>
+        </w:tc>
+      </w:tr>
+      <w:tr>
+        <w:trPr>
+          <w:cantSplit/>
+        </w:trPr>
+        <w:tc>
+          <w:tcPr>
+            <w:tcW w:type="dxa" w:w="1800"/>
+          </w:tcPr>
+          <w:p>
+            <w:r>
+              <w:t>11. Solver/product diagnostics</w:t>
+            </w:r>
+          </w:p>
+        </w:tc>
+        <w:tc>
+          <w:tcPr>
+            <w:tcW w:type="dxa" w:w="7416"/>
+          </w:tcPr>
+          <w:p>
+            <w:r>
+              <w:t>Judge each selected branch independently against PAMELA. BOTH writes GRIDDED-minus-GRIDLESS. Separate FULL_SCAN and DIRECT_ACCESS PAMELA_T50 runs test method consistency; differences no longer reflect different scientific boundary definitions.</w:t>
             </w:r>
           </w:p>
         </w:tc>
@@ -4380,7 +4470,7 @@
               <w:rPr>
                 <w:sz w:val="17"/>
               </w:rPr>
-              <w:t>Seven representative midpoints: 14 Dec 09:49, 14:31, 16:05, 23:55; 15 Dec 03:03, 09:19; and 16 Dec 04:08 UT. Covers pre-shock, shock, early response, main phase, minimum, recovery, and late recovery.</w:t>
+              <w:t>Seven representative midpoints: 14 Dec 09:49, 14:31, 16:05, 23:55; 15 Dec 03:03, 09:19; and 16 Dec 04:08 UT. Covers pre-shock, shock, early response, main phase, minimum, recovery, and late recovery. DIRECT_ACCESS is the recommended frequent GRIDDED product; FULL_SCAN remains the penumbra-reference product.</w:t>
             </w:r>
           </w:p>
         </w:tc>
@@ -4417,7 +4507,7 @@
               <w:rPr>
                 <w:sz w:val="17"/>
               </w:rPr>
-              <w:t>All 37 Table-S1 midpoints. Intended for publication-quality reproduction and convergence/sensitivity studies.</w:t>
+              <w:t>All 37 Table-S1 midpoints. Intended for publication-quality reproduction and convergence/sensitivity studies. Use multiple interval samples when computationally feasible.</w:t>
             </w:r>
           </w:p>
         </w:tc>
@@ -4818,6 +4908,9 @@
         </w:tc>
       </w:tr>
       <w:tr>
+        <w:trPr>
+          <w:cantSplit/>
+        </w:trPr>
         <w:tc>
           <w:tcPr>
             <w:tcW w:type="dxa" w:w="2664"/>
@@ -4834,7 +4927,32 @@
           </w:tcPr>
           <w:p>
             <w:r>
-              <w:t>Report mean, RMSE, and maximum |GRIDDED-GRIDLESS| cutoff-latitude differences. Diagnostic only; both branches must independently meet the PAMELA requirements.</w:t>
+              <w:t>For FULL_SCAN/BOTH, report mean, RMSE, and maximum |GRIDDED-GRIDLESS| PAMELA_T50 differences. Diagnostic only; both branches are independently compared with PAMELA.</w:t>
+            </w:r>
+          </w:p>
+        </w:tc>
+      </w:tr>
+      <w:tr>
+        <w:trPr>
+          <w:cantSplit/>
+        </w:trPr>
+        <w:tc>
+          <w:tcPr>
+            <w:tcW w:type="dxa" w:w="2664"/>
+          </w:tcPr>
+          <w:p>
+            <w:r>
+              <w:t>Common-observable method diagnostic</w:t>
+            </w:r>
+          </w:p>
+        </w:tc>
+        <w:tc>
+          <w:tcPr>
+            <w:tcW w:type="dxa" w:w="6552"/>
+          </w:tcPr>
+          <w:p>
+            <w:r>
+              <w:t>Compare GRIDDED DIRECT_ACCESS PAMELA_T50 with GRIDDED FULL_SCAN PAMELA_T50. Differences diagnose latitude sampling and execution-path consistency; Rc contours are reported separately as scientific diagnostics.</w:t>
             </w:r>
           </w:p>
         </w:tc>
@@ -4843,7 +4961,7 @@
     <w:p>
       <w:pPr/>
       <w:r>
-        <w:t>The tolerances are wider than the PAMELA statistical errors because C9 is a global-shell public-data approximation. They include practical allowance for longitude/hemisphere aggregation, midpoint-only temporal sampling, one rigidity per finite bin, and use of an Rc_effective contour rather than exact detector acceptance.</w:t>
+        <w:t>The tolerances are wider than the PAMELA statistical errors because C9 is a global-shell public-data approximation. They include practical allowance for longitude aggregation, midpoint-only temporal sampling, one rigidity per finite bin, lack of exact spacecraft acceptance, and magnetic-field/model discretization. They no longer compensate for a FULL_SCAN-versus-DIRECT_ACCESS observable mismatch: both products use the same PAMELA_T50 algorithm. A T50 boundary is invalid when either hemisphere does not bracket T=0.5 or when resolved-longitude coverage falls below the configured threshold. Rc_lower, Rc_effective, and Rc_upper remain diagnostic products rather than substitutes for PAMELA_T50.</w:t>
       </w:r>
     </w:p>
     <w:p>
@@ -4863,33 +4981,34 @@
         <w:shd w:fill="F2F2F2"/>
       </w:pPr>
       <w:r>
-        <w:rPr>
-          <w:rFonts w:ascii="Liberation Mono" w:hAnsi="Liberation Mono"/>
-          <w:sz w:val="16"/>
-        </w:rPr>
         <w:t># Reference and driver integrity</w:t>
         <w:br/>
         <w:t>python3 srcEarth/test/C9/run_C9.py --validate-references --validate-driver</w:t>
         <w:br/>
         <w:br/>
-        <w:t># GRIDLESS routine branch</w:t>
-        <w:br/>
-        <w:t>python3 srcEarth/test/C9/run_C9.py --solver GRIDLESS --profile ROUTINE   --cutoff-scan-n 160 --shell-lon-res-deg 30 --shell-lat-res-deg 2 -np 16</w:t>
-        <w:br/>
-        <w:br/>
-        <w:t># GRIDDED Mode3D routine branch</w:t>
-        <w:br/>
-        <w:t>python3 srcEarth/test/C9/run_C9.py --solver GRIDDED --profile ROUTINE   --cutoff-scan-n 160 --shell-lon-res-deg 30 --shell-lat-res-deg 2   --mode3d-mesh-res-earth-re 0.02 --mode3d-mesh-res-boundary-re 2.0   --mode3d-mesh-coarsening LINEAR -np 4 -nt 16</w:t>
-        <w:br/>
-        <w:br/>
-        <w:t># Run both branches and write the cross-solver diagnostic</w:t>
-        <w:br/>
-        <w:t>python3 srcEarth/test/C9/run_C9.py --solver BOTH --profile ROUTINE -np 4 -nt 16</w:t>
-        <w:br/>
-        <w:br/>
-        <w:t># Full interval-averaged two-branch sensitivity run</w:t>
-        <w:br/>
-        <w:t>python3 srcEarth/test/C9/run_C9.py --solver BOTH --profile FULL   --interval-samples 5 -np 8 -nt 16</w:t>
+        <w:t># Efficient GRIDDED routine regression: one midpoint per selected interval</w:t>
+        <w:br/>
+        <w:t>python3 srcEarth/test/C9/run_C9.py --solver GRIDDED --cutoff-evaluation DIRECT_ACCESS --comparison-observable PAMELA_T50 --profile ROUTINE --interval-samples 1 --access-abs-lat-min-deg 35 --access-abs-lat-max-deg 75 --t50-grid-step-deg 0.25 --t50-min-resolved-longitude-fraction 0.8 --output-root test_output/C9_direct --amps /home/vtenishe/T11/AMPS/amps --shell-lon-res-deg 30 --shell-lat-res-deg 2 --dynamic-chunk 64 -np 4 -nt 16</w:t>
+        <w:br/>
+        <w:br/>
+        <w:t># Complete GRIDDED penumbra scan reduced through the same PAMELA_T50 observable</w:t>
+        <w:br/>
+        <w:t>python3 srcEarth/test/C9/run_C9.py --solver GRIDDED --cutoff-evaluation FULL_SCAN --comparison-observable PAMELA_T50 --profile ROUTINE --interval-samples 1 --output-root test_output/C9_full --amps /home/vtenishe/T11/AMPS/amps --cutoff-scan-n 160 --shell-lon-res-deg 30 --shell-lat-res-deg 2 --t50-grid-step-deg 0.25 --t50-min-resolved-longitude-fraction 0.8 --dynamic-chunk 64 -np 4 -nt 16</w:t>
+        <w:br/>
+        <w:br/>
+        <w:t># Full scan plus Rc_lower/Rc_effective/Rc_upper diagnostic boundary files</w:t>
+        <w:br/>
+        <w:t>python3 srcEarth/test/C9/run_C9.py --solver GRIDDED --cutoff-evaluation FULL_SCAN --comparison-observable ALL --profile ROUTINE --interval-samples 1 --output-root test_output/C9_all_observables --amps /home/vtenishe/T11/AMPS/amps --cutoff-scan-n 160 --dynamic-chunk 64 -np 4 -nt 16</w:t>
+        <w:br/>
+        <w:br/>
+        <w:t># Five-sample diagnostic of only the observed minimum interval (five launches total)</w:t>
+        <w:br/>
+        <w:t>python3 srcEarth/test/C9/run_C9.py --solver GRIDDED --cutoff-evaluation DIRECT_ACCESS --comparison-observable PAMELA_T50 --timestamps 2006-12-15T03:03:00Z --interval-samples 5 --output-root test_output/C9_0303_5samples --amps /home/vtenishe/T11/AMPS/amps --dynamic-chunk 64 -np 4 -nt 16</w:t>
+        <w:br/>
+        <w:br/>
+        <w:t># Preview exact sample epochs, launch count, commands, and generated inputs</w:t>
+        <w:br/>
+        <w:t>python3 srcEarth/test/C9/run_C9.py --solver GRIDDED --cutoff-evaluation DIRECT_ACCESS --comparison-observable PAMELA_T50 --profile SMOKE --interval-samples 5 --dry-run --output-root test_output/C9_direct_dry -np 4 -nt 16</w:t>
       </w:r>
     </w:p>
     <w:p>
@@ -5084,7 +5203,7 @@
           </w:tcPr>
           <w:p>
             <w:r>
-              <w:t>Separate gridless/&lt;interval&gt;/... and gridded/&lt;interval&gt;/... trees containing generated input, execution log, branch-specific raw shell/penumbra output, and extracted AACGM boundaries.</w:t>
+              <w:t>Generated input, log, explicit epoch, primary C9_snapshot_boundaries.csv, C9_snapshot_t50_profiles.csv, product-specific exact access-state file, and FULL_SCAN penumbra/diagnostic boundary files.</w:t>
             </w:r>
           </w:p>
         </w:tc>
@@ -5109,7 +5228,7 @@
           </w:tcPr>
           <w:p>
             <w:r>
-              <w:t>Branch-specific modeled cutoff latitude and spatial/temporal diagnostics.</w:t>
+              <w:t>Branch/product-specific PAMELA_T50 latitude plus temporal scatter, north-south difference, resolved-longitude coverage, unresolved fraction, isotonic adjustment, and nonmonotonic-profile diagnostics.</w:t>
             </w:r>
           </w:p>
         </w:tc>
@@ -5134,7 +5253,7 @@
           </w:tcPr>
           <w:p>
             <w:r>
-              <w:t>Independent PAMELA comparison and residual plot for GRIDLESS or GRIDDED.</w:t>
+              <w:t>Independent PAMELA comparison and residual plot. PAMELA and AMPS use the same color for the same rigidity; line style and marker distinguish the data source, and PAMELA uncertainties are plotted as error bars.</w:t>
             </w:r>
           </w:p>
         </w:tc>
@@ -5165,19 +5284,22 @@
           </w:tcPr>
           <w:p>
             <w:r>
-              <w:t>Top-level selected-branch summary plus branch-local configuration, acceptance metrics, pass/fail, and limitations.</w:t>
+              <w:t>Top-level branch summary plus selected evaluation and observable, T50 grid and coverage controls, exact rigidity list, acceptance metrics, pass/fail, driver provenance, and limitations.</w:t>
             </w:r>
           </w:p>
         </w:tc>
       </w:tr>
       <w:tr>
+        <w:trPr>
+          <w:cantSplit/>
+        </w:trPr>
         <w:tc>
           <w:tcPr>
             <w:tcW w:type="dxa" w:w="2448"/>
           </w:tcPr>
           <w:p>
             <w:r>
-              <w:t>C9_cross_solver_comparison.csv / result.json</w:t>
+              <w:t>Cross-solver CSV/JSON</w:t>
             </w:r>
           </w:p>
         </w:tc>
@@ -5187,7 +5309,54 @@
           </w:tcPr>
           <w:p>
             <w:r>
-              <w:t>Written for --solver BOTH; GRIDDED-minus-GRIDLESS point differences and summary diagnostics.</w:t>
+              <w:t>Written only for --solver BOTH with FULL_SCAN; GRIDDED-minus-GRIDLESS point differences and summary diagnostics.</w:t>
+            </w:r>
+          </w:p>
+        </w:tc>
+      </w:tr>
+      <w:tr>
+        <w:trPr>
+          <w:cantSplit/>
+        </w:trPr>
+        <w:tc>
+          <w:tcPr>
+            <w:tcW w:type="dxa" w:w="2448"/>
+          </w:tcPr>
+          <w:p>
+            <w:r>
+              <w:t>Exact access-state files</w:t>
+            </w:r>
+          </w:p>
+        </w:tc>
+        <w:tc>
+          <w:tcPr>
+            <w:tcW w:type="dxa" w:w="6768"/>
+          </w:tcPr>
+          <w:p>
+            <w:r>
+              <w:t>cutoff_3d_shells_access.dat for DIRECT_ACCESS; cutoff_3d_shells_pamela_access.dat and cutoff_gridless_shells_pamela_access.dat for FULL_SCAN. Every file uses one row per node/rigidity with state 0/1/2 and redundant flags.</w:t>
+            </w:r>
+          </w:p>
+        </w:tc>
+      </w:tr>
+      <w:tr>
+        <w:tc>
+          <w:tcPr>
+            <w:tcW w:type="dxa" w:w="2448"/>
+          </w:tcPr>
+          <w:p>
+            <w:r>
+              <w:t>Boundary/profile diagnostics</w:t>
+            </w:r>
+          </w:p>
+        </w:tc>
+        <w:tc>
+          <w:tcPr>
+            <w:tcW w:type="dxa" w:w="6768"/>
+          </w:tcPr>
+          <w:p>
+            <w:r>
+              <w:t>C9_snapshot_boundaries_pamela_t50.csv and, for FULL_SCAN/ALL, C9_snapshot_boundaries_rc_lower.csv, rc_effective.csv, and rc_upper.csv; C9_snapshot_t50_profiles.csv contains raw and isotonic transmission versus AACGM latitude.</w:t>
             </w:r>
           </w:p>
         </w:tc>
@@ -5206,7 +5375,7 @@
     <w:p>
       <w:pPr/>
       <w:r>
-        <w:t>C9 validates the published PAMELA product without exact spacecraft geometry and must be described as a global-shell public-data comparison. GRIDLESS and GRIDDED are independently judged against PAMELA; their difference is a diagnostic of Mode3D mesh/interpolation effects and is not a replacement acceptance criterion. A future C9B may compare published global cutoff maps, while C9C remains the exact orbit/attitude/acceptance reproduction requiring collaboration ephemeris and pointing. Convergence runs should refine shell latitude, longitude, rigidity scan, interval sampling, and the GRIDDED near-Earth mesh resolution before publication use.</w:t>
+        <w:t>C9 validates the published PAMELA product without exact spacecraft geometry and must be described as a global-shell public-data comparison. FULL_SCAN and DIRECT_ACCESS now differ only in how the same seven fixed-rigidity access states are obtained; both are reduced through the identical longitude-averaged, hemisphere-resolved PAMELA_T50 postprocessor. FULL_SCAN additionally provides Rc_lower/Rc_effective/Rc_upper and penumbra-topology diagnostics. DIRECT_ACCESS retains all configured longitudes and both hemispheres but omits nodes outside its selected geodetic latitude band; the band must be widened when either hemisphere fails to bracket T=0.5. Weighted isotonic regression prevents a first low-latitude allowed island from being selected as the cutoff, while preserving raw-profile and nonmonotonic diagnostics. GRIDLESS and GRIDDED are independently judged for FULL_SCAN, and their difference diagnoses Mode3D mesh/interpolation effects. A future C9B may compare published global cutoff maps, while C9C remains the exact orbit/attitude/acceptance reproduction requiring collaboration ephemeris and pointing. Publication use should include latitude, longitude, temporal-sampling, mesh, and FULL_SCAN-versus-DIRECT_ACCESS consistency checks.</w:t>
       </w:r>
     </w:p>
     <w:p>
@@ -5232,7 +5401,7 @@
     <w:p>
       <w:pPr/>
       <w:r>
-        <w:t>Figure C9 - Target behavior: PAMELA, GRIDLESS, and GRIDDED AACGM cutoff latitude versus time for all seven rigidity bins, with an equatorward minimum near 15 December 03:03 UT and decreasing displacement with increasing rigidity. A companion residual panel should show each branch minus PAMELA; the optional cross-solver panel shows GRIDDED minus GRIDLESS.</w:t>
+        <w:t>Figure C9 - Target behavior: PAMELA and AMPS AACGM cutoff latitude versus time for all seven rigidity bins, with an equatorward minimum near 15 December 03:03 UT and decreasing displacement with increasing rigidity. PAMELA and AMPS use the same color for the same rigidity; dashed circles with error bars identify PAMELA and solid x-marked curves identify AMPS. The plot title records the selected observable. FULL_SCAN GRIDLESS/GRIDDED residuals diagnose mesh effects, while a DIRECT_ACCESS-versus-FULL_SCAN comparison made with PAMELA_T50 tests numerical-method consistency rather than different boundary definitions.</w:t>
       </w:r>
     </w:p>
     <w:p>

</xml_diff>

<commit_message>
srcEarth: first implementation of test C10
</commit_message>
<xml_diff>
--- a/srcEarth/test/validation.docx
+++ b/srcEarth/test/validation.docx
@@ -5409,89 +5409,7 @@
         <w:pStyle w:val="Heading2"/>
       </w:pPr>
       <w:r>
-        <w:t>C10. POES SEP elliptical cutoff boundary</w:t>
-      </w:r>
-    </w:p>
-    <w:p>
-      <w:r>
-        <w:t>Validates global high-latitude cutoff-boundary shape, MLT asymmetry, and storm-time displacement using POES-derived empirical boundaries.</w:t>
-      </w:r>
-    </w:p>
-    <w:p>
-      <w:r>
-        <w:rPr>
-          <w:b/>
-        </w:rPr>
-        <w:t>Essential input parameters:</w:t>
-      </w:r>
-    </w:p>
-    <w:p>
-      <w:pPr>
-        <w:spacing w:after="80"/>
-      </w:pPr>
-      <w:r>
-        <w:rPr>
-          <w:rFonts w:ascii="Courier New" w:hAnsi="Courier New" w:eastAsia="Courier New"/>
-          <w:sz w:val="16"/>
-        </w:rPr>
-        <w:t>#NUMERICAL</w:t>
-        <w:br/>
-        <w:t>MODE3D_MPI_SCHEDULER      DYNAMIC</w:t>
-        <w:br/>
-        <w:t>MODE3D_MPI_DYNAMIC_CHUNK  0</w:t>
-        <w:br/>
-        <w:t>MODE3D_PARALLEL           THREADS</w:t>
-        <w:br/>
-        <w:t>MODE3D_THREADS            8</w:t>
-        <w:br/>
-        <w:t>CUTOFF_SEARCH_ALGORITHM   UPPER_SCAN</w:t>
-        <w:br/>
-        <w:t>CUTOFF_UPPER_SCAN_N       80</w:t>
-        <w:br/>
-        <w:br/>
-        <w:t>FIELD_MODEL               T05</w:t>
-        <w:br/>
-        <w:t>TEMPORAL_MODE             TIME_SERIES</w:t>
-        <w:br/>
-        <w:t>EVENT_START               2006-12-05T00:00</w:t>
-        <w:br/>
-        <w:t>EVENT_END                 2006-12-15T00:00</w:t>
-        <w:br/>
-        <w:t>FIELD_UPDATE_DT           5</w:t>
-        <w:br/>
-        <w:t>OUTPUT_MODE               SHELLS</w:t>
-        <w:br/>
-        <w:t>SHELL_ALT_KM              850</w:t>
-        <w:br/>
-        <w:t>SHELL_LON_RES             5.0</w:t>
-        <w:br/>
-        <w:t>SHELL_LAT_RES             2.0</w:t>
-        <w:br/>
-        <w:t>CUTOFF_RIGIDITY_LIST_GV   0.1 0.2 0.5 1.0</w:t>
-        <w:br/>
-        <w:t>COORDS_OUTPUT             MLT_CGM</w:t>
-        <w:br/>
-      </w:r>
-    </w:p>
-    <w:p>
-      <w:r>
-        <w:rPr>
-          <w:b/>
-        </w:rPr>
-        <w:t>Calculation locations:</w:t>
-      </w:r>
-    </w:p>
-    <w:p>
-      <w:r>
-        <w:t>Global LEO shell near POES altitude; postprocess cutoff latitude versus MLT in north/south hemispheres.</w:t>
-      </w:r>
-    </w:p>
-    <w:p>
-      <w:r>
-        <w:rPr>
-          <w:b/>
-        </w:rPr>
-        <w:t>Expected output values / acceptance targets:</w:t>
+        <w:t>C10. POES/MetOp measured proton-access boundary</w:t>
       </w:r>
     </w:p>
     <w:tbl>
@@ -5546,13 +5464,8 @@
             <w:vAlign w:val="top"/>
           </w:tcPr>
           <w:p>
-            <w:r/>
-            <w:r>
-              <w:rPr>
-                <w:b w:val="0"/>
-                <w:sz w:val="16"/>
-              </w:rPr>
-              <w:t>Boundary shape</w:t>
+            <w:r>
+              <w:t>Primary boundary product</w:t>
             </w:r>
           </w:p>
         </w:tc>
@@ -5562,13 +5475,8 @@
             <w:vAlign w:val="top"/>
           </w:tcPr>
           <w:p>
-            <w:r/>
-            <w:r>
-              <w:rPr>
-                <w:b w:val="0"/>
-                <w:sz w:val="16"/>
-              </w:rPr>
-              <w:t>well represented by ellipse in polar/MLT coordinates</w:t>
+            <w:r>
+              <w:t>MLT-sector, hemisphere-resolved ACCESS_T50 from exact P6-P9 access states; first-harmonic morphology is diagnostic</w:t>
             </w:r>
           </w:p>
         </w:tc>
@@ -5580,12 +5488,7 @@
             <w:vAlign w:val="top"/>
           </w:tcPr>
           <w:p>
-            <w:r/>
-            <w:r>
-              <w:rPr>
-                <w:b w:val="0"/>
-                <w:sz w:val="16"/>
-              </w:rPr>
+            <w:r>
               <w:t>Storm response</w:t>
             </w:r>
           </w:p>
@@ -5596,13 +5499,8 @@
             <w:vAlign w:val="top"/>
           </w:tcPr>
           <w:p>
-            <w:r/>
-            <w:r>
-              <w:rPr>
-                <w:b w:val="0"/>
-                <w:sz w:val="16"/>
-              </w:rPr>
-              <w:t>tailward/duskward shifts and equatorward expansion during activity</w:t>
+            <w:r>
+              <w:t>equatorward main-phase expansion, MLT asymmetry, north/south differences, and recovery</w:t>
             </w:r>
           </w:p>
         </w:tc>
@@ -5614,13 +5512,8 @@
             <w:vAlign w:val="top"/>
           </w:tcPr>
           <w:p>
-            <w:r/>
-            <w:r>
-              <w:rPr>
-                <w:b w:val="0"/>
-                <w:sz w:val="16"/>
-              </w:rPr>
-              <w:t>Comparison metric</w:t>
+            <w:r>
+              <w:t>Comparison metrics</w:t>
             </w:r>
           </w:p>
         </w:tc>
@@ -5630,80 +5523,223 @@
             <w:vAlign w:val="top"/>
           </w:tcPr>
           <w:p>
-            <w:r/>
-            <w:r>
-              <w:rPr>
-                <w:b w:val="0"/>
-                <w:sz w:val="16"/>
-              </w:rPr>
-              <w:t>ellipse center, semi-axes, and latitude residuals vs POES model</w:t>
+            <w:r>
+              <w:t>per-cell latitude residuals, coverage, bias/RMSE/correlation, low-rigidity expansion and timing; optional FULL_SCAN/DIRECT_ACCESS raw-state consistency</w:t>
             </w:r>
           </w:p>
         </w:tc>
       </w:tr>
     </w:tbl>
     <w:p>
+      <w:pPr/>
+      <w:r>
+        <w:t>C10 is the real-measurement, constellation-scale companion to C9. It validates the storm-time low-Earth-orbit proton-access boundary against NOAA POES/MetOp SEM-2 MEPED observations during the December 2006 solar-particle event and geomagnetic storm. The test resolves the boundary by rigidity, hemisphere, UTC, and magnetic local time (MLT), and evaluates equatorward displacement, recovery, north/south behavior, and first-order MLT asymmetry.</w:t>
+      </w:r>
+    </w:p>
+    <w:p>
+      <w:pPr>
+        <w:pStyle w:val="Heading3"/>
+      </w:pPr>
+      <w:r>
+        <w:t>Observed reference quantity</w:t>
+      </w:r>
+    </w:p>
+    <w:p>
+      <w:pPr/>
+      <w:r>
+        <w:t>For each MEPED omnidirectional integral-proton channel, the observed boundary is the absolute AACGM latitude at which the measured SEP flux reaches one half of the polar-cap plateau. The reference builder recomputes AACGM latitude and MLT from every 16-second sub-satellite position, separates individual northern and southern polar passes, estimates the plateau from |AACGM latitude| &gt;= 75 deg, finds inbound and outbound half-flux crossings independently, and linearly interpolates crossing time and position. Pass-level crossings are then aggregated into two-hour windows stepped by one hour and nominal 3-hour MLT sectors. Missing coverage remains explicit rather than being filled by an empirical model.</w:t>
+      </w:r>
+    </w:p>
+    <w:p>
+      <w:pPr/>
+      <w:r>
+        <w:t>The four initial validation channels are P6 (&gt;16 MeV), P7 (&gt;36 MeV), P8 (&gt;70 MeV), and P9 (&gt;=140 MeV), represented by nominal-threshold proton rigidities 0.174013525, 0.262395866, 0.369131538, and 0.531334344 GV. These rigidities are transparent channel labels; the channels are integral response functions, so a future high-fidelity extension should convolve the detector response with an SEP spectrum rather than interpreting the labels as monochromatic measurements.</w:t>
+      </w:r>
+    </w:p>
+    <w:p>
+      <w:pPr>
+        <w:pStyle w:val="Heading3"/>
+      </w:pPr>
+      <w:r>
+        <w:t>Reference data acquisition and construction</w:t>
+      </w:r>
+    </w:p>
+    <w:p>
+      <w:pPr/>
+      <w:r>
+        <w:t>The numerical reference cannot be reconstructed completely from journal figures or published ellipse coefficients. The publications define the method and instrument response, but the pass-level December 2006 boundaries must be extracted from the official NOAA/NCEI historical Level-2 16-second archive. Use the ASCII v01r00 products for NOAA-15, NOAA-16, NOAA-17, NOAA-18, and MetOp-02/MetOp-A. Download 5-16 December 2006 to retain pre-storm and event context; the default C10 reference window is 14 December 00:00 UT through 16 December 12:00 UT.</w:t>
+      </w:r>
+    </w:p>
+    <w:p>
+      <w:pPr/>
+      <w:r>
+        <w:t>No-root tcsh environment setup:</w:t>
+      </w:r>
+    </w:p>
+    <w:p>
+      <w:pPr/>
       <w:r>
         <w:rPr>
-          <w:b/>
-        </w:rPr>
-        <w:t>Reference solution / comparison target:</w:t>
-      </w:r>
-    </w:p>
-    <w:p>
-      <w:r>
-        <w:t>Dmitriev et al. (2013), elliptical model of SEP cutoff boundaries from five NOAA/POES satellites.</w:t>
-      </w:r>
-    </w:p>
-    <w:p>
-      <w:pPr>
-        <w:jc w:val="center"/>
-      </w:pPr>
-      <w:r>
-        <w:drawing>
-          <wp:inline xmlns:a="http://schemas.openxmlformats.org/drawingml/2006/main" xmlns:pic="http://schemas.openxmlformats.org/drawingml/2006/picture">
-            <wp:extent cx="5303520" cy="3977640"/>
-            <wp:docPr id="10" name="Picture 10"/>
-            <wp:cNvGraphicFramePr>
-              <a:graphicFrameLocks noChangeAspect="1"/>
-            </wp:cNvGraphicFramePr>
-            <a:graphic>
-              <a:graphicData uri="http://schemas.openxmlformats.org/drawingml/2006/picture">
-                <pic:pic>
-                  <pic:nvPicPr>
-                    <pic:cNvPr id="0" name="C10_poes_boundary.png"/>
-                    <pic:cNvPicPr/>
-                  </pic:nvPicPr>
-                  <pic:blipFill>
-                    <a:blip r:embed="rId18"/>
-                    <a:stretch>
-                      <a:fillRect/>
-                    </a:stretch>
-                  </pic:blipFill>
-                  <pic:spPr>
-                    <a:xfrm>
-                      <a:off x="0" y="0"/>
-                      <a:ext cx="5303520" cy="3977640"/>
-                    </a:xfrm>
-                    <a:prstGeom prst="rect"/>
-                  </pic:spPr>
-                </pic:pic>
-              </a:graphicData>
-            </a:graphic>
-          </wp:inline>
-        </w:drawing>
-      </w:r>
-    </w:p>
-    <w:p>
-      <w:pPr>
-        <w:jc w:val="center"/>
-      </w:pPr>
-      <w:r>
-        <w:rPr>
-          <w:i/>
+          <w:rFonts w:ascii="Courier New" w:hAnsi="Courier New"/>
           <w:sz w:val="16"/>
         </w:rPr>
-        <w:t>Figure C10 — Reference/target behavior for POES SEP elliptical cutoff boundary.</w:t>
+        <w:t>cd ~/T11/AMPS/srcEarth/test/C10 &amp;&amp; python3 -m pip install --user virtualenv &amp;&amp; setenv PATH "${HOME}/.local/bin:${PATH}" &amp;&amp; python3 -m virtualenv .venv &amp;&amp; source .venv/bin/activate.csh &amp;&amp; python -m pip install "pip&lt;25.1" "numpy&lt;1.25" "matplotlib&lt;3.8" aacgmv2</w:t>
+      </w:r>
+    </w:p>
+    <w:p>
+      <w:pPr/>
+      <w:r>
+        <w:t>Download and checksum the source files:</w:t>
+      </w:r>
+    </w:p>
+    <w:p>
+      <w:pPr/>
+      <w:r>
+        <w:rPr>
+          <w:rFonts w:ascii="Courier New" w:hAnsi="Courier New"/>
+          <w:sz w:val="16"/>
+        </w:rPr>
+        <w:t>python download_poes_sem2.py --start 2006-12-05 --end 2006-12-16 --satellites n15,n16,n17,n18,m02 --format txt --output-dir data/reference_source</w:t>
+      </w:r>
+    </w:p>
+    <w:p>
+      <w:pPr/>
+      <w:r>
+        <w:t>The downloader writes data/reference_source/download_manifest.json with the original URL, local path, byte count, and SHA-256 for every file. Before building the reference, list zero-byte files with "find data/reference_source -type f -size 0 -print" and remove or redownload them. The current downloader rejects zero-byte and obvious HTML/error responses; the builder skips documented empty satellite-day files but continues to fail on malformed nonempty scientific files.</w:t>
+      </w:r>
+    </w:p>
+    <w:p>
+      <w:pPr/>
+      <w:r>
+        <w:t>Build the archive-derived reference:</w:t>
+      </w:r>
+    </w:p>
+    <w:p>
+      <w:pPr/>
+      <w:r>
+        <w:rPr>
+          <w:rFonts w:ascii="Courier New" w:hAnsi="Courier New"/>
+          <w:sz w:val="16"/>
+        </w:rPr>
+        <w:t>python build_poes_reference.py --input-dir data/reference_source --event-start 2006-12-14T00:00:00Z --event-end 2006-12-16T12:00:00Z --crossings-output C10_poes_boundary_crossings.csv --reference-output reference_C10_poes_meped_boundary.csv.gz --manifest-output C10_reference_manifest.json --summary-output C10_reference_summary.json</w:t>
+      </w:r>
+    </w:p>
+    <w:p>
+      <w:pPr/>
+      <w:r>
+        <w:t>The required products are: (1) C10_poes_boundary_crossings.csv, one row per measured inbound/outbound crossing; (2) reference_C10_poes_meped_boundary.csv.gz, the window/channel/hemisphere/MLT comparison grid; (3) C10_reference_manifest.json, containing source checksums and processing settings; and (4) C10_reference_summary.json, containing observation, crossing, coverage, and skipped-file counts. Validate with "python run_C10.py --validate-references --reference reference_C10_poes_meped_boundary.csv.gz" and "python run_C10.py --validate-driver". A gzip-compressed five-line header-only CSV is only a placeholder and is intentionally rejected.</w:t>
+      </w:r>
+    </w:p>
+    <w:p>
+      <w:pPr>
+        <w:pStyle w:val="Heading3"/>
+      </w:pPr>
+      <w:r>
+        <w:t>AMPS cutoff-evaluation products</w:t>
+      </w:r>
+    </w:p>
+    <w:p>
+      <w:pPr/>
+      <w:r>
+        <w:t>C10 now uses the same FULL_SCAN/DIRECT_ACCESS design as C9. FULL_SCAN performs PENUMBRA_SCAN on the complete global shell and retains Rc_lower, Rc_effective, and Rc_upper. A nonempty P6-P9 rigidity list also requests companion exact-state output. FULL_SCAN supports GRIDLESS and GRIDDED. DIRECT_ACCESS is GRIDDED-only; it selects RIGIDITY_LIST, traces only the four P6-P9 rigidities, and restricts trajectory work to the configured 45-85 deg absolute-geodetic-latitude band.</w:t>
+      </w:r>
+    </w:p>
+    <w:p>
+      <w:pPr/>
+      <w:r>
+        <w:t>For the default 15 deg longitude by 2 deg latitude shell, DIRECT_ACCESS removes the 120-rigidity penumbra scan and most low-latitude shell nodes. The nominal trajectory count is approximately 60-70 times smaller than FULL_SCAN, although Mode3D mesh construction, field initialization, MPI startup, and multiple temporal samples remain fixed costs. For routine development, run DIRECT_ACCESS with one snapshot per two-hour observational interval first; increase --interval-samples to 5 only after the fast product is stable and time averaging is required.</w:t>
+      </w:r>
+    </w:p>
+    <w:p>
+      <w:pPr>
+        <w:pStyle w:val="Heading3"/>
+      </w:pPr>
+      <w:r>
+        <w:t>Common model observable</w:t>
+      </w:r>
+    </w:p>
+    <w:p>
+      <w:pPr/>
+      <w:r>
+        <w:t>The primary observable for both products is ACCESS_T50. Exact access states (0=forbidden, 1=allowed, 2=unresolved) are filtered to the common geodetic latitude band, converted to AACGM latitude and MLT, grouped into longitude profiles within each MLT sector and hemisphere, and sampled on a common AACGM latitude grid. The resolved allowed-state fraction is the modeled transmission. Weighted nondecreasing isotonic regression removes finite-longitude reversals; a boundary is accepted only when T=0.5 is explicitly bracketed and at least 1 deg from the retained latitude edge. This common reduction prevents FULL_SCAN and DIRECT_ACCESS from being compared through different boundary definitions. Rc_lower, Rc_effective, and Rc_upper remain FULL_SCAN-only diagnostics.</w:t>
+      </w:r>
+    </w:p>
+    <w:p>
+      <w:pPr>
+        <w:pStyle w:val="Heading3"/>
+      </w:pPr>
+      <w:r>
+        <w:t>Recommended execution sequence</w:t>
+      </w:r>
+    </w:p>
+    <w:p>
+      <w:pPr/>
+      <w:r>
+        <w:t>Fast GRIDDED routine calculation:</w:t>
+      </w:r>
+    </w:p>
+    <w:p>
+      <w:pPr/>
+      <w:r>
+        <w:rPr>
+          <w:rFonts w:ascii="Courier New" w:hAnsi="Courier New"/>
+          <w:sz w:val="16"/>
+        </w:rPr>
+        <w:t>python run_C10.py --solver GRIDDED --cutoff-evaluation DIRECT_ACCESS --comparison-observable ACCESS_T50 --profile ROUTINE --interval-samples 1 --reference reference_C10_poes_meped_boundary.csv.gz --output-root test_output/C10_direct --amps /home/vtenishe/T11/AMPS/amps --shell-lon-res-deg 15 --shell-lat-res-deg 2 --access-abs-lat-min-deg 45 --access-abs-lat-max-deg 85 --t50-grid-step-deg 0.25 --t50-min-resolved-profile-fraction 0.66 --t50-min-edge-margin-deg 1.0 --dynamic-chunk 32 -np 8 -nt 16</w:t>
+      </w:r>
+    </w:p>
+    <w:p>
+      <w:pPr/>
+      <w:r>
+        <w:t>Complete GRIDDED calculation and method-consistency check:</w:t>
+      </w:r>
+    </w:p>
+    <w:p>
+      <w:pPr/>
+      <w:r>
+        <w:rPr>
+          <w:rFonts w:ascii="Courier New" w:hAnsi="Courier New"/>
+          <w:sz w:val="16"/>
+        </w:rPr>
+        <w:t>python run_C10.py --solver GRIDDED --cutoff-evaluation FULL_SCAN --comparison-observable ACCESS_T50 --profile ROUTINE --interval-samples 1 --reference reference_C10_poes_meped_boundary.csv.gz --output-root test_output/C10_full --access-consistency-root test_output/C10_direct --amps /home/vtenishe/T11/AMPS/amps --cutoff-scan-n 120 --shell-lon-res-deg 15 --shell-lat-res-deg 2 --access-abs-lat-min-deg 45 --access-abs-lat-max-deg 85 --t50-grid-step-deg 0.25 --t50-min-resolved-profile-fraction 0.66 --t50-min-edge-margin-deg 1.0 --min-access-state-agreement 0.999 --max-access-unresolved-fraction 0.01 --dynamic-chunk 32 -np 8 -nt 16</w:t>
+      </w:r>
+    </w:p>
+    <w:p>
+      <w:pPr/>
+      <w:r>
+        <w:t>The consistency gate compares matching raw exact-rigidity classifications before AACGM conversion. A final FULL_SCAN pass requires at least 0.999 resolved-state agreement, no missing shell/rigidity keys, and an unresolved fraction no larger than 0.01. Scheduler chunk size is a work-distribution choice and is not a scientific difference. Use separate output roots because each mode has different raw filenames and computational cost.</w:t>
+      </w:r>
+    </w:p>
+    <w:p>
+      <w:pPr>
+        <w:pStyle w:val="Heading3"/>
+      </w:pPr>
+      <w:r>
+        <w:t>Outputs and acceptance</w:t>
+      </w:r>
+    </w:p>
+    <w:p>
+      <w:pPr/>
+      <w:r>
+        <w:t>Each solver branch writes C10_comparison.csv, a C9-style time-series/residual figure (C10_comparison.png), observed-versus-modeled scatter (C10_scatter.png), MLT morphology (C10_mlt_comparison.png), and C10_result.json. Each snapshot also writes C10_snapshot_boundaries.csv and C10_snapshot_t50_profiles.csv. When a counterpart root is supplied, the runner writes per-snapshot and branch-level access-consistency JSON/CSV products. The default observational gates are valid fraction &gt;=0.85, RMSE &lt;=3 deg, absolute bias &lt;=2 deg, correlation &gt;=0.80, modeled low-rigidity expansion 4-12 deg, and maximum-expansion timing error &lt;=180 min. These thresholds should be tightened only after archive, temporal, shell, T50-grid, mesh, and scan-convergence studies.</w:t>
+      </w:r>
+    </w:p>
+    <w:p>
+      <w:pPr/>
+      <w:r>
+        <w:t>Limitations include nominal-threshold rigidity labels rather than full detector response convolution, vertical-trajectory modeling of an omnidirectional channel, sparse or uneven MLT coverage, detector aging, and two-hour observational aggregation during rapidly evolving storm phases. The pass-level crossing table and source-file checksums must be retained so these effects can be re-evaluated.</w:t>
+      </w:r>
+    </w:p>
+    <w:p>
+      <w:pPr/>
+      <w:r>
+        <w:t>Primary references: NOAA/NCEI POES/MetOp SEM-2 Level-2 16-second archive and format documentation; Dmitriev, Jayachandran, and Tsai, JGR Space Physics (2010), for the December 2006 half-polar-cap-flux boundary method and morphology; Yando et al. (2011) for MEPED response functions; and the C10 REFERENCES.md file for the complete ten-source dataset and processing bibliography.</w:t>
+      </w:r>
+    </w:p>
+    <w:p>
+      <w:pPr/>
+      <w:r>
+        <w:t>Figure C10 - Target behavior: POES/MetOp and AMPS ACCESS_T50 cutoff latitude versus UTC for P6-P9 in both hemispheres and all retained MLT sectors, with equatorward main-phase displacement, recovery, and rigidity-dependent response. The residual panel uses AMPS minus POES. FULL_SCAN versus DIRECT_ACCESS tests numerical-method consistency through the same exact-state observable; FULL_SCAN Rc contours and GRIDLESS/GRIDDED differences are diagnostic sensitivity products.</w:t>
       </w:r>
     </w:p>
     <w:p>
@@ -17319,7 +17355,7 @@
           </w:tcPr>
           <w:p>
             <w:r>
-              <w:t>C9B / C9C / C10 / C15</w:t>
+              <w:t>C9B / C9C / C15</w:t>
             </w:r>
           </w:p>
         </w:tc>
@@ -17329,7 +17365,7 @@
           </w:tcPr>
           <w:p>
             <w:r>
-              <w:t>Future map/exact-orbit PAMELA and POES/time-series extensions</w:t>
+              <w:t>Future map/exact-orbit PAMELA and additional time-series extensions</w:t>
             </w:r>
           </w:p>
         </w:tc>
@@ -17349,7 +17385,49 @@
           </w:tcPr>
           <w:p>
             <w:r>
-              <w:t>C9B needs digitized/machine-readable PAMELA global maps. C9C needs definitive Resurs-DK1 ephemeris, attitude, PAMELA mounting/acceptance, and track directions. C10/C15 still need POES/MLT products and event-specific postprocessing.</w:t>
+              <w:t>C9B needs digitized/machine-readable PAMELA global maps. C9C needs definitive Resurs-DK1 ephemeris, attitude, PAMELA mounting/acceptance, and track directions. C15 remains an additional future extension.</w:t>
+            </w:r>
+          </w:p>
+        </w:tc>
+      </w:tr>
+      <w:tr>
+        <w:tc>
+          <w:tcPr>
+            <w:tcW w:type="dxa" w:w="3636"/>
+          </w:tcPr>
+          <w:p>
+            <w:r>
+              <w:t>C10</w:t>
+            </w:r>
+          </w:p>
+        </w:tc>
+        <w:tc>
+          <w:tcPr>
+            <w:tcW w:type="dxa" w:w="3636"/>
+          </w:tcPr>
+          <w:p>
+            <w:r>
+              <w:t>POES/MetOp measured storm-time proton-access boundary</w:t>
+            </w:r>
+          </w:p>
+        </w:tc>
+        <w:tc>
+          <w:tcPr>
+            <w:tcW w:type="dxa" w:w="3636"/>
+          </w:tcPr>
+          <w:p>
+            <w:r>
+              <w:t>srcEarth/test/C10 AMPS templates, NOAA/NCEI Level-2 reference builder, and C9 TS05 event driver</w:t>
+            </w:r>
+          </w:p>
+        </w:tc>
+        <w:tc>
+          <w:tcPr>
+            <w:tcW w:type="dxa" w:w="3636"/>
+          </w:tcPr>
+          <w:p>
+            <w:r>
+              <w:t>Implemented. Supports FULL_SCAN and GRIDDED-only DIRECT_ACCESS with common ACCESS_T50 postprocessing, C9-style plots, archive manifests, and optional raw-state consistency checks. The external NOAA/NCEI daily files must be downloaded and processed locally.</w:t>
             </w:r>
           </w:p>
         </w:tc>
@@ -17522,16 +17600,8 @@
             <w:vAlign w:val="top"/>
           </w:tcPr>
           <w:p>
-            <w:pPr>
-              <w:spacing w:after="0" w:before="0"/>
-            </w:pPr>
-            <w:r/>
-            <w:r>
-              <w:rPr>
-                <w:b w:val="0"/>
-                <w:sz w:val="14"/>
-              </w:rPr>
-              <w:t>POES/MLT boundary</w:t>
+            <w:r>
+              <w:t>C10 NOAA/NCEI POES/MetOp Level-2 source files</w:t>
             </w:r>
           </w:p>
         </w:tc>
@@ -17541,16 +17611,8 @@
             <w:vAlign w:val="top"/>
           </w:tcPr>
           <w:p>
-            <w:pPr>
-              <w:spacing w:after="0" w:before="0"/>
-            </w:pPr>
-            <w:r/>
-            <w:r>
-              <w:rPr>
-                <w:b w:val="0"/>
-                <w:sz w:val="14"/>
-              </w:rPr>
-              <w:t>Add MLT/CGM output or postprocessing script; use global 850-km shell and postprocess cutoff latitude vs MLT.</w:t>
+            <w:r>
+              <w:t>External by design. Run srcEarth/test/C10/download_poes_sem2.py for 5-16 Dec 2006 and build the numerical reference with build_poes_reference.py. Preserve download_manifest.json, source SHA-256 values, pass-level crossings, binned reference, processing manifest, and summary.</w:t>
             </w:r>
           </w:p>
         </w:tc>

</xml_diff>

<commit_message>
Improve C10 POES reference processing and validation workflow
</commit_message>
<xml_diff>
--- a/srcEarth/test/validation.docx
+++ b/srcEarth/test/validation.docx
@@ -5476,7 +5476,7 @@
           </w:tcPr>
           <w:p>
             <w:r>
-              <w:t>MLT-sector, hemisphere-resolved ACCESS_T50 from exact P6-P9 access states; first-harmonic morphology is diagnostic</w:t>
+              <w:t>MLT-sector, hemisphere-resolved ACCESS_T50 from exact P6/P7 access states for the primary background-normalized code-validation gate; P8/P9 and first-harmonic morphology are diagnostic</w:t>
             </w:r>
           </w:p>
         </w:tc>
@@ -5547,13 +5547,13 @@
     <w:p>
       <w:pPr/>
       <w:r>
-        <w:t>For each MEPED omnidirectional integral-proton channel, the observed boundary is the absolute AACGM latitude at which the measured SEP flux reaches one half of the polar-cap plateau. The reference builder recomputes AACGM latitude and MLT from every 16-second sub-satellite position, separates individual northern and southern polar passes, estimates the plateau from |AACGM latitude| &gt;= 75 deg, finds inbound and outbound half-flux crossings independently, and linearly interpolates crossing time and position. Pass-level crossings are then aggregated into two-hour windows stepped by one hour and nominal 3-hour MLT sectors. Missing coverage remains explicit rather than being filled by an empirical model.</w:t>
+        <w:t>For each MEPED omnidirectional integral-proton channel, the production reference uses a background-normalized transmission on each inbound and outbound pass leg: Tobs=(F-Fbackground)/(Fpolar-Fbackground). Fpolar is the median valid flux above 75 deg absolute AACGM latitude, while Fbackground is estimated independently from the equatorward samples on that leg. Samples are ordered from equator to pole and fitted with a nondecreasing pool-adjacent-violators isotonic regression. The builder requires explicitly bracketed T25, T50, and T75 crossings, retains the T25-T75 transition width and isotonic RMS, and rejects insufficient-background, low-contrast, edge-clipped, excessively broad, or strongly nonmonotonic transitions. Time, position, altitude, AACGM latitude, and MLT are interpolated at fitted T50. The former direct 0.5*Fpolar threshold remains available only as the diagnostic HALF_POLAR_PLATEAU mode and cannot produce acceptance-eligible cells.</w:t>
       </w:r>
     </w:p>
     <w:p>
       <w:pPr/>
       <w:r>
-        <w:t>The four initial validation channels are P6 (&gt;16 MeV), P7 (&gt;36 MeV), P8 (&gt;70 MeV), and P9 (&gt;=140 MeV), represented by nominal-threshold proton rigidities 0.174013525, 0.262395866, 0.369131538, and 0.531334344 GV. These rigidities are transparent channel labels; the channels are integral response functions, so a future high-fidelity extension should convolve the detector response with an SEP spectrum rather than interpreting the labels as monochromatic measurements.</w:t>
+        <w:t>The four channels remain P6 (&gt;16 MeV), P7 (&gt;36 MeV), P8 (&gt;70 MeV), and P9 (&gt;=140 MeV), represented by nominal-threshold proton rigidities 0.174013525, 0.262395866, 0.369131538, and 0.531334344 GV. P6 and P7 are PRIMARY code-validation channels. P8 and P9 are retained in every table and plot as DIAGNOSTIC channels, but they do not control PASS/FAIL until their broad integral response and historical subcommutation are forward-folded through an SEP spectrum. This preserves sensitivity to their disagreement without mistaking a known instrument-response approximation for an AMPS code error.</w:t>
       </w:r>
     </w:p>
     <w:p>
@@ -5617,17 +5617,13 @@
     <w:p>
       <w:pPr/>
       <w:r>
-        <w:rPr>
-          <w:rFonts w:ascii="Courier New" w:hAnsi="Courier New"/>
-          <w:sz w:val="16"/>
-        </w:rPr>
-        <w:t>python build_poes_reference.py --input-dir data/reference_source --event-start 2006-12-14T00:00:00Z --event-end 2006-12-16T12:00:00Z --crossings-output C10_poes_boundary_crossings.csv --reference-output reference_C10_poes_meped_boundary.csv.gz --manifest-output C10_reference_manifest.json --summary-output C10_reference_summary.json</w:t>
+        <w:t>python build_poes_reference.py --input-dir data/reference_source --event-start 2006-12-14T00:00:00Z --event-end 2006-12-16T12:00:00Z --crossing-method BACKGROUND_NORMALIZED_ISOTONIC --minimum-background-samples 3 --minimum-crossings-per-cell 2 --minimum-diagnostic-crossings-per-cell 1 --minimum-distinct-pass-legs-per-cell 2 --acceptance-window-stride-hours 2 --crossings-output C10_poes_boundary_crossings.csv --reference-output reference_C10_poes_meped_boundary.csv.gz --manifest-output C10_reference_manifest.json --summary-output C10_reference_summary.json</w:t>
       </w:r>
     </w:p>
     <w:p>
       <w:pPr/>
       <w:r>
-        <w:t>The required products are: (1) C10_poes_boundary_crossings.csv, one row per measured inbound/outbound crossing; (2) reference_C10_poes_meped_boundary.csv.gz, the window/channel/hemisphere/MLT comparison grid; (3) C10_reference_manifest.json, containing source checksums and processing settings; and (4) C10_reference_summary.json, containing observation, crossing, coverage, and skipped-file counts. Validate with "python run_C10.py --validate-references --reference reference_C10_poes_meped_boundary.csv.gz" and "python run_C10.py --validate-driver". A gzip-compressed five-line header-only CSV is only a placeholder and is intentionally rejected.</w:t>
+        <w:t>The required products are: (1) C10_poes_boundary_crossings.csv, one row per accepted pass-leg T50 with background, plateau, T25/T50/T75, transition-width, fit-residual, validation-role, and quality metadata; (2) reference_C10_poes_meped_boundary.csv.gz, the window/channel/hemisphere/MLT grid containing validation_role, acceptance_eligible, independent-pass counts, transition width, and background_corrected; (3) C10_reference_manifest.json, containing source checksums and processing settings; and (4) C10_reference_summary.json, containing observation, crossing, primary/diagnostic, acceptance-eligible, coverage, and skipped-file counts. An older uncorrected reference must be rebuilt, not merely given new columns. Validate with "python run_C10.py --validate-references --reference reference_C10_poes_meped_boundary.csv.gz".</w:t>
       </w:r>
     </w:p>
     <w:p>
@@ -5721,13 +5717,13 @@
     <w:p>
       <w:pPr/>
       <w:r>
-        <w:t>Each solver branch writes C10_comparison.csv, a C9-style time-series/residual figure (C10_comparison.png), observed-versus-modeled scatter (C10_scatter.png), MLT morphology (C10_mlt_comparison.png), and C10_result.json. Each snapshot also writes C10_snapshot_boundaries.csv and C10_snapshot_t50_profiles.csv. When a counterpart root is supplied, the runner writes per-snapshot and branch-level access-consistency JSON/CSV products. The default observational gates are valid fraction &gt;=0.85, RMSE &lt;=3 deg, absolute bias &lt;=2 deg, correlation &gt;=0.80, modeled low-rigidity expansion 4-12 deg, and maximum-expansion timing error &lt;=180 min. These thresholds should be tightened only after archive, temporal, shell, T50-grid, mesh, and scan-convergence studies.</w:t>
+        <w:t>Each solver branch writes C10_comparison.csv, a time-series/residual figure, an observed-versus-modeled scatter plot, MLT morphology, and C10_result.json. The comparison CSV marks every row as PRIMARY or DIAGNOSTIC and records whether it was used for acceptance. PASS/FAIL metrics use only background-corrected P6/P7 cells with at least two distinct pass legs on the nonoverlapping two-hour acceptance stride. P8/P9 and overlapping P6/P7 cells remain in the plots and receive separate per-channel bias, RMSE, correlation, and coverage metrics; an all-channel RMSE is reported as diagnostic only. The default primary gates remain valid fraction &gt;=0.85, RMSE &lt;=3 deg, absolute bias &lt;=2 deg, correlation &gt;=0.80, expansion 4-12 deg, and expansion-time error &lt;=180 min. The runner now interpolates SYM-H from column 9 of the verified C9 TS05 driver at each midpoint rather than expecting it in the observational CSV.</w:t>
       </w:r>
     </w:p>
     <w:p>
       <w:pPr/>
       <w:r>
-        <w:t>Limitations include nominal-threshold rigidity labels rather than full detector response convolution, vertical-trajectory modeling of an omnidirectional channel, sparse or uneven MLT coverage, detector aging, and two-hour observational aggregation during rapidly evolving storm phases. The pass-level crossing table and source-file checksums must be retained so these effects can be re-evaluated.</w:t>
+        <w:t>Remaining limitations include nominal-threshold rigidity labels rather than full detector response convolution, vertical-trajectory modeling of an omnidirectional channel, sparse or uneven MLT coverage, detector aging, and two-hour observational aggregation during rapidly evolving storm phases. These limitations are why P8/P9 are diagnostic and why the pass-level crossing table, transition-width diagnostics, source-file checksums, and FULL_SCAN/DIRECT_ACCESS raw-state consistency products must be retained. The current test is useful for code validation because the primary observational gate is restricted to the better-conditioned P6/P7 products while the independent numerical-consistency gate still checks exact trajectory classifications before observational postprocessing.</w:t>
       </w:r>
     </w:p>
     <w:p>
@@ -5739,7 +5735,13 @@
     <w:p>
       <w:pPr/>
       <w:r>
-        <w:t>Figure C10 - Target behavior: POES/MetOp and AMPS ACCESS_T50 cutoff latitude versus UTC for P6-P9 in both hemispheres and all retained MLT sectors, with equatorward main-phase displacement, recovery, and rigidity-dependent response. The residual panel uses AMPS minus POES. FULL_SCAN versus DIRECT_ACCESS tests numerical-method consistency through the same exact-state observable; FULL_SCAN Rc contours and GRIDLESS/GRIDDED differences are diagnostic sensitivity products.</w:t>
+        <w:t>Offline regression coverage: 20 tests exercise ASCII parsing, headerless input, zero-byte handling, deterministic gzip I/O, background-normalized T50 extraction, T25-T75 diagnostics, driver SYM-H interpolation, primary/diagnostic metric separation, FULL_SCAN/DIRECT_ACCESS command and raw-state consistency, all plot products, and an archive-independent end-to-end --self-test.</w:t>
+      </w:r>
+    </w:p>
+    <w:p>
+      <w:pPr/>
+      <w:r>
+        <w:t>Figure C10 - Target behavior: background-normalized POES/MetOp and AMPS ACCESS_T50 cutoff latitude versus UTC. P6/P7 are the primary code-validation curves; P8/P9 are visibly labeled diagnostic. The residual panel uses AMPS minus POES. FULL_SCAN versus DIRECT_ACCESS tests numerical-method consistency through matching exact-state classifications, while FULL_SCAN Rc contours and GRIDLESS/GRIDDED differences remain sensitivity diagnostics.</w:t>
       </w:r>
     </w:p>
     <w:p>
@@ -17427,7 +17429,7 @@
           </w:tcPr>
           <w:p>
             <w:r>
-              <w:t>Implemented. Supports FULL_SCAN and GRIDDED-only DIRECT_ACCESS with common ACCESS_T50 postprocessing, C9-style plots, archive manifests, and optional raw-state consistency checks. The external NOAA/NCEI daily files must be downloaded and processed locally.</w:t>
+              <w:t>Implemented. Supports FULL_SCAN and GRIDDED-only DIRECT_ACCESS with common ACCESS_T50 postprocessing, background-normalized isotonic POES T50 extraction, P6/P7 primary acceptance, P8/P9 diagnostic metrics, C9-style plots, archive manifests, and optional raw-state consistency checks. The external NOAA/NCEI daily files must be downloaded and the compressed numerical reference rebuilt locally.</w:t>
             </w:r>
           </w:p>
         </w:tc>
@@ -17612,7 +17614,7 @@
           </w:tcPr>
           <w:p>
             <w:r>
-              <w:t>External by design. Run srcEarth/test/C10/download_poes_sem2.py for 5-16 Dec 2006 and build the numerical reference with build_poes_reference.py. Preserve download_manifest.json, source SHA-256 values, pass-level crossings, binned reference, processing manifest, and summary.</w:t>
+              <w:t>External by design. Run srcEarth/test/C10/download_poes_sem2.py for 5-16 Dec 2006 and build the numerical reference with build_poes_reference.py using BACKGROUND_NORMALIZED_ISOTONIC. Preserve download_manifest.json, source SHA-256 values, pass-level T25/T50/T75 crossings, the compressed binned reference, processing manifest, and summary.</w:t>
             </w:r>
           </w:p>
         </w:tc>

</xml_diff>

<commit_message>
Use only acceptance-eligible P6/P7 cells in connected plots and   PASS/FAIL metrics; retain other cells as open markers
</commit_message>
<xml_diff>
--- a/srcEarth/test/validation.docx
+++ b/srcEarth/test/validation.docx
@@ -5553,7 +5553,7 @@
     <w:p>
       <w:pPr/>
       <w:r>
-        <w:t>The four channels remain P6 (&gt;16 MeV), P7 (&gt;36 MeV), P8 (&gt;70 MeV), and P9 (&gt;=140 MeV), represented by nominal-threshold proton rigidities 0.174013525, 0.262395866, 0.369131538, and 0.531334344 GV. P6 and P7 are PRIMARY code-validation channels. P8 and P9 are retained in every table and plot as DIAGNOSTIC channels, but they do not control PASS/FAIL until their broad integral response and historical subcommutation are forward-folded through an SEP spectrum. This preserves sensitivity to their disagreement without mistaking a known instrument-response approximation for an AMPS code error.</w:t>
+        <w:t>The four channels remain P6 (&gt;16 MeV), P7 (&gt;36 MeV), P8 (&gt;70 MeV), and P9 (&gt;=140 MeV), represented by nominal-threshold proton rigidities 0.174013525, 0.262395866, 0.369131538, and 0.531334344 GV. P6 and P7 are PRIMARY code-validation channels. P8 and P9 remain DIAGNOSTIC and never control PASS/FAIL until their broad integral response is forward-folded through an SEP spectrum. A robust P8/P9 diagnostic cell now requires at least two quality-eligible crossings, two pass legs, and two spacecraft. Sparse or cross-channel-outlier cells remain in the reference and detailed comparison output but are excluded from connected diagnostic means and robust diagnostic metrics.</w:t>
       </w:r>
     </w:p>
     <w:p>
@@ -5617,13 +5617,13 @@
     <w:p>
       <w:pPr/>
       <w:r>
-        <w:t>python build_poes_reference.py --input-dir data/reference_source --event-start 2006-12-14T00:00:00Z --event-end 2006-12-16T12:00:00Z --crossing-method BACKGROUND_NORMALIZED_ISOTONIC --minimum-background-samples 3 --minimum-crossings-per-cell 2 --minimum-diagnostic-crossings-per-cell 1 --minimum-distinct-pass-legs-per-cell 2 --acceptance-window-stride-hours 2 --crossings-output C10_poes_boundary_crossings.csv --reference-output reference_C10_poes_meped_boundary.csv.gz --manifest-output C10_reference_manifest.json --summary-output C10_reference_summary.json</w:t>
+        <w:t>python build_poes_reference.py --input-dir data/reference_source --event-start 2006-12-14T00:00:00Z --event-end 2006-12-16T12:00:00Z --crossing-method BACKGROUND_NORMALIZED_ISOTONIC --minimum-background-samples 3 --minimum-crossings-per-cell 2 --minimum-diagnostic-crossings-per-cell 2 --minimum-distinct-pass-legs-per-cell 2 --minimum-diagnostic-distinct-pass-legs-per-cell 2 --minimum-diagnostic-distinct-satellites-per-cell 2 --minimum-primary-transition-samples 2 --minimum-diagnostic-transition-samples 3 --minimum-diagnostic-contrast-to-noise 3 --p8-p9-outlier-sigma 4 --p8-p9-minimum-pairs 6 --p8-p9-fallback-max-separation-deg 6 --acceptance-window-stride-hours 2 --crossings-output C10_poes_boundary_crossings.csv --reference-output reference_C10_poes_meped_boundary.csv.gz --manifest-output C10_reference_manifest.json --summary-output C10_reference_summary.json</w:t>
       </w:r>
     </w:p>
     <w:p>
       <w:pPr/>
       <w:r>
-        <w:t>The required products are: (1) C10_poes_boundary_crossings.csv, one row per accepted pass-leg T50 with background, plateau, T25/T50/T75, transition-width, fit-residual, validation-role, and quality metadata; (2) reference_C10_poes_meped_boundary.csv.gz, the window/channel/hemisphere/MLT grid containing validation_role, acceptance_eligible, independent-pass counts, transition width, and background_corrected; (3) C10_reference_manifest.json, containing source checksums and processing settings; and (4) C10_reference_summary.json, containing observation, crossing, primary/diagnostic, acceptance-eligible, coverage, and skipped-file counts. An older uncorrected reference must be rebuilt, not merely given new columns. Validate with "python run_C10.py --validate-references --reference reference_C10_poes_meped_boundary.csv.gz".</w:t>
+        <w:t>The required products are: (1) C10_poes_boundary_crossings.csv, one row per fitted pass-leg T50 with background, plateau, T25/T50/T75, transition width, isotonic residual, transition-support count, contrast/noise estimate, P8-minus-P9 separation, cross-channel-outlier flag, and aggregation eligibility; (2) reference_C10_poes_meped_boundary.csv.gz, schema C10_POES_T50_V3, containing acceptance_eligible, diagnostic_eligible, quality_status, independent-pass and spacecraft counts, eligible-crossing count, outlier count, and support/noise summaries; (3) C10_reference_manifest.json, containing source checksums, processing settings, and cross-channel quality statistics; and (4) C10_reference_summary.json, containing observation, crossing, robust-diagnostic, sparse-diagnostic, acceptance, coverage, and skipped-file counts. An older reference must be rebuilt. Validate with "python run_C10.py --validate-references --reference reference_C10_poes_meped_boundary.csv.gz".</w:t>
       </w:r>
     </w:p>
     <w:p>
@@ -5717,13 +5717,13 @@
     <w:p>
       <w:pPr/>
       <w:r>
-        <w:t>Each solver branch writes C10_comparison.csv, a time-series/residual figure, an observed-versus-modeled scatter plot, MLT morphology, and C10_result.json. The comparison CSV marks every row as PRIMARY or DIAGNOSTIC and records whether it was used for acceptance. PASS/FAIL metrics use only background-corrected P6/P7 cells with at least two distinct pass legs on the nonoverlapping two-hour acceptance stride. P8/P9 and overlapping P6/P7 cells remain in the plots and receive separate per-channel bias, RMSE, correlation, and coverage metrics; an all-channel RMSE is reported as diagnostic only. The default primary gates remain valid fraction &gt;=0.85, RMSE &lt;=3 deg, absolute bias &lt;=2 deg, correlation &gt;=0.80, expansion 4-12 deg, and expansion-time error &lt;=180 min. The runner now interpolates SYM-H from column 9 of the verified C9 TS05 driver at each midpoint rather than expecting it in the observational CSV.</w:t>
+        <w:t>Each solver branch writes C10_comparison.csv, C10_diagnostic_flags.csv, a time-series/residual figure, an observed-versus-modeled scatter plot, MLT morphology, and C10_result.json. Every plotted mean now uses exactly the same paired observation/model hemisphere-MLT rows. P8/P9 connected curves require at least two robust paired cells; sparse or cross-channel-outlier estimates are shown as open markers annotated with the paired count and are listed in C10_diagnostic_flags.csv. PASS/FAIL metrics remain restricted to background-corrected P6/P7 cells with at least two distinct pass legs on the nonoverlapping two-hour acceptance stride. C10_result.json reports robust and unfiltered per-channel metrics separately, so quality filtering cannot hide a diagnostic disagreement. The default primary gates remain valid fraction &gt;=0.85, RMSE &lt;=3 deg, absolute bias &lt;=2 deg, correlation &gt;=0.80, expansion 4-12 deg, and expansion-time error &lt;=180 min. The runner interpolates SYM-H from column 9 of the verified C9 TS05 driver at each midpoint.</w:t>
       </w:r>
     </w:p>
     <w:p>
       <w:pPr/>
       <w:r>
-        <w:t>Remaining limitations include nominal-threshold rigidity labels rather than full detector response convolution, vertical-trajectory modeling of an omnidirectional channel, sparse or uneven MLT coverage, detector aging, and two-hour observational aggregation during rapidly evolving storm phases. These limitations are why P8/P9 are diagnostic and why the pass-level crossing table, transition-width diagnostics, source-file checksums, and FULL_SCAN/DIRECT_ACCESS raw-state consistency products must be retained. The current test is useful for code validation because the primary observational gate is restricted to the better-conditioned P6/P7 products while the independent numerical-consistency gate still checks exact trajectory classifications before observational postprocessing.</w:t>
+        <w:t>P8/P9 quality decisions are observational and independent of AMPS. For each pass leg containing both channels, the builder computes delta=|latitude_P8|-|latitude_P9| and flags an anomalously large positive separation using the larger of a median-plus-four-robust-sigma limit and a conservative 6 deg fallback when too few pairs exist. A flagged P9 crossing remains in the pass-level product but aggregate_eligible is false. The builder also records the number of samples supporting the central T20-T80 transition and a robust plateau-minus-background contrast/noise ratio. Remaining physical limitations include nominal-threshold rigidity labels rather than detector response convolution, vertical-trajectory modeling of an omnidirectional channel, detector aging, and rapidly evolving storm structure. The P6/P7 observational gate and FULL_SCAN/DIRECT_ACCESS exact-state gate preserve C10 as a useful code-validation test while P8/P9 remain transparent diagnostics.</w:t>
       </w:r>
     </w:p>
     <w:p>
@@ -5735,13 +5735,13 @@
     <w:p>
       <w:pPr/>
       <w:r>
-        <w:t>Offline regression coverage: 20 tests exercise ASCII parsing, headerless input, zero-byte handling, deterministic gzip I/O, background-normalized T50 extraction, T25-T75 diagnostics, driver SYM-H interpolation, primary/diagnostic metric separation, FULL_SCAN/DIRECT_ACCESS command and raw-state consistency, all plot products, and an archive-independent end-to-end --self-test.</w:t>
+        <w:t>Offline regression coverage: 24 tests exercise ASCII parsing, headerless input, zero-byte handling, deterministic gzip I/O, background-normalized T50 extraction, T25-T75 diagnostics, transition-support and contrast metadata, P8/P9 same-pass outlier retention, robust multi-pass/multi-satellite diagnostic eligibility, exact paired-cell averaging, sparse diagnostic flag output, driver SYM-H interpolation, primary/diagnostic metric separation, FULL_SCAN/DIRECT_ACCESS command and raw-state consistency, all plot products, and an archive-independent end-to-end --self-test.</w:t>
       </w:r>
     </w:p>
     <w:p>
       <w:pPr/>
       <w:r>
-        <w:t>Figure C10 - Target behavior: background-normalized POES/MetOp and AMPS ACCESS_T50 cutoff latitude versus UTC. P6/P7 are the primary code-validation curves; P8/P9 are visibly labeled diagnostic. The residual panel uses AMPS minus POES. FULL_SCAN versus DIRECT_ACCESS tests numerical-method consistency through matching exact-state classifications, while FULL_SCAN Rc contours and GRIDLESS/GRIDDED differences remain sensitivity diagnostics.</w:t>
+        <w:t>Figure C10 - Target behavior: paired background-normalized POES/MetOp and AMPS ACCESS_T50 cutoff latitude versus UTC. P6/P7 are the primary code-validation curves. Robust P8/P9 means are connected only where at least two quality-eligible paired cells exist; sparse or cross-channel-outlier values are open markers with n annotations. The residual panel uses AMPS minus POES for the same paired rows. FULL_SCAN versus DIRECT_ACCESS tests numerical-method consistency through matching exact-state classifications, while FULL_SCAN Rc contours and GRIDLESS/GRIDDED differences remain sensitivity diagnostics.</w:t>
       </w:r>
     </w:p>
     <w:p>

</xml_diff>

<commit_message>
implemented -- srcEarth test C18
</commit_message>
<xml_diff>
--- a/srcEarth/test/validation.docx
+++ b/srcEarth/test/validation.docx
@@ -20,10 +20,7 @@
         <w:jc w:val="center"/>
       </w:pPr>
       <w:r>
-        <w:rPr>
-          <w:sz w:val="26"/>
-        </w:rPr>
-        <w:t>Expanded v6 — Per-Test Inputs, Expected Values, and Reference Plots</w:t>
+        <w:t>Expanded v7 - Per-Test Inputs, Expected Values, and Reference Plots</w:t>
       </w:r>
     </w:p>
     <w:p>
@@ -31,32 +28,17 @@
         <w:jc w:val="center"/>
       </w:pPr>
       <w:r>
-        <w:rPr>
-          <w:i/>
-        </w:rPr>
-        <w:t>June 2026</w:t>
-      </w:r>
-    </w:p>
-    <w:p>
-      <w:r>
-        <w:rPr>
-          <w:b/>
-        </w:rPr>
-        <w:t xml:space="preserve">Scope. </w:t>
-      </w:r>
-      <w:r>
-        <w:t>This version updates the validation campaign to the current code capabilities: Mode3D and gridless dynamic MPI scheduling, shared cutoff UPPER_SCAN behavior, and density/flux transmission scanning. Each test below includes the required input parameters, calculation locations, expected values or acceptance targets, and a reference plot. The plots are either analytical/reference curves generated from the stated equations or redrawn target plots based on the cited literature; they are not direct reproductions of copyrighted paper figures.</w:t>
-      </w:r>
-    </w:p>
-    <w:p>
-      <w:r>
-        <w:rPr>
-          <w:b/>
-        </w:rPr>
-        <w:t xml:space="preserve">Changes in this revision. </w:t>
-      </w:r>
-      <w:r>
-        <w:t>Six tests were added based on a direct reading of the current source tree (CutoffRigidityGridless.cpp, DensityGridless.cpp, Mode3DParallel.h, AnisotropicSpectrum.h, GridlessParticleMovers.h) and READ.md: C11 isolates the specific Rmin-collapse defect that motivated UPPER_SCAN (CutoffForDirectionEndpointBinary_GV returning CUTOFF_EMIN whenever a low-rigidity allowed pocket exists), C12 cross-validates all seven movers against the analytical Stormer cutoff, C13 is the gridless-mode companion to C-PARALLEL since no existing test previously set GRIDLESS_MPI_SCHEDULER, F11 exercises the full BA_PAD_MODEL matrix and its n→0 sum-check, F12 covers BA_SPATIAL_MODEL=DAYSIDE_NIGHTSIDE which no prior test touched, and F13 is the OpenMP×MPI-scheduler reproducibility cross-product specific to gridless density/flux. F5’s parameter block has also been corrected: it referenced BOUNDARY_DISTRIBUTION, PAD_LINEAR, and PAD_AXIS, none of which the parser recognizes; it now uses the actual BA_PAD_MODEL/BA_PAD_EXPONENT keywords, and its expected-value table has been updated to match the symmetric |cosα|^n functional form actually implemented.</w:t>
+        <w:t>August 2026</w:t>
+      </w:r>
+    </w:p>
+    <w:p>
+      <w:r>
+        <w:t>Scope. This version updates the validation campaign to the current code capabilities: Mode3D and gridless dynamic MPI scheduling, shared cutoff UPPER_SCAN behavior, and density/flux transmission scanning, and deterministic POSIX-thread initialization of standalone Mode3D background fields. Each test below includes the required input parameters, calculation locations, expected values or acceptance targets, and a reference plot. The plots are either analytical/reference curves generated from the stated equations or redrawn target plots based on the cited literature; they are not direct reproductions of copyrighted paper figures.</w:t>
+      </w:r>
+    </w:p>
+    <w:p>
+      <w:r>
+        <w:t>Changes in this revision. Six tests were added based on a direct reading of the current source tree (CutoffRigidityGridless.cpp, DensityGridless.cpp, Mode3DParallel.h, AnisotropicSpectrum.h, GridlessParticleMovers.h) and READ.md: C11 isolates the specific Rmin-collapse defect that motivated UPPER_SCAN (CutoffForDirectionEndpointBinary_GV returning CUTOFF_EMIN whenever a low-rigidity allowed pocket exists), C12 cross-validates all seven movers against the analytical Stormer cutoff, C13 is the gridless-mode companion to C-PARALLEL since no existing test previously set GRIDLESS_MPI_SCHEDULER, F11 exercises the full BA_PAD_MODEL matrix and its n→0 sum-check, F12 covers BA_SPATIAL_MODEL=DAYSIDE_NIGHTSIDE which no prior test touched, and F13 is the OpenMP×MPI-scheduler reproducibility cross-product specific to gridless density/flux. F5’s parameter block has also been corrected: it referenced BOUNDARY_DISTRIBUTION, PAD_LINEAR, and PAD_AXIS, none of which the parser recognizes; it now uses the actual BA_PAD_MODEL/BA_PAD_EXPONENT keywords, and its expected-value table has been updated to match the symmetric |cosα|^n functional form actually implemented. C18 adds an implemented deterministic parallel-equivalence regression for standalone Mode3D background-field initialization. For DIPOLE, IGRF, T96, and T05, it generates a serial runtime baseline and requires exact agreement of initialized-field and cutoff-map fingerprints for 1, 2, 4, 8, and 16 temporary POSIX workers.</w:t>
       </w:r>
     </w:p>
     <w:p>
@@ -191,9 +173,8 @@
             <w:r>
               <w:rPr>
                 <w:b w:val="0"/>
-                <w:sz w:val="16"/>
-              </w:rPr>
-              <w:t>Thread backend: SERIAL, OPENMP, THREADS</w:t>
+              </w:rPr>
+              <w:t>Thread backend: SERIAL, OPENMP, THREADS; optional POSIX background-field initialization</w:t>
             </w:r>
           </w:p>
         </w:tc>
@@ -207,9 +188,8 @@
             <w:r>
               <w:rPr>
                 <w:b w:val="0"/>
-                <w:sz w:val="16"/>
-              </w:rPr>
-              <w:t>C-PARALLEL and F7</w:t>
+              </w:rPr>
+              <w:t>C-PARALLEL, C18, and F7</w:t>
             </w:r>
           </w:p>
         </w:tc>
@@ -370,7 +350,7 @@
         <w:pStyle w:val="Heading1"/>
       </w:pPr>
       <w:r>
-        <w:t>3. Cutoff-rigidity validation tests C1–C10</w:t>
+        <w:t>3. Cutoff-rigidity validation tests C1-C18</w:t>
       </w:r>
     </w:p>
     <w:p>
@@ -12806,6 +12786,585 @@
           <w:i/>
         </w:rPr>
         <w:t>Figure C17 — Target dipole charge/time-reversal symmetry. The transmission difference should remain near numerical roundoff.</w:t>
+      </w:r>
+    </w:p>
+    <w:p>
+      <w:pPr>
+        <w:pStyle w:val="Heading2"/>
+      </w:pPr>
+      <w:r>
+        <w:t>C18. POSIX-thread deterministic background-field initialization</w:t>
+      </w:r>
+    </w:p>
+    <w:p>
+      <w:r>
+        <w:t>Validates that temporary POSIX workers used to initialize the standalone Mode3D cell-centered background-field mesh do not change either the stored background-field values or the resulting exact-rigidity cutoff-access map. The default cutoff backend is SERIAL, so a difference is attributable to field initialization, mesh materialization, field assembly, or stale magnetic-model state rather than to the cutoff worker queue.</w:t>
+      </w:r>
+    </w:p>
+    <w:p>
+      <w:r>
+        <w:rPr>
+          <w:b/>
+        </w:rPr>
+        <w:t>Implementation status:</w:t>
+      </w:r>
+      <w:r>
+        <w:t xml:space="preserve"> Implemented. The executable runner is srcEarth/test/C18/run_C18.py and the input template is srcEarth/test/C18/AMPS_PARAM_C18.in. The supported standalone field models are DIPOLE, IGRF, T96, and T05.</w:t>
+      </w:r>
+    </w:p>
+    <w:p>
+      <w:r>
+        <w:rPr>
+          <w:b/>
+        </w:rPr>
+        <w:t>Reference strategy:</w:t>
+      </w:r>
+      <w:r>
+        <w:t xml:space="preserve"> No checked-in numerical reference solution is required. For each magnetic model, the runner first creates a serial field-initialization and serial-cutoff baseline with the same executable, MPI rank count, mesh, epoch, and physical input. Every POSIX-thread case is compared directly with that runtime baseline. C6, C7, C9, and C10 remain the physical validation tests for IGRF and Tsyganenko fields.</w:t>
+      </w:r>
+    </w:p>
+    <w:p>
+      <w:r>
+        <w:rPr>
+          <w:b/>
+        </w:rPr>
+        <w:t>Essential input parameters:</w:t>
+      </w:r>
+    </w:p>
+    <w:p>
+      <w:pPr>
+        <w:spacing w:after="80"/>
+      </w:pPr>
+      <w:r>
+        <w:rPr>
+          <w:rFonts w:ascii="Courier New" w:hAnsi="Courier New" w:eastAsia="Courier New"/>
+          <w:sz w:val="16"/>
+        </w:rPr>
+        <w:t>#CALCULATION_MODE</w:t>
+        <w:br/>
+        <w:t>CALC_TARGET                 CUTOFF_RIGIDITY</w:t>
+        <w:br/>
+        <w:t>FIELD_EVAL_METHOD           GRID_3D</w:t>
+        <w:br/>
+        <w:br/>
+        <w:t>#CUTOFF_RIGIDITY</w:t>
+        <w:br/>
+        <w:t>CUTOFF_SAMPLING             VERTICAL</w:t>
+        <w:br/>
+        <w:t>CUTOFF_SEARCH_ALGORITHM     RIGIDITY_LIST</w:t>
+        <w:br/>
+        <w:t>CUTOFF_RIGIDITY_LIST_GV     0.20,0.50,1.00,2.00</w:t>
+        <w:br/>
+        <w:t>CUTOFF_ACCESS_ABS_LAT_MIN   50.0</w:t>
+        <w:br/>
+        <w:t>CUTOFF_ACCESS_ABS_LAT_MAX   80.0</w:t>
+        <w:br/>
+        <w:t>CUTOFF_TRACE_POLICY         ACCURATE</w:t>
+        <w:br/>
+        <w:t>CUTOFF_BACKTRACE_CHARGE     REVERSED</w:t>
+        <w:br/>
+        <w:br/>
+        <w:t>#BACKGROUND_FIELD</w:t>
+        <w:br/>
+        <w:t>FIELD_MODEL                 DIPOLE | IGRF | T96 | T05</w:t>
+        <w:br/>
+        <w:t>EPOCH                       2006-12-15T03:05:00</w:t>
+        <w:br/>
+        <w:t>DST                         -177.0</w:t>
+        <w:br/>
+        <w:t>PDYN                        2.89</w:t>
+        <w:br/>
+        <w:t>IMF_BX/BY/BZ                5.31 / 11.76 / -10.50</w:t>
+        <w:br/>
+        <w:t>T05_W1 ... T05_W6          fixed disturbed-state values</w:t>
+        <w:br/>
+        <w:br/>
+        <w:t>#MODE3D_MESH / OUTPUT</w:t>
+        <w:br/>
+        <w:t>MODE3D_MESH_RES_EARTH_RE    0.50</w:t>
+        <w:br/>
+        <w:t>MODE3D_MESH_RES_BOUNDARY_RE 1.50</w:t>
+        <w:br/>
+        <w:t>MODE3D_MESH_COARSENING      LINEAR</w:t>
+        <w:br/>
+        <w:t>OUTPUT_MODE                 SHELLS</w:t>
+        <w:br/>
+        <w:t>SHELL_ALTS_KM               850.0</w:t>
+        <w:br/>
+        <w:t>SHELL_LON_RES_DEG           90.0</w:t>
+        <w:br/>
+        <w:t>SHELL_LAT_RES_DEG           10.0</w:t>
+        <w:br/>
+      </w:r>
+    </w:p>
+    <w:p>
+      <w:r>
+        <w:rPr>
+          <w:b/>
+        </w:rPr>
+        <w:t>Execution:</w:t>
+      </w:r>
+    </w:p>
+    <w:p>
+      <w:pPr>
+        <w:spacing w:after="80"/>
+      </w:pPr>
+      <w:r>
+        <w:rPr>
+          <w:rFonts w:ascii="Courier New" w:hAnsi="Courier New" w:eastAsia="Courier New"/>
+          <w:sz w:val="16"/>
+        </w:rPr>
+        <w:t># Routine regression from the AMPS repository root</w:t>
+        <w:br/>
+        <w:t>python3 srcEarth/test/C18/run_C18.py --profile ROUTINE \</w:t>
+        <w:br/>
+        <w:t xml:space="preserve">  --amps ./amps -np 4</w:t>
+        <w:br/>
+        <w:br/>
+        <w:t># Short initial check</w:t>
+        <w:br/>
+        <w:t>python3 srcEarth/test/C18/run_C18.py --profile SMOKE \</w:t>
+        <w:br/>
+        <w:t xml:space="preserve">  --amps ./amps -np 2</w:t>
+        <w:br/>
+        <w:br/>
+        <w:t># The runner launches AMPS with mpirun by default. Example parallel case:</w:t>
+        <w:br/>
+        <w:t>mpirun -np 4 ./amps -mode 3d -i AMPS_PARAM_C18.in \</w:t>
+        <w:br/>
+        <w:t xml:space="preserve">  -mode3d-field-eval MESH -mode3d-parallel SERIAL \</w:t>
+        <w:br/>
+        <w:t xml:space="preserve">  -mode3d-threads N -mode3d-mpi-scheduler STATIC \</w:t>
+        <w:br/>
+        <w:t xml:space="preserve">  -mode3d-output-initialized -mode3d-parallel-field-init</w:t>
+        <w:br/>
+      </w:r>
+    </w:p>
+    <w:p>
+      <w:r>
+        <w:t>The -mode3d-threads value is the number of temporary POSIX workers used by field initialization. The calling MPI-rank thread also performs one equal share; therefore, N workers correspond to N+1 field-initialization participants per MPI rank.</w:t>
+      </w:r>
+    </w:p>
+    <w:p>
+      <w:r>
+        <w:rPr>
+          <w:b/>
+        </w:rPr>
+        <w:t>Routine calculation matrix:</w:t>
+      </w:r>
+    </w:p>
+    <w:p>
+      <w:r>
+        <w:t>DIPOLE, IGRF, T96, and T05; temporary-worker counts 1, 2, 4, 8, and 16; two independent repeats of each parallel case; four MPI ranks by default. The exact-rigidity access product is evaluated at 0.20, 0.50, 1.00, and 2.00 GV on an 850-km geodetic shell. The default serial cutoff backend isolates the field-initialization stage. --cutoff-backend THREADS is available as an optional end-to-end stress mode.</w:t>
+      </w:r>
+    </w:p>
+    <w:p>
+      <w:r>
+        <w:rPr>
+          <w:b/>
+        </w:rPr>
+        <w:t>Comparison method:</w:t>
+      </w:r>
+    </w:p>
+    <w:p>
+      <w:r>
+        <w:t>The runner parses all numeric records in amps_3d_initialized*.data.dat* and cutoff_3d_shells_access*.dat*. Every finite decimal value is converted to a canonical binary64 hexadecimal representation before a SHA-256 fingerprint is calculated. Numerically identical records with different text formatting therefore match, while any represented numerical difference changes the fingerprint. The AMPS log banner is also checked to confirm the requested worker count and the additional caller participant.</w:t>
+      </w:r>
+    </w:p>
+    <w:p>
+      <w:r>
+        <w:rPr>
+          <w:b/>
+        </w:rPr>
+        <w:t>Expected output values / acceptance targets:</w:t>
+      </w:r>
+    </w:p>
+    <w:tbl>
+      <w:tblPr>
+        <w:tblStyle w:val="TableGrid"/>
+        <w:tblW w:type="dxa" w:w="9144"/>
+        <w:jc w:val="center"/>
+        <w:tblLayout w:type="fixed"/>
+        <w:tblLook w:firstColumn="1" w:firstRow="1" w:lastColumn="0" w:lastRow="0" w:noHBand="0" w:noVBand="1" w:val="04A0"/>
+      </w:tblPr>
+      <w:tblGrid>
+        <w:gridCol w:w="7272"/>
+        <w:gridCol w:w="7272"/>
+      </w:tblGrid>
+      <w:tr>
+        <w:trPr>
+          <w:tblHeader w:val="true"/>
+        </w:trPr>
+        <w:tc>
+          <w:tcPr>
+            <w:tcW w:type="dxa" w:w="3384"/>
+            <w:vAlign w:val="center"/>
+            <w:shd w:fill="BDD7EE"/>
+          </w:tcPr>
+          <w:p>
+            <w:r>
+              <w:rPr>
+                <w:sz w:val="18"/>
+              </w:rPr>
+            </w:r>
+            <w:r>
+              <w:rPr>
+                <w:b/>
+                <w:sz w:val="18"/>
+              </w:rPr>
+              <w:t>Quantity / diagnostic</w:t>
+            </w:r>
+          </w:p>
+        </w:tc>
+        <w:tc>
+          <w:tcPr>
+            <w:tcW w:type="dxa" w:w="5760"/>
+            <w:vAlign w:val="center"/>
+            <w:shd w:fill="BDD7EE"/>
+          </w:tcPr>
+          <w:p>
+            <w:r>
+              <w:rPr>
+                <w:sz w:val="18"/>
+              </w:rPr>
+            </w:r>
+            <w:r>
+              <w:rPr>
+                <w:b/>
+                <w:sz w:val="18"/>
+              </w:rPr>
+              <w:t>Expected output or acceptance target</w:t>
+            </w:r>
+          </w:p>
+        </w:tc>
+      </w:tr>
+      <w:tr>
+        <w:tc>
+          <w:tcPr>
+            <w:tcW w:type="dxa" w:w="3384"/>
+            <w:vAlign w:val="top"/>
+          </w:tcPr>
+          <w:p>
+            <w:r>
+              <w:rPr>
+                <w:sz w:val="18"/>
+              </w:rPr>
+            </w:r>
+            <w:r>
+              <w:rPr>
+                <w:b w:val="0"/>
+                <w:sz w:val="18"/>
+              </w:rPr>
+              <w:t>AMPS execution and worker banner</w:t>
+            </w:r>
+          </w:p>
+        </w:tc>
+        <w:tc>
+          <w:tcPr>
+            <w:tcW w:type="dxa" w:w="5760"/>
+            <w:vAlign w:val="top"/>
+          </w:tcPr>
+          <w:p>
+            <w:r>
+              <w:rPr>
+                <w:sz w:val="18"/>
+              </w:rPr>
+            </w:r>
+            <w:r>
+              <w:rPr>
+                <w:b w:val="0"/>
+                <w:sz w:val="18"/>
+              </w:rPr>
+              <w:t>Every run exits with code 0. Each parallel log reports exactly N temporary workers plus the caller, for N+1 equal shares per MPI rank.</w:t>
+            </w:r>
+          </w:p>
+        </w:tc>
+      </w:tr>
+      <w:tr>
+        <w:tc>
+          <w:tcPr>
+            <w:tcW w:type="dxa" w:w="3384"/>
+            <w:vAlign w:val="top"/>
+          </w:tcPr>
+          <w:p>
+            <w:r>
+              <w:rPr>
+                <w:sz w:val="18"/>
+              </w:rPr>
+            </w:r>
+            <w:r>
+              <w:rPr>
+                <w:b w:val="0"/>
+                <w:sz w:val="18"/>
+              </w:rPr>
+              <w:t>Initialized-field fingerprint</w:t>
+            </w:r>
+          </w:p>
+        </w:tc>
+        <w:tc>
+          <w:tcPr>
+            <w:tcW w:type="dxa" w:w="5760"/>
+            <w:vAlign w:val="top"/>
+          </w:tcPr>
+          <w:p>
+            <w:r>
+              <w:rPr>
+                <w:sz w:val="18"/>
+              </w:rPr>
+            </w:r>
+            <w:r>
+              <w:rPr>
+                <w:b w:val="0"/>
+                <w:sz w:val="18"/>
+              </w:rPr>
+              <w:t>Exact equality with the serial runtime baseline for every selected model, worker count, and repeat.</w:t>
+            </w:r>
+          </w:p>
+        </w:tc>
+      </w:tr>
+      <w:tr>
+        <w:tc>
+          <w:tcPr>
+            <w:tcW w:type="dxa" w:w="3384"/>
+            <w:vAlign w:val="top"/>
+          </w:tcPr>
+          <w:p>
+            <w:r>
+              <w:rPr>
+                <w:sz w:val="18"/>
+              </w:rPr>
+            </w:r>
+            <w:r>
+              <w:rPr>
+                <w:b w:val="0"/>
+                <w:sz w:val="18"/>
+              </w:rPr>
+              <w:t>Exact-rigidity cutoff-map fingerprint</w:t>
+            </w:r>
+          </w:p>
+        </w:tc>
+        <w:tc>
+          <w:tcPr>
+            <w:tcW w:type="dxa" w:w="5760"/>
+            <w:vAlign w:val="top"/>
+          </w:tcPr>
+          <w:p>
+            <w:r>
+              <w:rPr>
+                <w:sz w:val="18"/>
+              </w:rPr>
+            </w:r>
+            <w:r>
+              <w:rPr>
+                <w:b w:val="0"/>
+                <w:sz w:val="18"/>
+              </w:rPr>
+              <w:t>Exact equality with the serial runtime baseline; no access-state, coordinate, or represented floating-point difference is allowed.</w:t>
+            </w:r>
+          </w:p>
+        </w:tc>
+      </w:tr>
+      <w:tr>
+        <w:tc>
+          <w:tcPr>
+            <w:tcW w:type="dxa" w:w="3384"/>
+            <w:vAlign w:val="top"/>
+          </w:tcPr>
+          <w:p>
+            <w:r>
+              <w:rPr>
+                <w:sz w:val="18"/>
+              </w:rPr>
+            </w:r>
+            <w:r>
+              <w:rPr>
+                <w:b w:val="0"/>
+                <w:sz w:val="18"/>
+              </w:rPr>
+              <w:t>Repeatability</w:t>
+            </w:r>
+          </w:p>
+        </w:tc>
+        <w:tc>
+          <w:tcPr>
+            <w:tcW w:type="dxa" w:w="5760"/>
+            <w:vAlign w:val="top"/>
+          </w:tcPr>
+          <w:p>
+            <w:r>
+              <w:rPr>
+                <w:sz w:val="18"/>
+              </w:rPr>
+            </w:r>
+            <w:r>
+              <w:rPr>
+                <w:b w:val="0"/>
+                <w:sz w:val="18"/>
+              </w:rPr>
+              <w:t>Independent repeats at the same model and worker count produce identical field and cutoff fingerprints.</w:t>
+            </w:r>
+          </w:p>
+        </w:tc>
+      </w:tr>
+      <w:tr>
+        <w:tc>
+          <w:tcPr>
+            <w:tcW w:type="dxa" w:w="3384"/>
+            <w:vAlign w:val="top"/>
+          </w:tcPr>
+          <w:p>
+            <w:r>
+              <w:rPr>
+                <w:sz w:val="18"/>
+              </w:rPr>
+            </w:r>
+            <w:r>
+              <w:rPr>
+                <w:b w:val="0"/>
+                <w:sz w:val="18"/>
+              </w:rPr>
+              <w:t>Reference requirement</w:t>
+            </w:r>
+          </w:p>
+        </w:tc>
+        <w:tc>
+          <w:tcPr>
+            <w:tcW w:type="dxa" w:w="5760"/>
+            <w:vAlign w:val="top"/>
+          </w:tcPr>
+          <w:p>
+            <w:r>
+              <w:rPr>
+                <w:sz w:val="18"/>
+              </w:rPr>
+            </w:r>
+            <w:r>
+              <w:rPr>
+                <w:b w:val="0"/>
+                <w:sz w:val="18"/>
+              </w:rPr>
+              <w:t>No stored reference solution. The serial result generated during the same runner invocation is the comparison baseline.</w:t>
+            </w:r>
+          </w:p>
+        </w:tc>
+      </w:tr>
+      <w:tr>
+        <w:tc>
+          <w:tcPr>
+            <w:tcW w:type="dxa" w:w="3384"/>
+            <w:vAlign w:val="top"/>
+          </w:tcPr>
+          <w:p>
+            <w:r>
+              <w:rPr>
+                <w:sz w:val="18"/>
+              </w:rPr>
+            </w:r>
+            <w:r>
+              <w:rPr>
+                <w:b w:val="0"/>
+                <w:sz w:val="18"/>
+              </w:rPr>
+              <w:t>Failure interpretation</w:t>
+            </w:r>
+          </w:p>
+        </w:tc>
+        <w:tc>
+          <w:tcPr>
+            <w:tcW w:type="dxa" w:w="5760"/>
+            <w:vAlign w:val="top"/>
+          </w:tcPr>
+          <w:p>
+            <w:r>
+              <w:rPr>
+                <w:sz w:val="18"/>
+              </w:rPr>
+            </w:r>
+            <w:r>
+              <w:rPr>
+                <w:b w:val="0"/>
+                <w:sz w:val="18"/>
+              </w:rPr>
+              <w:t>A DIPOLE mismatch indicates a general partition/write or mesh-assembly defect; a model-specific mismatch indicates remaining shared or stale Geopack/Tsyganenko state.</w:t>
+            </w:r>
+          </w:p>
+        </w:tc>
+      </w:tr>
+    </w:tbl>
+    <w:p>
+      <w:r>
+        <w:rPr>
+          <w:b/>
+        </w:rPr>
+        <w:t>Archived products:</w:t>
+      </w:r>
+    </w:p>
+    <w:p>
+      <w:r>
+        <w:t>C18_configuration.json, C18_commands.json, C18_comparison.csv, C18_result.json, C18_summary.txt, per-run AMPS_PARAM_C18.in, C18_command.json, C18_amps.log, initialized-field dumps, and exact-rigidity access maps.</w:t>
+      </w:r>
+    </w:p>
+    <w:p>
+      <w:r>
+        <w:rPr>
+          <w:b/>
+        </w:rPr>
+        <w:t>Reference solution / comparison target:</w:t>
+      </w:r>
+    </w:p>
+    <w:p>
+      <w:r>
+        <w:t>Internal serial-versus-parallel equivalence. C18 is an all-or-nothing determinism test: a nonzero mismatch fraction is not accepted. Physical model accuracy is established independently by C6, C7, C9, and C10.</w:t>
+      </w:r>
+    </w:p>
+    <w:p>
+      <w:pPr>
+        <w:jc w:val="center"/>
+      </w:pPr>
+      <w:r>
+        <w:drawing>
+          <wp:inline xmlns:a="http://schemas.openxmlformats.org/drawingml/2006/main" xmlns:pic="http://schemas.openxmlformats.org/drawingml/2006/picture">
+            <wp:extent cx="5760720" cy="3065462"/>
+            <wp:docPr id="37" name="Picture 37"/>
+            <wp:cNvGraphicFramePr>
+              <a:graphicFrameLocks noChangeAspect="1"/>
+            </wp:cNvGraphicFramePr>
+            <a:graphic>
+              <a:graphicData uri="http://schemas.openxmlformats.org/drawingml/2006/picture">
+                <pic:pic>
+                  <pic:nvPicPr>
+                    <pic:cNvPr id="0" name="C18_parallel_determinism_target.png"/>
+                    <pic:cNvPicPr/>
+                  </pic:nvPicPr>
+                  <pic:blipFill>
+                    <a:blip r:embed="rId45"/>
+                    <a:stretch>
+                      <a:fillRect/>
+                    </a:stretch>
+                  </pic:blipFill>
+                  <pic:spPr>
+                    <a:xfrm>
+                      <a:off x="0" y="0"/>
+                      <a:ext cx="5760720" cy="3065462"/>
+                    </a:xfrm>
+                    <a:prstGeom prst="rect"/>
+                  </pic:spPr>
+                </pic:pic>
+              </a:graphicData>
+            </a:graphic>
+          </wp:inline>
+        </w:drawing>
+      </w:r>
+    </w:p>
+    <w:p>
+      <w:pPr>
+        <w:jc w:val="center"/>
+      </w:pPr>
+      <w:r>
+        <w:rPr>
+          <w:i/>
+        </w:rPr>
+        <w:t>Figure C18 - Target deterministic parallel behavior. Initialized-field and cutoff-map mismatch counts must remain exactly zero for every requested POSIX-worker count.</w:t>
       </w:r>
     </w:p>
     <w:p>

</xml_diff>